<commit_message>
Doc: Adicionei os custos, requisitos da insfraestrutura, regra de negócio, história do usuário ao escopo e atualizei o cronograma
</commit_message>
<xml_diff>
--- a/Declação do Escopo.docx
+++ b/Declação do Escopo.docx
@@ -9,8 +9,6 @@
           <w:u w:val="single"/>
         </w:rPr>
       </w:pPr>
-      <w:bookmarkStart w:id="0" w:name="_GoBack"/>
-      <w:bookmarkEnd w:id="0"/>
     </w:p>
     <w:tbl>
       <w:tblPr>
@@ -52,7 +50,7 @@
               <w:spacing w:after="0" w:line="240" w:lineRule="auto"/>
               <w:jc w:val="center"/>
               <w:rPr>
-                <w:rFonts w:ascii="Times New Roman" w:eastAsia="Times New Roman" w:hAnsi="Times New Roman" w:cs="Times New Roman"/>
+                <w:rFonts w:ascii="Arial" w:eastAsia="Times New Roman" w:hAnsi="Arial" w:cs="Arial"/>
                 <w:b/>
                 <w:bCs/>
                 <w:color w:val="000000"/>
@@ -63,7 +61,7 @@
             </w:pPr>
             <w:r>
               <w:rPr>
-                <w:rFonts w:ascii="Times New Roman" w:eastAsia="Times New Roman" w:hAnsi="Times New Roman" w:cs="Times New Roman"/>
+                <w:rFonts w:ascii="Arial" w:eastAsia="Times New Roman" w:hAnsi="Arial" w:cs="Arial"/>
                 <w:b/>
                 <w:bCs/>
                 <w:color w:val="000000"/>
@@ -99,7 +97,7 @@
               <w:spacing w:after="0" w:line="240" w:lineRule="auto"/>
               <w:jc w:val="center"/>
               <w:rPr>
-                <w:rFonts w:ascii="Times New Roman" w:eastAsia="Times New Roman" w:hAnsi="Times New Roman" w:cs="Times New Roman"/>
+                <w:rFonts w:ascii="Arial" w:eastAsia="Times New Roman" w:hAnsi="Arial" w:cs="Arial"/>
                 <w:b/>
                 <w:bCs/>
                 <w:color w:val="000000"/>
@@ -110,7 +108,7 @@
             </w:pPr>
             <w:r>
               <w:rPr>
-                <w:rFonts w:ascii="Times New Roman" w:eastAsia="Times New Roman" w:hAnsi="Times New Roman" w:cs="Times New Roman"/>
+                <w:rFonts w:ascii="Arial" w:eastAsia="Times New Roman" w:hAnsi="Arial" w:cs="Arial"/>
                 <w:b/>
                 <w:bCs/>
                 <w:color w:val="000000"/>
@@ -141,7 +139,7 @@
               <w:spacing w:after="0" w:line="240" w:lineRule="auto"/>
               <w:jc w:val="center"/>
               <w:rPr>
-                <w:rFonts w:ascii="Times New Roman" w:eastAsia="Times New Roman" w:hAnsi="Times New Roman" w:cs="Times New Roman"/>
+                <w:rFonts w:ascii="Arial" w:eastAsia="Times New Roman" w:hAnsi="Arial" w:cs="Arial"/>
                 <w:b/>
                 <w:bCs/>
                 <w:color w:val="000000"/>
@@ -152,7 +150,7 @@
             </w:pPr>
             <w:r>
               <w:rPr>
-                <w:rFonts w:ascii="Times New Roman" w:eastAsia="Times New Roman" w:hAnsi="Times New Roman" w:cs="Times New Roman"/>
+                <w:rFonts w:ascii="Arial" w:eastAsia="Times New Roman" w:hAnsi="Arial" w:cs="Arial"/>
                 <w:b/>
                 <w:bCs/>
                 <w:color w:val="000000"/>
@@ -183,7 +181,7 @@
               <w:spacing w:after="0" w:line="240" w:lineRule="auto"/>
               <w:jc w:val="center"/>
               <w:rPr>
-                <w:rFonts w:ascii="Times New Roman" w:eastAsia="Times New Roman" w:hAnsi="Times New Roman" w:cs="Times New Roman"/>
+                <w:rFonts w:ascii="Arial" w:eastAsia="Times New Roman" w:hAnsi="Arial" w:cs="Arial"/>
                 <w:b/>
                 <w:bCs/>
                 <w:color w:val="000000"/>
@@ -194,7 +192,7 @@
             </w:pPr>
             <w:r>
               <w:rPr>
-                <w:rFonts w:ascii="Times New Roman" w:eastAsia="Times New Roman" w:hAnsi="Times New Roman" w:cs="Times New Roman"/>
+                <w:rFonts w:ascii="Arial" w:eastAsia="Times New Roman" w:hAnsi="Arial" w:cs="Arial"/>
                 <w:b/>
                 <w:bCs/>
                 <w:color w:val="000000"/>
@@ -225,7 +223,7 @@
               <w:spacing w:after="0" w:line="240" w:lineRule="auto"/>
               <w:jc w:val="center"/>
               <w:rPr>
-                <w:rFonts w:ascii="Times New Roman" w:eastAsia="Times New Roman" w:hAnsi="Times New Roman" w:cs="Times New Roman"/>
+                <w:rFonts w:ascii="Arial" w:eastAsia="Times New Roman" w:hAnsi="Arial" w:cs="Arial"/>
                 <w:b/>
                 <w:bCs/>
                 <w:color w:val="000000"/>
@@ -236,7 +234,7 @@
             </w:pPr>
             <w:r>
               <w:rPr>
-                <w:rFonts w:ascii="Times New Roman" w:eastAsia="Times New Roman" w:hAnsi="Times New Roman" w:cs="Times New Roman"/>
+                <w:rFonts w:ascii="Arial" w:eastAsia="Times New Roman" w:hAnsi="Arial" w:cs="Arial"/>
                 <w:b/>
                 <w:bCs/>
                 <w:color w:val="000000"/>
@@ -273,7 +271,7 @@
               <w:spacing w:after="0" w:line="240" w:lineRule="auto"/>
               <w:jc w:val="center"/>
               <w:rPr>
-                <w:rFonts w:ascii="Times New Roman" w:eastAsia="Times New Roman" w:hAnsi="Times New Roman" w:cs="Times New Roman"/>
+                <w:rFonts w:ascii="Arial" w:eastAsia="Times New Roman" w:hAnsi="Arial" w:cs="Arial"/>
                 <w:color w:val="000000"/>
                 <w:sz w:val="24"/>
                 <w:szCs w:val="24"/>
@@ -282,7 +280,7 @@
             </w:pPr>
             <w:r>
               <w:rPr>
-                <w:rFonts w:ascii="Times New Roman" w:eastAsia="Times New Roman" w:hAnsi="Times New Roman" w:cs="Times New Roman"/>
+                <w:rFonts w:ascii="Arial" w:eastAsia="Times New Roman" w:hAnsi="Arial" w:cs="Arial"/>
                 <w:color w:val="000000"/>
                 <w:sz w:val="24"/>
                 <w:szCs w:val="24"/>
@@ -312,7 +310,7 @@
               <w:spacing w:after="0" w:line="240" w:lineRule="auto"/>
               <w:jc w:val="center"/>
               <w:rPr>
-                <w:rFonts w:ascii="Times New Roman" w:eastAsia="Times New Roman" w:hAnsi="Times New Roman" w:cs="Times New Roman"/>
+                <w:rFonts w:ascii="Arial" w:eastAsia="Times New Roman" w:hAnsi="Arial" w:cs="Arial"/>
                 <w:color w:val="000000"/>
                 <w:sz w:val="24"/>
                 <w:szCs w:val="24"/>
@@ -321,7 +319,7 @@
             </w:pPr>
             <w:r>
               <w:rPr>
-                <w:rFonts w:ascii="Times New Roman" w:eastAsia="Times New Roman" w:hAnsi="Times New Roman" w:cs="Times New Roman"/>
+                <w:rFonts w:ascii="Arial" w:eastAsia="Times New Roman" w:hAnsi="Arial" w:cs="Arial"/>
                 <w:color w:val="000000"/>
                 <w:sz w:val="24"/>
                 <w:szCs w:val="24"/>
@@ -331,7 +329,7 @@
             </w:r>
             <w:r>
               <w:rPr>
-                <w:rFonts w:ascii="Times New Roman" w:eastAsia="Times New Roman" w:hAnsi="Times New Roman" w:cs="Times New Roman"/>
+                <w:rFonts w:ascii="Arial" w:eastAsia="Times New Roman" w:hAnsi="Arial" w:cs="Arial"/>
                 <w:color w:val="000000"/>
                 <w:sz w:val="24"/>
                 <w:szCs w:val="24"/>
@@ -360,7 +358,7 @@
               <w:spacing w:after="0" w:line="240" w:lineRule="auto"/>
               <w:jc w:val="center"/>
               <w:rPr>
-                <w:rFonts w:ascii="Times New Roman" w:eastAsia="Times New Roman" w:hAnsi="Times New Roman" w:cs="Times New Roman"/>
+                <w:rFonts w:ascii="Arial" w:eastAsia="Times New Roman" w:hAnsi="Arial" w:cs="Arial"/>
                 <w:color w:val="000000"/>
                 <w:sz w:val="24"/>
                 <w:szCs w:val="24"/>
@@ -369,7 +367,7 @@
             </w:pPr>
             <w:r>
               <w:rPr>
-                <w:rFonts w:ascii="Times New Roman" w:eastAsia="Times New Roman" w:hAnsi="Times New Roman" w:cs="Times New Roman"/>
+                <w:rFonts w:ascii="Arial" w:eastAsia="Times New Roman" w:hAnsi="Arial" w:cs="Arial"/>
                 <w:color w:val="000000"/>
                 <w:sz w:val="24"/>
                 <w:szCs w:val="24"/>
@@ -398,7 +396,7 @@
               <w:spacing w:after="0" w:line="240" w:lineRule="auto"/>
               <w:jc w:val="center"/>
               <w:rPr>
-                <w:rFonts w:ascii="Times New Roman" w:eastAsia="Times New Roman" w:hAnsi="Times New Roman" w:cs="Times New Roman"/>
+                <w:rFonts w:ascii="Arial" w:eastAsia="Times New Roman" w:hAnsi="Arial" w:cs="Arial"/>
                 <w:color w:val="000000"/>
                 <w:sz w:val="24"/>
                 <w:szCs w:val="24"/>
@@ -407,7 +405,7 @@
             </w:pPr>
             <w:r>
               <w:rPr>
-                <w:rFonts w:ascii="Times New Roman" w:eastAsia="Times New Roman" w:hAnsi="Times New Roman" w:cs="Times New Roman"/>
+                <w:rFonts w:ascii="Arial" w:eastAsia="Times New Roman" w:hAnsi="Arial" w:cs="Arial"/>
                 <w:color w:val="000000"/>
                 <w:sz w:val="24"/>
                 <w:szCs w:val="24"/>
@@ -417,7 +415,7 @@
             </w:r>
             <w:r>
               <w:rPr>
-                <w:rFonts w:ascii="Times New Roman" w:eastAsia="Times New Roman" w:hAnsi="Times New Roman" w:cs="Times New Roman"/>
+                <w:rFonts w:ascii="Arial" w:eastAsia="Times New Roman" w:hAnsi="Arial" w:cs="Arial"/>
                 <w:color w:val="000000"/>
                 <w:sz w:val="24"/>
                 <w:szCs w:val="24"/>
@@ -427,7 +425,7 @@
             </w:r>
             <w:r>
               <w:rPr>
-                <w:rFonts w:ascii="Times New Roman" w:eastAsia="Times New Roman" w:hAnsi="Times New Roman" w:cs="Times New Roman"/>
+                <w:rFonts w:ascii="Arial" w:eastAsia="Times New Roman" w:hAnsi="Arial" w:cs="Arial"/>
                 <w:color w:val="000000"/>
                 <w:sz w:val="24"/>
                 <w:szCs w:val="24"/>
@@ -459,7 +457,7 @@
             <w:pPr>
               <w:spacing w:after="0" w:line="240" w:lineRule="auto"/>
               <w:rPr>
-                <w:rFonts w:ascii="Times New Roman" w:eastAsia="Times New Roman" w:hAnsi="Times New Roman" w:cs="Times New Roman"/>
+                <w:rFonts w:ascii="Arial" w:eastAsia="Times New Roman" w:hAnsi="Arial" w:cs="Arial"/>
                 <w:color w:val="000000"/>
                 <w:sz w:val="24"/>
                 <w:szCs w:val="24"/>
@@ -485,7 +483,7 @@
             <w:pPr>
               <w:spacing w:after="0" w:line="240" w:lineRule="auto"/>
               <w:rPr>
-                <w:rFonts w:ascii="Times New Roman" w:eastAsia="Times New Roman" w:hAnsi="Times New Roman" w:cs="Times New Roman"/>
+                <w:rFonts w:ascii="Arial" w:eastAsia="Times New Roman" w:hAnsi="Arial" w:cs="Arial"/>
                 <w:color w:val="000000"/>
                 <w:sz w:val="24"/>
                 <w:szCs w:val="24"/>
@@ -511,7 +509,7 @@
             <w:pPr>
               <w:spacing w:after="0" w:line="240" w:lineRule="auto"/>
               <w:rPr>
-                <w:rFonts w:ascii="Times New Roman" w:eastAsia="Times New Roman" w:hAnsi="Times New Roman" w:cs="Times New Roman"/>
+                <w:rFonts w:ascii="Arial" w:eastAsia="Times New Roman" w:hAnsi="Arial" w:cs="Arial"/>
                 <w:color w:val="000000"/>
                 <w:sz w:val="24"/>
                 <w:szCs w:val="24"/>
@@ -537,7 +535,7 @@
             <w:pPr>
               <w:spacing w:after="0" w:line="240" w:lineRule="auto"/>
               <w:rPr>
-                <w:rFonts w:ascii="Times New Roman" w:eastAsia="Times New Roman" w:hAnsi="Times New Roman" w:cs="Times New Roman"/>
+                <w:rFonts w:ascii="Arial" w:eastAsia="Times New Roman" w:hAnsi="Arial" w:cs="Arial"/>
                 <w:color w:val="000000"/>
                 <w:sz w:val="24"/>
                 <w:szCs w:val="24"/>
@@ -571,7 +569,7 @@
               <w:spacing w:after="0" w:line="240" w:lineRule="auto"/>
               <w:jc w:val="center"/>
               <w:rPr>
-                <w:rFonts w:ascii="Times New Roman" w:eastAsia="Times New Roman" w:hAnsi="Times New Roman" w:cs="Times New Roman"/>
+                <w:rFonts w:ascii="Arial" w:eastAsia="Times New Roman" w:hAnsi="Arial" w:cs="Arial"/>
                 <w:color w:val="000000"/>
                 <w:sz w:val="24"/>
                 <w:szCs w:val="24"/>
@@ -580,7 +578,7 @@
             </w:pPr>
             <w:r>
               <w:rPr>
-                <w:rFonts w:ascii="Times New Roman" w:eastAsia="Times New Roman" w:hAnsi="Times New Roman" w:cs="Times New Roman"/>
+                <w:rFonts w:ascii="Arial" w:eastAsia="Times New Roman" w:hAnsi="Arial" w:cs="Arial"/>
                 <w:color w:val="000000"/>
                 <w:sz w:val="24"/>
                 <w:szCs w:val="24"/>
@@ -610,7 +608,7 @@
               <w:spacing w:after="0" w:line="240" w:lineRule="auto"/>
               <w:jc w:val="center"/>
               <w:rPr>
-                <w:rFonts w:ascii="Times New Roman" w:eastAsia="Times New Roman" w:hAnsi="Times New Roman" w:cs="Times New Roman"/>
+                <w:rFonts w:ascii="Arial" w:eastAsia="Times New Roman" w:hAnsi="Arial" w:cs="Arial"/>
                 <w:color w:val="000000"/>
                 <w:sz w:val="24"/>
                 <w:szCs w:val="24"/>
@@ -619,7 +617,7 @@
             </w:pPr>
             <w:r>
               <w:rPr>
-                <w:rFonts w:ascii="Times New Roman" w:eastAsia="Times New Roman" w:hAnsi="Times New Roman" w:cs="Times New Roman"/>
+                <w:rFonts w:ascii="Arial" w:eastAsia="Times New Roman" w:hAnsi="Arial" w:cs="Arial"/>
                 <w:color w:val="000000"/>
                 <w:sz w:val="24"/>
                 <w:szCs w:val="24"/>
@@ -629,7 +627,7 @@
             </w:r>
             <w:r>
               <w:rPr>
-                <w:rFonts w:ascii="Times New Roman" w:eastAsia="Times New Roman" w:hAnsi="Times New Roman" w:cs="Times New Roman"/>
+                <w:rFonts w:ascii="Arial" w:eastAsia="Times New Roman" w:hAnsi="Arial" w:cs="Arial"/>
                 <w:color w:val="000000"/>
                 <w:sz w:val="24"/>
                 <w:szCs w:val="24"/>
@@ -659,7 +657,7 @@
               <w:spacing w:after="0" w:line="240" w:lineRule="auto"/>
               <w:jc w:val="center"/>
               <w:rPr>
-                <w:rFonts w:ascii="Times New Roman" w:eastAsia="Times New Roman" w:hAnsi="Times New Roman" w:cs="Times New Roman"/>
+                <w:rFonts w:ascii="Arial" w:eastAsia="Times New Roman" w:hAnsi="Arial" w:cs="Arial"/>
                 <w:color w:val="000000"/>
                 <w:sz w:val="24"/>
                 <w:szCs w:val="24"/>
@@ -668,7 +666,7 @@
             </w:pPr>
             <w:r>
               <w:rPr>
-                <w:rFonts w:ascii="Times New Roman" w:eastAsia="Times New Roman" w:hAnsi="Times New Roman" w:cs="Times New Roman"/>
+                <w:rFonts w:ascii="Arial" w:eastAsia="Times New Roman" w:hAnsi="Arial" w:cs="Arial"/>
                 <w:color w:val="000000"/>
                 <w:sz w:val="24"/>
                 <w:szCs w:val="24"/>
@@ -697,7 +695,7 @@
               <w:spacing w:after="0" w:line="240" w:lineRule="auto"/>
               <w:jc w:val="center"/>
               <w:rPr>
-                <w:rFonts w:ascii="Times New Roman" w:eastAsia="Times New Roman" w:hAnsi="Times New Roman" w:cs="Times New Roman"/>
+                <w:rFonts w:ascii="Arial" w:eastAsia="Times New Roman" w:hAnsi="Arial" w:cs="Arial"/>
                 <w:color w:val="000000"/>
                 <w:sz w:val="24"/>
                 <w:szCs w:val="24"/>
@@ -706,7 +704,7 @@
             </w:pPr>
             <w:r>
               <w:rPr>
-                <w:rFonts w:ascii="Times New Roman" w:eastAsia="Times New Roman" w:hAnsi="Times New Roman" w:cs="Times New Roman"/>
+                <w:rFonts w:ascii="Arial" w:eastAsia="Times New Roman" w:hAnsi="Arial" w:cs="Arial"/>
                 <w:color w:val="000000"/>
                 <w:sz w:val="24"/>
                 <w:szCs w:val="24"/>
@@ -716,7 +714,7 @@
             </w:r>
             <w:r>
               <w:rPr>
-                <w:rFonts w:ascii="Times New Roman" w:eastAsia="Times New Roman" w:hAnsi="Times New Roman" w:cs="Times New Roman"/>
+                <w:rFonts w:ascii="Arial" w:eastAsia="Times New Roman" w:hAnsi="Arial" w:cs="Arial"/>
                 <w:color w:val="000000"/>
                 <w:sz w:val="24"/>
                 <w:szCs w:val="24"/>
@@ -726,7 +724,7 @@
             </w:r>
             <w:r>
               <w:rPr>
-                <w:rFonts w:ascii="Times New Roman" w:eastAsia="Times New Roman" w:hAnsi="Times New Roman" w:cs="Times New Roman"/>
+                <w:rFonts w:ascii="Arial" w:eastAsia="Times New Roman" w:hAnsi="Arial" w:cs="Arial"/>
                 <w:color w:val="000000"/>
                 <w:sz w:val="24"/>
                 <w:szCs w:val="24"/>
@@ -758,7 +756,7 @@
             <w:pPr>
               <w:spacing w:after="0" w:line="240" w:lineRule="auto"/>
               <w:rPr>
-                <w:rFonts w:ascii="Times New Roman" w:eastAsia="Times New Roman" w:hAnsi="Times New Roman" w:cs="Times New Roman"/>
+                <w:rFonts w:ascii="Arial" w:eastAsia="Times New Roman" w:hAnsi="Arial" w:cs="Arial"/>
                 <w:color w:val="000000"/>
                 <w:sz w:val="24"/>
                 <w:szCs w:val="24"/>
@@ -784,7 +782,7 @@
             <w:pPr>
               <w:spacing w:after="0" w:line="240" w:lineRule="auto"/>
               <w:rPr>
-                <w:rFonts w:ascii="Times New Roman" w:eastAsia="Times New Roman" w:hAnsi="Times New Roman" w:cs="Times New Roman"/>
+                <w:rFonts w:ascii="Arial" w:eastAsia="Times New Roman" w:hAnsi="Arial" w:cs="Arial"/>
                 <w:color w:val="000000"/>
                 <w:sz w:val="24"/>
                 <w:szCs w:val="24"/>
@@ -810,7 +808,7 @@
             <w:pPr>
               <w:spacing w:after="0" w:line="240" w:lineRule="auto"/>
               <w:rPr>
-                <w:rFonts w:ascii="Times New Roman" w:eastAsia="Times New Roman" w:hAnsi="Times New Roman" w:cs="Times New Roman"/>
+                <w:rFonts w:ascii="Arial" w:eastAsia="Times New Roman" w:hAnsi="Arial" w:cs="Arial"/>
                 <w:color w:val="000000"/>
                 <w:sz w:val="24"/>
                 <w:szCs w:val="24"/>
@@ -836,7 +834,7 @@
             <w:pPr>
               <w:spacing w:after="0" w:line="240" w:lineRule="auto"/>
               <w:rPr>
-                <w:rFonts w:ascii="Times New Roman" w:eastAsia="Times New Roman" w:hAnsi="Times New Roman" w:cs="Times New Roman"/>
+                <w:rFonts w:ascii="Arial" w:eastAsia="Times New Roman" w:hAnsi="Arial" w:cs="Arial"/>
                 <w:color w:val="000000"/>
                 <w:sz w:val="24"/>
                 <w:szCs w:val="24"/>
@@ -870,7 +868,7 @@
               <w:spacing w:after="0" w:line="240" w:lineRule="auto"/>
               <w:jc w:val="center"/>
               <w:rPr>
-                <w:rFonts w:ascii="Times New Roman" w:eastAsia="Times New Roman" w:hAnsi="Times New Roman" w:cs="Times New Roman"/>
+                <w:rFonts w:ascii="Arial" w:eastAsia="Times New Roman" w:hAnsi="Arial" w:cs="Arial"/>
                 <w:color w:val="000000"/>
                 <w:sz w:val="24"/>
                 <w:szCs w:val="24"/>
@@ -879,7 +877,7 @@
             </w:pPr>
             <w:r>
               <w:rPr>
-                <w:rFonts w:ascii="Times New Roman" w:eastAsia="Times New Roman" w:hAnsi="Times New Roman" w:cs="Times New Roman"/>
+                <w:rFonts w:ascii="Arial" w:eastAsia="Times New Roman" w:hAnsi="Arial" w:cs="Arial"/>
                 <w:color w:val="000000"/>
                 <w:sz w:val="24"/>
                 <w:szCs w:val="24"/>
@@ -909,7 +907,7 @@
               <w:spacing w:after="0" w:line="240" w:lineRule="auto"/>
               <w:jc w:val="center"/>
               <w:rPr>
-                <w:rFonts w:ascii="Times New Roman" w:eastAsia="Times New Roman" w:hAnsi="Times New Roman" w:cs="Times New Roman"/>
+                <w:rFonts w:ascii="Arial" w:eastAsia="Times New Roman" w:hAnsi="Arial" w:cs="Arial"/>
                 <w:color w:val="000000"/>
                 <w:sz w:val="24"/>
                 <w:szCs w:val="24"/>
@@ -918,7 +916,7 @@
             </w:pPr>
             <w:r>
               <w:rPr>
-                <w:rFonts w:ascii="Times New Roman" w:eastAsia="Times New Roman" w:hAnsi="Times New Roman" w:cs="Times New Roman"/>
+                <w:rFonts w:ascii="Arial" w:eastAsia="Times New Roman" w:hAnsi="Arial" w:cs="Arial"/>
                 <w:color w:val="000000"/>
                 <w:sz w:val="24"/>
                 <w:szCs w:val="24"/>
@@ -928,7 +926,7 @@
             </w:r>
             <w:r>
               <w:rPr>
-                <w:rFonts w:ascii="Times New Roman" w:eastAsia="Times New Roman" w:hAnsi="Times New Roman" w:cs="Times New Roman"/>
+                <w:rFonts w:ascii="Arial" w:eastAsia="Times New Roman" w:hAnsi="Arial" w:cs="Arial"/>
                 <w:color w:val="000000"/>
                 <w:sz w:val="24"/>
                 <w:szCs w:val="24"/>
@@ -958,7 +956,7 @@
               <w:spacing w:after="0" w:line="240" w:lineRule="auto"/>
               <w:jc w:val="center"/>
               <w:rPr>
-                <w:rFonts w:ascii="Times New Roman" w:eastAsia="Times New Roman" w:hAnsi="Times New Roman" w:cs="Times New Roman"/>
+                <w:rFonts w:ascii="Arial" w:eastAsia="Times New Roman" w:hAnsi="Arial" w:cs="Arial"/>
                 <w:color w:val="000000"/>
                 <w:sz w:val="24"/>
                 <w:szCs w:val="24"/>
@@ -967,7 +965,7 @@
             </w:pPr>
             <w:r>
               <w:rPr>
-                <w:rFonts w:ascii="Times New Roman" w:eastAsia="Times New Roman" w:hAnsi="Times New Roman" w:cs="Times New Roman"/>
+                <w:rFonts w:ascii="Arial" w:eastAsia="Times New Roman" w:hAnsi="Arial" w:cs="Arial"/>
                 <w:color w:val="000000"/>
                 <w:sz w:val="24"/>
                 <w:szCs w:val="24"/>
@@ -996,7 +994,7 @@
               <w:spacing w:after="0" w:line="240" w:lineRule="auto"/>
               <w:jc w:val="center"/>
               <w:rPr>
-                <w:rFonts w:ascii="Times New Roman" w:eastAsia="Times New Roman" w:hAnsi="Times New Roman" w:cs="Times New Roman"/>
+                <w:rFonts w:ascii="Arial" w:eastAsia="Times New Roman" w:hAnsi="Arial" w:cs="Arial"/>
                 <w:color w:val="000000"/>
                 <w:sz w:val="24"/>
                 <w:szCs w:val="24"/>
@@ -1005,7 +1003,7 @@
             </w:pPr>
             <w:r>
               <w:rPr>
-                <w:rFonts w:ascii="Times New Roman" w:eastAsia="Times New Roman" w:hAnsi="Times New Roman" w:cs="Times New Roman"/>
+                <w:rFonts w:ascii="Arial" w:eastAsia="Times New Roman" w:hAnsi="Arial" w:cs="Arial"/>
                 <w:color w:val="000000"/>
                 <w:sz w:val="24"/>
                 <w:szCs w:val="24"/>
@@ -1015,7 +1013,7 @@
             </w:r>
             <w:r>
               <w:rPr>
-                <w:rFonts w:ascii="Times New Roman" w:eastAsia="Times New Roman" w:hAnsi="Times New Roman" w:cs="Times New Roman"/>
+                <w:rFonts w:ascii="Arial" w:eastAsia="Times New Roman" w:hAnsi="Arial" w:cs="Arial"/>
                 <w:color w:val="000000"/>
                 <w:sz w:val="24"/>
                 <w:szCs w:val="24"/>
@@ -1025,7 +1023,7 @@
             </w:r>
             <w:r>
               <w:rPr>
-                <w:rFonts w:ascii="Times New Roman" w:eastAsia="Times New Roman" w:hAnsi="Times New Roman" w:cs="Times New Roman"/>
+                <w:rFonts w:ascii="Arial" w:eastAsia="Times New Roman" w:hAnsi="Arial" w:cs="Arial"/>
                 <w:color w:val="000000"/>
                 <w:sz w:val="24"/>
                 <w:szCs w:val="24"/>
@@ -1371,272 +1369,272 @@
         <w:spacing w:line="360" w:lineRule="auto"/>
         <w:ind w:firstLine="709"/>
         <w:rPr>
+          <w:rFonts w:ascii="Arial" w:hAnsi="Arial" w:cs="Arial"/>
+          <w:b/>
+          <w:sz w:val="24"/>
+          <w:szCs w:val="24"/>
+        </w:rPr>
+      </w:pPr>
+      <w:r>
+        <w:rPr>
+          <w:rFonts w:ascii="Arial" w:hAnsi="Arial" w:cs="Arial"/>
+          <w:b/>
+          <w:sz w:val="24"/>
+          <w:szCs w:val="24"/>
+        </w:rPr>
+        <w:t>Tema</w:t>
+      </w:r>
+      <w:r>
+        <w:rPr>
+          <w:rFonts w:ascii="Arial" w:hAnsi="Arial" w:cs="Arial"/>
+          <w:b/>
+          <w:sz w:val="24"/>
+          <w:szCs w:val="24"/>
+        </w:rPr>
+        <w:t>/Justificativa</w:t>
+      </w:r>
+    </w:p>
+    <w:p>
+      <w:pPr>
+        <w:spacing w:line="360" w:lineRule="auto"/>
+        <w:ind w:firstLine="709"/>
+        <w:jc w:val="both"/>
+        <w:rPr>
+          <w:rFonts w:ascii="Arial" w:hAnsi="Arial" w:cs="Arial"/>
+          <w:sz w:val="24"/>
+          <w:szCs w:val="24"/>
+        </w:rPr>
+      </w:pPr>
+      <w:r>
+        <w:rPr>
+          <w:rFonts w:ascii="Arial" w:hAnsi="Arial" w:cs="Arial"/>
+          <w:sz w:val="24"/>
+          <w:szCs w:val="24"/>
+        </w:rPr>
+        <w:t xml:space="preserve">O tema escolhido pelo grupo </w:t>
+      </w:r>
+      <w:r>
+        <w:rPr>
+          <w:rFonts w:ascii="Arial" w:hAnsi="Arial" w:cs="Arial"/>
+          <w:sz w:val="24"/>
+          <w:szCs w:val="24"/>
+        </w:rPr>
+        <w:t>está</w:t>
+      </w:r>
+      <w:r>
+        <w:rPr>
+          <w:rFonts w:ascii="Arial" w:hAnsi="Arial" w:cs="Arial"/>
+          <w:sz w:val="24"/>
+          <w:szCs w:val="24"/>
+        </w:rPr>
+        <w:t xml:space="preserve"> relacionado a </w:t>
+      </w:r>
+      <w:r>
+        <w:rPr>
+          <w:rFonts w:ascii="Arial" w:hAnsi="Arial" w:cs="Arial"/>
+          <w:sz w:val="24"/>
+          <w:szCs w:val="24"/>
+        </w:rPr>
+        <w:t xml:space="preserve">vendas para a área da </w:t>
+      </w:r>
+      <w:r>
+        <w:rPr>
+          <w:rFonts w:ascii="Arial" w:hAnsi="Arial" w:cs="Arial"/>
+          <w:sz w:val="24"/>
+          <w:szCs w:val="24"/>
+        </w:rPr>
+        <w:t>agron</w:t>
+      </w:r>
+      <w:r>
+        <w:rPr>
+          <w:rFonts w:ascii="Arial" w:hAnsi="Arial" w:cs="Arial"/>
+          <w:sz w:val="24"/>
+          <w:szCs w:val="24"/>
+        </w:rPr>
+        <w:t>omia</w:t>
+      </w:r>
+      <w:r>
+        <w:rPr>
+          <w:rFonts w:ascii="Arial" w:hAnsi="Arial" w:cs="Arial"/>
+          <w:sz w:val="24"/>
+          <w:szCs w:val="24"/>
+        </w:rPr>
+        <w:t>,</w:t>
+      </w:r>
+      <w:r>
+        <w:rPr>
+          <w:rFonts w:ascii="Arial" w:hAnsi="Arial" w:cs="Arial"/>
+          <w:sz w:val="24"/>
+          <w:szCs w:val="24"/>
+        </w:rPr>
+        <w:t xml:space="preserve"> porque</w:t>
+      </w:r>
+      <w:r>
+        <w:rPr>
+          <w:rFonts w:ascii="Arial" w:hAnsi="Arial" w:cs="Arial"/>
+          <w:sz w:val="24"/>
+          <w:szCs w:val="24"/>
+        </w:rPr>
+        <w:t xml:space="preserve"> um dashboard funciona como um painel de controle centralizado que traduz a complexidade do campo em indicadores </w:t>
+      </w:r>
+      <w:r>
+        <w:rPr>
+          <w:rFonts w:ascii="Arial" w:hAnsi="Arial" w:cs="Arial"/>
+          <w:sz w:val="24"/>
+          <w:szCs w:val="24"/>
+        </w:rPr>
+        <w:t>v</w:t>
+      </w:r>
+      <w:r>
+        <w:rPr>
+          <w:rFonts w:ascii="Arial" w:hAnsi="Arial" w:cs="Arial"/>
+          <w:sz w:val="24"/>
+          <w:szCs w:val="24"/>
+        </w:rPr>
+        <w:t xml:space="preserve">isuais claros, permitindo assim uma gestão </w:t>
+      </w:r>
+      <w:r>
+        <w:rPr>
+          <w:rFonts w:ascii="Arial" w:hAnsi="Arial" w:cs="Arial"/>
+          <w:sz w:val="24"/>
+          <w:szCs w:val="24"/>
+        </w:rPr>
+        <w:t xml:space="preserve">de produtos, funcionário, clientes, vendas, lucros e custos, </w:t>
+      </w:r>
+      <w:r>
+        <w:rPr>
+          <w:rFonts w:ascii="Arial" w:hAnsi="Arial" w:cs="Arial"/>
+          <w:sz w:val="24"/>
+          <w:szCs w:val="24"/>
+        </w:rPr>
+        <w:t>baseada em dados em vez de suposições.</w:t>
+      </w:r>
+    </w:p>
+    <w:p>
+      <w:pPr>
+        <w:spacing w:line="360" w:lineRule="auto"/>
+        <w:ind w:firstLine="709"/>
+        <w:jc w:val="both"/>
+        <w:rPr>
+          <w:rFonts w:ascii="Arial" w:hAnsi="Arial" w:cs="Arial"/>
+          <w:b/>
+          <w:sz w:val="24"/>
+          <w:szCs w:val="24"/>
+        </w:rPr>
+      </w:pPr>
+      <w:r>
+        <w:rPr>
+          <w:rFonts w:ascii="Arial" w:hAnsi="Arial" w:cs="Arial"/>
+          <w:b/>
+          <w:sz w:val="24"/>
+          <w:szCs w:val="24"/>
+        </w:rPr>
+        <w:t>Objetivo</w:t>
+      </w:r>
+    </w:p>
+    <w:p>
+      <w:pPr>
+        <w:spacing w:line="360" w:lineRule="auto"/>
+        <w:ind w:firstLine="709"/>
+        <w:jc w:val="both"/>
+        <w:rPr>
+          <w:rFonts w:ascii="Arial" w:hAnsi="Arial" w:cs="Arial"/>
+          <w:sz w:val="24"/>
+          <w:szCs w:val="24"/>
+        </w:rPr>
+      </w:pPr>
+      <w:r>
+        <w:rPr>
+          <w:rFonts w:ascii="Arial" w:hAnsi="Arial" w:cs="Arial"/>
+          <w:sz w:val="24"/>
+          <w:szCs w:val="24"/>
+        </w:rPr>
+        <w:t xml:space="preserve">O objetivo principal da criação do dashboard </w:t>
+      </w:r>
+      <w:r>
+        <w:rPr>
+          <w:rFonts w:ascii="Arial" w:hAnsi="Arial" w:cs="Arial"/>
+          <w:sz w:val="24"/>
+          <w:szCs w:val="24"/>
+        </w:rPr>
+        <w:t xml:space="preserve">para o agronegócio </w:t>
+      </w:r>
+      <w:r>
+        <w:rPr>
+          <w:rFonts w:ascii="Arial" w:hAnsi="Arial" w:cs="Arial"/>
+          <w:sz w:val="24"/>
+          <w:szCs w:val="24"/>
+        </w:rPr>
+        <w:t xml:space="preserve">é facilitar e melhorar a visualização do proprietário com seu produto. </w:t>
+      </w:r>
+      <w:r>
+        <w:rPr>
+          <w:rFonts w:ascii="Arial" w:hAnsi="Arial" w:cs="Arial"/>
+          <w:sz w:val="24"/>
+          <w:szCs w:val="24"/>
+        </w:rPr>
+        <w:t>Transformando os dados brutos de campo em visibilidade estratégica, permitindo assim que os produtores e gestores tomem decisões rápidas sobre tratamentos de talhão, uso de maquinários e custos de produção</w:t>
+      </w:r>
+      <w:r>
+        <w:rPr>
+          <w:rFonts w:ascii="Arial" w:hAnsi="Arial" w:cs="Arial"/>
+          <w:sz w:val="24"/>
+          <w:szCs w:val="24"/>
+        </w:rPr>
+        <w:t>.</w:t>
+      </w:r>
+    </w:p>
+    <w:p>
+      <w:pPr>
+        <w:spacing w:line="360" w:lineRule="auto"/>
+        <w:ind w:firstLine="709"/>
+        <w:jc w:val="both"/>
+        <w:rPr>
           <w:rFonts w:ascii="Times New Roman" w:hAnsi="Times New Roman" w:cs="Times New Roman"/>
-          <w:b/>
-          <w:sz w:val="24"/>
-          <w:szCs w:val="24"/>
-        </w:rPr>
-      </w:pPr>
-      <w:r>
+          <w:sz w:val="24"/>
+          <w:szCs w:val="24"/>
+        </w:rPr>
+      </w:pPr>
+    </w:p>
+    <w:p>
+      <w:pPr>
+        <w:spacing w:line="360" w:lineRule="auto"/>
+        <w:ind w:firstLine="709"/>
+        <w:jc w:val="both"/>
         <w:rPr>
           <w:rFonts w:ascii="Times New Roman" w:hAnsi="Times New Roman" w:cs="Times New Roman"/>
-          <w:b/>
-          <w:sz w:val="24"/>
-          <w:szCs w:val="24"/>
-        </w:rPr>
-        <w:t>Tema</w:t>
-      </w:r>
-      <w:r>
+          <w:sz w:val="24"/>
+          <w:szCs w:val="24"/>
+        </w:rPr>
+      </w:pPr>
+    </w:p>
+    <w:p>
+      <w:pPr>
+        <w:spacing w:line="360" w:lineRule="auto"/>
+        <w:ind w:firstLine="709"/>
+        <w:jc w:val="both"/>
         <w:rPr>
           <w:rFonts w:ascii="Times New Roman" w:hAnsi="Times New Roman" w:cs="Times New Roman"/>
           <w:b/>
           <w:sz w:val="24"/>
           <w:szCs w:val="24"/>
         </w:rPr>
-        <w:t>/Justificativa</w:t>
-      </w:r>
-    </w:p>
-    <w:p>
-      <w:pPr>
-        <w:spacing w:line="360" w:lineRule="auto"/>
-        <w:ind w:firstLine="709"/>
-        <w:jc w:val="both"/>
-        <w:rPr>
-          <w:rFonts w:ascii="Times New Roman" w:hAnsi="Times New Roman" w:cs="Times New Roman"/>
-          <w:sz w:val="24"/>
-          <w:szCs w:val="24"/>
-        </w:rPr>
-      </w:pPr>
-      <w:r>
-        <w:rPr>
-          <w:rFonts w:ascii="Times New Roman" w:hAnsi="Times New Roman" w:cs="Times New Roman"/>
-          <w:sz w:val="24"/>
-          <w:szCs w:val="24"/>
-        </w:rPr>
-        <w:t xml:space="preserve">O tema escolhido pelo grupo </w:t>
-      </w:r>
-      <w:r>
-        <w:rPr>
-          <w:rFonts w:ascii="Times New Roman" w:hAnsi="Times New Roman" w:cs="Times New Roman"/>
-          <w:sz w:val="24"/>
-          <w:szCs w:val="24"/>
-        </w:rPr>
-        <w:t>está</w:t>
-      </w:r>
-      <w:r>
-        <w:rPr>
-          <w:rFonts w:ascii="Times New Roman" w:hAnsi="Times New Roman" w:cs="Times New Roman"/>
-          <w:sz w:val="24"/>
-          <w:szCs w:val="24"/>
-        </w:rPr>
-        <w:t xml:space="preserve"> relacionado a </w:t>
-      </w:r>
-      <w:r>
-        <w:rPr>
-          <w:rFonts w:ascii="Times New Roman" w:hAnsi="Times New Roman" w:cs="Times New Roman"/>
-          <w:sz w:val="24"/>
-          <w:szCs w:val="24"/>
-        </w:rPr>
-        <w:t xml:space="preserve">vendas para a área da </w:t>
-      </w:r>
-      <w:r>
-        <w:rPr>
-          <w:rFonts w:ascii="Times New Roman" w:hAnsi="Times New Roman" w:cs="Times New Roman"/>
-          <w:sz w:val="24"/>
-          <w:szCs w:val="24"/>
-        </w:rPr>
-        <w:t>agron</w:t>
-      </w:r>
-      <w:r>
-        <w:rPr>
-          <w:rFonts w:ascii="Times New Roman" w:hAnsi="Times New Roman" w:cs="Times New Roman"/>
-          <w:sz w:val="24"/>
-          <w:szCs w:val="24"/>
-        </w:rPr>
-        <w:t>omia</w:t>
-      </w:r>
-      <w:r>
-        <w:rPr>
-          <w:rFonts w:ascii="Times New Roman" w:hAnsi="Times New Roman" w:cs="Times New Roman"/>
-          <w:sz w:val="24"/>
-          <w:szCs w:val="24"/>
-        </w:rPr>
-        <w:t>,</w:t>
-      </w:r>
-      <w:r>
-        <w:rPr>
-          <w:rFonts w:ascii="Times New Roman" w:hAnsi="Times New Roman" w:cs="Times New Roman"/>
-          <w:sz w:val="24"/>
-          <w:szCs w:val="24"/>
-        </w:rPr>
-        <w:t xml:space="preserve"> porque</w:t>
-      </w:r>
-      <w:r>
-        <w:rPr>
-          <w:rFonts w:ascii="Times New Roman" w:hAnsi="Times New Roman" w:cs="Times New Roman"/>
-          <w:sz w:val="24"/>
-          <w:szCs w:val="24"/>
-        </w:rPr>
-        <w:t xml:space="preserve"> um dashboard funciona como um painel de controle centralizado que traduz a complexidade do campo em indicadores </w:t>
-      </w:r>
-      <w:r>
-        <w:rPr>
-          <w:rFonts w:ascii="Times New Roman" w:hAnsi="Times New Roman" w:cs="Times New Roman"/>
-          <w:sz w:val="24"/>
-          <w:szCs w:val="24"/>
-        </w:rPr>
-        <w:t>v</w:t>
-      </w:r>
-      <w:r>
-        <w:rPr>
-          <w:rFonts w:ascii="Times New Roman" w:hAnsi="Times New Roman" w:cs="Times New Roman"/>
-          <w:sz w:val="24"/>
-          <w:szCs w:val="24"/>
-        </w:rPr>
-        <w:t xml:space="preserve">isuais claros, permitindo assim uma gestão </w:t>
-      </w:r>
-      <w:r>
-        <w:rPr>
-          <w:rFonts w:ascii="Times New Roman" w:hAnsi="Times New Roman" w:cs="Times New Roman"/>
-          <w:sz w:val="24"/>
-          <w:szCs w:val="24"/>
-        </w:rPr>
-        <w:t xml:space="preserve">de produtos, funcionário, clientes, vendas, lucros e custos, </w:t>
-      </w:r>
-      <w:r>
-        <w:rPr>
-          <w:rFonts w:ascii="Times New Roman" w:hAnsi="Times New Roman" w:cs="Times New Roman"/>
-          <w:sz w:val="24"/>
-          <w:szCs w:val="24"/>
-        </w:rPr>
-        <w:t>baseada em dados em vez de suposições.</w:t>
-      </w:r>
-    </w:p>
-    <w:p>
-      <w:pPr>
-        <w:spacing w:line="360" w:lineRule="auto"/>
-        <w:ind w:firstLine="709"/>
-        <w:jc w:val="both"/>
-        <w:rPr>
-          <w:rFonts w:ascii="Times New Roman" w:hAnsi="Times New Roman" w:cs="Times New Roman"/>
-          <w:b/>
-          <w:sz w:val="24"/>
-          <w:szCs w:val="24"/>
-        </w:rPr>
-      </w:pPr>
-      <w:r>
-        <w:rPr>
-          <w:rFonts w:ascii="Times New Roman" w:hAnsi="Times New Roman" w:cs="Times New Roman"/>
-          <w:b/>
-          <w:sz w:val="24"/>
-          <w:szCs w:val="24"/>
-        </w:rPr>
-        <w:t>Objetivo</w:t>
-      </w:r>
-    </w:p>
-    <w:p>
-      <w:pPr>
-        <w:spacing w:line="360" w:lineRule="auto"/>
-        <w:ind w:firstLine="709"/>
-        <w:jc w:val="both"/>
-        <w:rPr>
-          <w:rFonts w:ascii="Times New Roman" w:hAnsi="Times New Roman" w:cs="Times New Roman"/>
-          <w:sz w:val="24"/>
-          <w:szCs w:val="24"/>
-        </w:rPr>
-      </w:pPr>
-      <w:r>
-        <w:rPr>
-          <w:rFonts w:ascii="Times New Roman" w:hAnsi="Times New Roman" w:cs="Times New Roman"/>
-          <w:sz w:val="24"/>
-          <w:szCs w:val="24"/>
-        </w:rPr>
-        <w:t xml:space="preserve">O objetivo principal da criação do dashboard </w:t>
-      </w:r>
-      <w:r>
-        <w:rPr>
-          <w:rFonts w:ascii="Times New Roman" w:hAnsi="Times New Roman" w:cs="Times New Roman"/>
-          <w:sz w:val="24"/>
-          <w:szCs w:val="24"/>
-        </w:rPr>
-        <w:t xml:space="preserve">para o agronegócio </w:t>
-      </w:r>
-      <w:r>
-        <w:rPr>
-          <w:rFonts w:ascii="Times New Roman" w:hAnsi="Times New Roman" w:cs="Times New Roman"/>
-          <w:sz w:val="24"/>
-          <w:szCs w:val="24"/>
-        </w:rPr>
-        <w:t xml:space="preserve">é facilitar e melhorar a visualização do proprietário com seu produto. </w:t>
-      </w:r>
-      <w:r>
-        <w:rPr>
-          <w:rFonts w:ascii="Times New Roman" w:hAnsi="Times New Roman" w:cs="Times New Roman"/>
-          <w:sz w:val="24"/>
-          <w:szCs w:val="24"/>
-        </w:rPr>
-        <w:t>Transformando os dados brutos de campo em visibilidade estratégica, permitindo assim que os produtores e gestores tomem decisões rápidas sobre tratamentos de talhão, uso de maquinários e custos de produção</w:t>
-      </w:r>
-      <w:r>
-        <w:rPr>
-          <w:rFonts w:ascii="Times New Roman" w:hAnsi="Times New Roman" w:cs="Times New Roman"/>
-          <w:sz w:val="24"/>
-          <w:szCs w:val="24"/>
-        </w:rPr>
-        <w:t>.</w:t>
-      </w:r>
-    </w:p>
-    <w:p>
-      <w:pPr>
-        <w:spacing w:line="360" w:lineRule="auto"/>
-        <w:ind w:firstLine="709"/>
-        <w:jc w:val="both"/>
-        <w:rPr>
-          <w:rFonts w:ascii="Times New Roman" w:hAnsi="Times New Roman" w:cs="Times New Roman"/>
-          <w:sz w:val="24"/>
-          <w:szCs w:val="24"/>
-        </w:rPr>
-      </w:pPr>
-    </w:p>
-    <w:p>
-      <w:pPr>
-        <w:spacing w:line="360" w:lineRule="auto"/>
-        <w:ind w:firstLine="709"/>
-        <w:jc w:val="both"/>
-        <w:rPr>
-          <w:rFonts w:ascii="Times New Roman" w:hAnsi="Times New Roman" w:cs="Times New Roman"/>
-          <w:sz w:val="24"/>
-          <w:szCs w:val="24"/>
-        </w:rPr>
-      </w:pPr>
-    </w:p>
-    <w:p>
-      <w:pPr>
-        <w:spacing w:line="360" w:lineRule="auto"/>
-        <w:ind w:firstLine="709"/>
-        <w:jc w:val="both"/>
-        <w:rPr>
-          <w:rFonts w:ascii="Times New Roman" w:hAnsi="Times New Roman" w:cs="Times New Roman"/>
-          <w:b/>
-          <w:sz w:val="24"/>
-          <w:szCs w:val="24"/>
-        </w:rPr>
-      </w:pPr>
-    </w:p>
-    <w:p>
-      <w:pPr>
-        <w:spacing w:line="360" w:lineRule="auto"/>
-        <w:ind w:firstLine="709"/>
-        <w:jc w:val="both"/>
-        <w:rPr>
-          <w:rFonts w:ascii="Times New Roman" w:hAnsi="Times New Roman" w:cs="Times New Roman"/>
-          <w:sz w:val="24"/>
-          <w:szCs w:val="24"/>
-        </w:rPr>
-      </w:pPr>
-      <w:r>
-        <w:rPr>
-          <w:rFonts w:ascii="Times New Roman" w:hAnsi="Times New Roman" w:cs="Times New Roman"/>
+      </w:pPr>
+    </w:p>
+    <w:p>
+      <w:pPr>
+        <w:spacing w:line="360" w:lineRule="auto"/>
+        <w:ind w:firstLine="709"/>
+        <w:jc w:val="both"/>
+        <w:rPr>
+          <w:rFonts w:ascii="Arial" w:hAnsi="Arial" w:cs="Arial"/>
+          <w:sz w:val="24"/>
+          <w:szCs w:val="24"/>
+        </w:rPr>
+      </w:pPr>
+      <w:r>
+        <w:rPr>
+          <w:rFonts w:ascii="Arial" w:hAnsi="Arial" w:cs="Arial"/>
           <w:b/>
           <w:sz w:val="24"/>
           <w:szCs w:val="24"/>
@@ -1645,7 +1643,7 @@
       </w:r>
       <w:r>
         <w:rPr>
-          <w:rFonts w:ascii="Times New Roman" w:hAnsi="Times New Roman" w:cs="Times New Roman"/>
+          <w:rFonts w:ascii="Arial" w:hAnsi="Arial" w:cs="Arial"/>
           <w:b/>
           <w:sz w:val="24"/>
           <w:szCs w:val="24"/>
@@ -1659,14 +1657,14 @@
         <w:ind w:firstLine="709"/>
         <w:jc w:val="both"/>
         <w:rPr>
-          <w:rFonts w:ascii="Times New Roman" w:hAnsi="Times New Roman" w:cs="Times New Roman"/>
-          <w:sz w:val="24"/>
-          <w:szCs w:val="24"/>
-        </w:rPr>
-      </w:pPr>
-      <w:r>
-        <w:rPr>
-          <w:rFonts w:ascii="Times New Roman" w:hAnsi="Times New Roman" w:cs="Times New Roman"/>
+          <w:rFonts w:ascii="Arial" w:hAnsi="Arial" w:cs="Arial"/>
+          <w:sz w:val="24"/>
+          <w:szCs w:val="24"/>
+        </w:rPr>
+      </w:pPr>
+      <w:r>
+        <w:rPr>
+          <w:rFonts w:ascii="Arial" w:hAnsi="Arial" w:cs="Arial"/>
           <w:sz w:val="24"/>
           <w:szCs w:val="24"/>
         </w:rPr>
@@ -1679,25 +1677,15 @@
         <w:ind w:firstLine="709"/>
         <w:jc w:val="both"/>
         <w:rPr>
-          <w:rFonts w:ascii="Times New Roman" w:hAnsi="Times New Roman" w:cs="Times New Roman"/>
-        </w:rPr>
-      </w:pPr>
-    </w:p>
-    <w:p>
-      <w:pPr>
-        <w:spacing w:line="360" w:lineRule="auto"/>
-        <w:ind w:firstLine="709"/>
-        <w:jc w:val="both"/>
-        <w:rPr>
-          <w:rFonts w:ascii="Times New Roman" w:hAnsi="Times New Roman" w:cs="Times New Roman"/>
-          <w:b/>
-          <w:sz w:val="24"/>
-          <w:szCs w:val="24"/>
-        </w:rPr>
-      </w:pPr>
-      <w:r>
-        <w:rPr>
-          <w:rFonts w:ascii="Times New Roman" w:hAnsi="Times New Roman" w:cs="Times New Roman"/>
+          <w:rFonts w:ascii="Arial" w:hAnsi="Arial" w:cs="Arial"/>
+          <w:b/>
+          <w:sz w:val="24"/>
+          <w:szCs w:val="24"/>
+        </w:rPr>
+      </w:pPr>
+      <w:r>
+        <w:rPr>
+          <w:rFonts w:ascii="Arial" w:hAnsi="Arial" w:cs="Arial"/>
           <w:b/>
           <w:sz w:val="24"/>
           <w:szCs w:val="24"/>
@@ -1711,15 +1699,15 @@
         <w:ind w:firstLine="709"/>
         <w:jc w:val="both"/>
         <w:rPr>
-          <w:rFonts w:ascii="Times New Roman" w:hAnsi="Times New Roman" w:cs="Times New Roman"/>
-          <w:b/>
-          <w:sz w:val="24"/>
-          <w:szCs w:val="24"/>
-        </w:rPr>
-      </w:pPr>
-      <w:r>
-        <w:rPr>
-          <w:rFonts w:ascii="Times New Roman" w:hAnsi="Times New Roman" w:cs="Times New Roman"/>
+          <w:rFonts w:ascii="Arial" w:hAnsi="Arial" w:cs="Arial"/>
+          <w:b/>
+          <w:sz w:val="24"/>
+          <w:szCs w:val="24"/>
+        </w:rPr>
+      </w:pPr>
+      <w:r>
+        <w:rPr>
+          <w:rFonts w:ascii="Arial" w:hAnsi="Arial" w:cs="Arial"/>
           <w:b/>
           <w:sz w:val="24"/>
           <w:szCs w:val="24"/>
@@ -1728,7 +1716,7 @@
       </w:r>
       <w:r>
         <w:rPr>
-          <w:rFonts w:ascii="Times New Roman" w:hAnsi="Times New Roman" w:cs="Times New Roman"/>
+          <w:rFonts w:ascii="Arial" w:hAnsi="Arial" w:cs="Arial"/>
           <w:b/>
           <w:sz w:val="24"/>
           <w:szCs w:val="24"/>
@@ -1768,7 +1756,7 @@
                     <pic:cNvPicPr/>
                   </pic:nvPicPr>
                   <pic:blipFill>
-                    <a:blip r:embed="rId6">
+                    <a:blip r:embed="rId7">
                       <a:extLst>
                         <a:ext uri="{28A0092B-C50C-407E-A947-70E740481C1C}">
                           <a14:useLocalDpi xmlns:a14="http://schemas.microsoft.com/office/drawing/2010/main" val="0"/>
@@ -1803,54 +1791,56 @@
         <w:rPr>
           <w:rFonts w:ascii="Arial" w:hAnsi="Arial" w:cs="Arial"/>
           <w:b/>
-        </w:rPr>
-      </w:pPr>
-      <w:r>
+          <w:sz w:val="18"/>
+          <w:szCs w:val="18"/>
+        </w:rPr>
+      </w:pPr>
+      <w:r>
+        <w:rPr>
+          <w:rFonts w:ascii="Arial" w:hAnsi="Arial" w:cs="Arial"/>
+          <w:b/>
+          <w:sz w:val="18"/>
+          <w:szCs w:val="18"/>
+        </w:rPr>
+        <w:t xml:space="preserve">Fonte: </w:t>
+      </w:r>
+      <w:r>
+        <w:rPr>
+          <w:rFonts w:ascii="Arial" w:hAnsi="Arial" w:cs="Arial"/>
+          <w:sz w:val="18"/>
+          <w:szCs w:val="18"/>
+        </w:rPr>
+        <w:t>Os Autores</w:t>
+      </w:r>
+    </w:p>
+    <w:p>
+      <w:pPr>
+        <w:spacing w:line="360" w:lineRule="auto"/>
+        <w:ind w:firstLine="709"/>
+        <w:jc w:val="both"/>
         <w:rPr>
           <w:rFonts w:ascii="Times New Roman" w:hAnsi="Times New Roman" w:cs="Times New Roman"/>
           <w:b/>
-          <w:sz w:val="20"/>
-          <w:szCs w:val="20"/>
-        </w:rPr>
-        <w:t xml:space="preserve">Fonte: </w:t>
-      </w:r>
-      <w:r>
-        <w:rPr>
-          <w:rFonts w:ascii="Times New Roman" w:hAnsi="Times New Roman" w:cs="Times New Roman"/>
-          <w:sz w:val="20"/>
-          <w:szCs w:val="20"/>
-        </w:rPr>
-        <w:t>Os Autores</w:t>
-      </w:r>
-    </w:p>
-    <w:p>
-      <w:pPr>
-        <w:spacing w:line="360" w:lineRule="auto"/>
-        <w:ind w:firstLine="709"/>
-        <w:jc w:val="both"/>
-        <w:rPr>
-          <w:rFonts w:ascii="Times New Roman" w:hAnsi="Times New Roman" w:cs="Times New Roman"/>
-          <w:b/>
-          <w:sz w:val="24"/>
-          <w:szCs w:val="24"/>
-        </w:rPr>
-      </w:pPr>
-    </w:p>
-    <w:p>
-      <w:pPr>
-        <w:spacing w:line="360" w:lineRule="auto"/>
-        <w:ind w:firstLine="709"/>
-        <w:jc w:val="both"/>
-        <w:rPr>
-          <w:rFonts w:ascii="Times New Roman" w:hAnsi="Times New Roman" w:cs="Times New Roman"/>
-          <w:b/>
-          <w:sz w:val="24"/>
-          <w:szCs w:val="24"/>
-        </w:rPr>
-      </w:pPr>
-      <w:r>
-        <w:rPr>
-          <w:rFonts w:ascii="Times New Roman" w:hAnsi="Times New Roman" w:cs="Times New Roman"/>
+          <w:sz w:val="24"/>
+          <w:szCs w:val="24"/>
+        </w:rPr>
+      </w:pPr>
+    </w:p>
+    <w:p>
+      <w:pPr>
+        <w:spacing w:line="360" w:lineRule="auto"/>
+        <w:ind w:firstLine="709"/>
+        <w:jc w:val="both"/>
+        <w:rPr>
+          <w:rFonts w:ascii="Arial" w:hAnsi="Arial" w:cs="Arial"/>
+          <w:b/>
+          <w:sz w:val="24"/>
+          <w:szCs w:val="24"/>
+        </w:rPr>
+      </w:pPr>
+      <w:r>
+        <w:rPr>
+          <w:rFonts w:ascii="Arial" w:hAnsi="Arial" w:cs="Arial"/>
           <w:b/>
           <w:sz w:val="24"/>
           <w:szCs w:val="24"/>
@@ -1890,7 +1880,7 @@
                     <pic:cNvPicPr/>
                   </pic:nvPicPr>
                   <pic:blipFill>
-                    <a:blip r:embed="rId7">
+                    <a:blip r:embed="rId8">
                       <a:extLst>
                         <a:ext uri="{28A0092B-C50C-407E-A947-70E740481C1C}">
                           <a14:useLocalDpi xmlns:a14="http://schemas.microsoft.com/office/drawing/2010/main" val="0"/>
@@ -1923,28 +1913,52 @@
         <w:ind w:firstLine="709"/>
         <w:jc w:val="both"/>
         <w:rPr>
+          <w:rFonts w:ascii="Arial" w:hAnsi="Arial" w:cs="Arial"/>
+          <w:sz w:val="18"/>
+          <w:szCs w:val="18"/>
+        </w:rPr>
+      </w:pPr>
+      <w:r>
+        <w:rPr>
+          <w:rFonts w:ascii="Arial" w:hAnsi="Arial" w:cs="Arial"/>
+          <w:b/>
+          <w:sz w:val="18"/>
+          <w:szCs w:val="18"/>
+        </w:rPr>
+        <w:t xml:space="preserve">Fonte: </w:t>
+      </w:r>
+      <w:r>
+        <w:rPr>
+          <w:rFonts w:ascii="Arial" w:hAnsi="Arial" w:cs="Arial"/>
+          <w:sz w:val="18"/>
+          <w:szCs w:val="18"/>
+        </w:rPr>
+        <w:t>Os Autores</w:t>
+      </w:r>
+    </w:p>
+    <w:p>
+      <w:pPr>
+        <w:spacing w:line="360" w:lineRule="auto"/>
+        <w:ind w:firstLine="709"/>
+        <w:jc w:val="both"/>
+        <w:rPr>
           <w:rFonts w:ascii="Times New Roman" w:hAnsi="Times New Roman" w:cs="Times New Roman"/>
           <w:sz w:val="20"/>
           <w:szCs w:val="20"/>
         </w:rPr>
       </w:pPr>
-      <w:r>
-        <w:rPr>
-          <w:rFonts w:ascii="Times New Roman" w:hAnsi="Times New Roman" w:cs="Times New Roman"/>
-          <w:b/>
-          <w:sz w:val="20"/>
-          <w:szCs w:val="20"/>
-        </w:rPr>
-        <w:t xml:space="preserve">Fonte: </w:t>
-      </w:r>
-      <w:r>
+    </w:p>
+    <w:p>
+      <w:pPr>
+        <w:spacing w:line="360" w:lineRule="auto"/>
+        <w:ind w:firstLine="709"/>
+        <w:jc w:val="both"/>
         <w:rPr>
           <w:rFonts w:ascii="Times New Roman" w:hAnsi="Times New Roman" w:cs="Times New Roman"/>
           <w:sz w:val="20"/>
           <w:szCs w:val="20"/>
         </w:rPr>
-        <w:t>Os Autores</w:t>
-      </w:r>
+      </w:pPr>
     </w:p>
     <w:p>
       <w:pPr>
@@ -2048,39 +2062,15 @@
         <w:ind w:firstLine="709"/>
         <w:jc w:val="both"/>
         <w:rPr>
-          <w:rFonts w:ascii="Times New Roman" w:hAnsi="Times New Roman" w:cs="Times New Roman"/>
-          <w:sz w:val="20"/>
-          <w:szCs w:val="20"/>
-        </w:rPr>
-      </w:pPr>
-    </w:p>
-    <w:p>
-      <w:pPr>
-        <w:spacing w:line="360" w:lineRule="auto"/>
-        <w:ind w:firstLine="709"/>
-        <w:jc w:val="both"/>
-        <w:rPr>
-          <w:rFonts w:ascii="Times New Roman" w:hAnsi="Times New Roman" w:cs="Times New Roman"/>
-          <w:sz w:val="20"/>
-          <w:szCs w:val="20"/>
-        </w:rPr>
-      </w:pPr>
-    </w:p>
-    <w:p>
-      <w:pPr>
-        <w:spacing w:line="360" w:lineRule="auto"/>
-        <w:ind w:firstLine="709"/>
-        <w:jc w:val="both"/>
-        <w:rPr>
-          <w:rFonts w:ascii="Times New Roman" w:hAnsi="Times New Roman" w:cs="Times New Roman"/>
-          <w:b/>
-          <w:sz w:val="24"/>
-          <w:szCs w:val="24"/>
-        </w:rPr>
-      </w:pPr>
-      <w:r>
-        <w:rPr>
-          <w:rFonts w:ascii="Times New Roman" w:hAnsi="Times New Roman" w:cs="Times New Roman"/>
+          <w:rFonts w:ascii="Arial" w:hAnsi="Arial" w:cs="Arial"/>
+          <w:b/>
+          <w:sz w:val="24"/>
+          <w:szCs w:val="24"/>
+        </w:rPr>
+      </w:pPr>
+      <w:r>
+        <w:rPr>
+          <w:rFonts w:ascii="Arial" w:hAnsi="Arial" w:cs="Arial"/>
           <w:b/>
           <w:sz w:val="24"/>
           <w:szCs w:val="24"/>
@@ -2094,25 +2084,21 @@
         <w:ind w:firstLine="709"/>
         <w:jc w:val="both"/>
         <w:rPr>
-          <w:rFonts w:ascii="Times New Roman" w:hAnsi="Times New Roman" w:cs="Times New Roman"/>
-          <w:b/>
-          <w:sz w:val="24"/>
-          <w:szCs w:val="24"/>
-        </w:rPr>
-      </w:pPr>
-      <w:r>
-        <w:rPr>
-          <w:rFonts w:ascii="Times New Roman" w:hAnsi="Times New Roman" w:cs="Times New Roman"/>
+          <w:rFonts w:ascii="Arial" w:hAnsi="Arial" w:cs="Arial"/>
+          <w:b/>
+        </w:rPr>
+      </w:pPr>
+      <w:r>
+        <w:rPr>
+          <w:rFonts w:ascii="Arial" w:hAnsi="Arial" w:cs="Arial"/>
           <w:b/>
           <w:noProof/>
-          <w:sz w:val="24"/>
-          <w:szCs w:val="24"/>
         </w:rPr>
         <w:drawing>
-          <wp:inline distT="0" distB="0" distL="0" distR="0" wp14:anchorId="46E8996E" wp14:editId="20BF8B3B">
-            <wp:extent cx="4693920" cy="3627120"/>
-            <wp:effectExtent l="0" t="0" r="0" b="0"/>
-            <wp:docPr id="8" name="Imagem 8"/>
+          <wp:inline distT="0" distB="0" distL="0" distR="0" wp14:anchorId="7004332E" wp14:editId="4F9FAC02">
+            <wp:extent cx="4565073" cy="2999105"/>
+            <wp:effectExtent l="0" t="0" r="6985" b="0"/>
+            <wp:docPr id="2" name="Imagem 2"/>
             <wp:cNvGraphicFramePr>
               <a:graphicFrameLocks xmlns:a="http://schemas.openxmlformats.org/drawingml/2006/main" noChangeAspect="1"/>
             </wp:cNvGraphicFramePr>
@@ -2120,11 +2106,11 @@
               <a:graphicData uri="http://schemas.openxmlformats.org/drawingml/2006/picture">
                 <pic:pic xmlns:pic="http://schemas.openxmlformats.org/drawingml/2006/picture">
                   <pic:nvPicPr>
-                    <pic:cNvPr id="8" name="Captura de tela 2026-02-03 073208.png"/>
+                    <pic:cNvPr id="2" name="Captura de tela 2026-02-13 085411.png"/>
                     <pic:cNvPicPr/>
                   </pic:nvPicPr>
                   <pic:blipFill>
-                    <a:blip r:embed="rId8">
+                    <a:blip r:embed="rId9">
                       <a:extLst>
                         <a:ext uri="{28A0092B-C50C-407E-A947-70E740481C1C}">
                           <a14:useLocalDpi xmlns:a14="http://schemas.microsoft.com/office/drawing/2010/main" val="0"/>
@@ -2138,7 +2124,7 @@
                   <pic:spPr>
                     <a:xfrm>
                       <a:off x="0" y="0"/>
-                      <a:ext cx="4693920" cy="3627120"/>
+                      <a:ext cx="4594002" cy="3018111"/>
                     </a:xfrm>
                     <a:prstGeom prst="rect">
                       <a:avLst/>
@@ -2158,56 +2144,1670 @@
         <w:jc w:val="both"/>
         <w:rPr>
           <w:rFonts w:ascii="Arial" w:hAnsi="Arial" w:cs="Arial"/>
-          <w:b/>
-        </w:rPr>
-      </w:pPr>
-    </w:p>
-    <w:p>
-      <w:pPr>
-        <w:spacing w:line="360" w:lineRule="auto"/>
-        <w:ind w:firstLine="709"/>
-        <w:jc w:val="both"/>
-        <w:rPr>
-          <w:rFonts w:ascii="Arial" w:hAnsi="Arial" w:cs="Arial"/>
-          <w:b/>
-        </w:rPr>
-      </w:pPr>
-    </w:p>
-    <w:p>
-      <w:pPr>
-        <w:spacing w:line="360" w:lineRule="auto"/>
-        <w:ind w:firstLine="709"/>
-        <w:jc w:val="both"/>
-        <w:rPr>
-          <w:rFonts w:ascii="Arial" w:hAnsi="Arial" w:cs="Arial"/>
-          <w:b/>
-        </w:rPr>
-      </w:pPr>
-    </w:p>
-    <w:p>
-      <w:pPr>
-        <w:spacing w:line="360" w:lineRule="auto"/>
-        <w:ind w:firstLine="709"/>
-        <w:jc w:val="both"/>
-        <w:rPr>
-          <w:rFonts w:ascii="Arial" w:hAnsi="Arial" w:cs="Arial"/>
-          <w:b/>
-        </w:rPr>
-      </w:pPr>
-    </w:p>
-    <w:p>
-      <w:pPr>
-        <w:spacing w:line="360" w:lineRule="auto"/>
-        <w:ind w:firstLine="709"/>
-        <w:jc w:val="both"/>
-        <w:rPr>
-          <w:rFonts w:ascii="Arial" w:hAnsi="Arial" w:cs="Arial"/>
-          <w:b/>
-        </w:rPr>
-      </w:pPr>
+          <w:sz w:val="18"/>
+          <w:szCs w:val="18"/>
+        </w:rPr>
+      </w:pPr>
+      <w:r>
+        <w:rPr>
+          <w:rFonts w:ascii="Arial" w:hAnsi="Arial" w:cs="Arial"/>
+          <w:b/>
+          <w:sz w:val="18"/>
+          <w:szCs w:val="18"/>
+        </w:rPr>
+        <w:t xml:space="preserve">Fonte: </w:t>
+      </w:r>
+      <w:r>
+        <w:rPr>
+          <w:rFonts w:ascii="Arial" w:hAnsi="Arial" w:cs="Arial"/>
+          <w:sz w:val="18"/>
+          <w:szCs w:val="18"/>
+        </w:rPr>
+        <w:t>Os autores</w:t>
+      </w:r>
+    </w:p>
+    <w:p>
+      <w:pPr>
+        <w:spacing w:line="360" w:lineRule="auto"/>
+        <w:ind w:firstLine="709"/>
+        <w:jc w:val="both"/>
+        <w:rPr>
+          <w:rFonts w:ascii="Arial" w:hAnsi="Arial" w:cs="Arial"/>
+          <w:sz w:val="18"/>
+          <w:szCs w:val="18"/>
+        </w:rPr>
+      </w:pPr>
+    </w:p>
+    <w:p>
+      <w:pPr>
+        <w:spacing w:line="360" w:lineRule="auto"/>
+        <w:ind w:firstLine="709"/>
+        <w:jc w:val="both"/>
+        <w:rPr>
+          <w:rFonts w:ascii="Arial" w:hAnsi="Arial" w:cs="Arial"/>
+          <w:b/>
+          <w:sz w:val="24"/>
+          <w:szCs w:val="24"/>
+        </w:rPr>
+      </w:pPr>
+      <w:r>
+        <w:rPr>
+          <w:rFonts w:ascii="Arial" w:hAnsi="Arial" w:cs="Arial"/>
+          <w:b/>
+          <w:sz w:val="24"/>
+          <w:szCs w:val="24"/>
+        </w:rPr>
+        <w:t xml:space="preserve">Gráfico de </w:t>
+      </w:r>
+      <w:proofErr w:type="spellStart"/>
+      <w:r>
+        <w:rPr>
+          <w:rFonts w:ascii="Arial" w:hAnsi="Arial" w:cs="Arial"/>
+          <w:b/>
+          <w:sz w:val="24"/>
+          <w:szCs w:val="24"/>
+        </w:rPr>
+        <w:t>Gantt</w:t>
+      </w:r>
+      <w:proofErr w:type="spellEnd"/>
+    </w:p>
+    <w:p>
+      <w:pPr>
+        <w:spacing w:line="360" w:lineRule="auto"/>
+        <w:ind w:firstLine="709"/>
+        <w:jc w:val="both"/>
+        <w:rPr>
+          <w:rFonts w:ascii="Arial" w:hAnsi="Arial" w:cs="Arial"/>
+          <w:b/>
+          <w:sz w:val="24"/>
+          <w:szCs w:val="24"/>
+        </w:rPr>
+      </w:pPr>
+      <w:r>
+        <w:rPr>
+          <w:rFonts w:ascii="Arial" w:hAnsi="Arial" w:cs="Arial"/>
+          <w:b/>
+          <w:noProof/>
+          <w:sz w:val="24"/>
+          <w:szCs w:val="24"/>
+        </w:rPr>
+        <w:drawing>
+          <wp:inline distT="0" distB="0" distL="0" distR="0" wp14:anchorId="74452BCE" wp14:editId="48116BAA">
+            <wp:extent cx="5174615" cy="2500745"/>
+            <wp:effectExtent l="0" t="0" r="6985" b="0"/>
+            <wp:docPr id="6" name="Imagem 6"/>
+            <wp:cNvGraphicFramePr>
+              <a:graphicFrameLocks xmlns:a="http://schemas.openxmlformats.org/drawingml/2006/main" noChangeAspect="1"/>
+            </wp:cNvGraphicFramePr>
+            <a:graphic xmlns:a="http://schemas.openxmlformats.org/drawingml/2006/main">
+              <a:graphicData uri="http://schemas.openxmlformats.org/drawingml/2006/picture">
+                <pic:pic xmlns:pic="http://schemas.openxmlformats.org/drawingml/2006/picture">
+                  <pic:nvPicPr>
+                    <pic:cNvPr id="6" name="Captura de tela 2026-02-13 085818.png"/>
+                    <pic:cNvPicPr/>
+                  </pic:nvPicPr>
+                  <pic:blipFill>
+                    <a:blip r:embed="rId10">
+                      <a:extLst>
+                        <a:ext uri="{28A0092B-C50C-407E-A947-70E740481C1C}">
+                          <a14:useLocalDpi xmlns:a14="http://schemas.microsoft.com/office/drawing/2010/main" val="0"/>
+                        </a:ext>
+                      </a:extLst>
+                    </a:blip>
+                    <a:stretch>
+                      <a:fillRect/>
+                    </a:stretch>
+                  </pic:blipFill>
+                  <pic:spPr>
+                    <a:xfrm>
+                      <a:off x="0" y="0"/>
+                      <a:ext cx="5187062" cy="2506760"/>
+                    </a:xfrm>
+                    <a:prstGeom prst="rect">
+                      <a:avLst/>
+                    </a:prstGeom>
+                  </pic:spPr>
+                </pic:pic>
+              </a:graphicData>
+            </a:graphic>
+          </wp:inline>
+        </w:drawing>
+      </w:r>
+    </w:p>
+    <w:p>
+      <w:pPr>
+        <w:spacing w:line="360" w:lineRule="auto"/>
+        <w:ind w:firstLine="709"/>
+        <w:jc w:val="both"/>
+        <w:rPr>
+          <w:rFonts w:ascii="Arial" w:hAnsi="Arial" w:cs="Arial"/>
+          <w:sz w:val="18"/>
+          <w:szCs w:val="18"/>
+        </w:rPr>
+      </w:pPr>
+      <w:r>
+        <w:rPr>
+          <w:rFonts w:ascii="Arial" w:hAnsi="Arial" w:cs="Arial"/>
+          <w:b/>
+          <w:sz w:val="18"/>
+          <w:szCs w:val="18"/>
+        </w:rPr>
+        <w:t xml:space="preserve">Fonte: </w:t>
+      </w:r>
+      <w:r>
+        <w:rPr>
+          <w:rFonts w:ascii="Arial" w:hAnsi="Arial" w:cs="Arial"/>
+          <w:sz w:val="18"/>
+          <w:szCs w:val="18"/>
+        </w:rPr>
+        <w:t>Os autores</w:t>
+      </w:r>
+    </w:p>
+    <w:p>
+      <w:pPr>
+        <w:spacing w:line="360" w:lineRule="auto"/>
+        <w:ind w:firstLine="709"/>
+        <w:jc w:val="both"/>
+        <w:rPr>
+          <w:rFonts w:ascii="Arial" w:hAnsi="Arial" w:cs="Arial"/>
+          <w:b/>
+          <w:sz w:val="24"/>
+          <w:szCs w:val="24"/>
+        </w:rPr>
+      </w:pPr>
+    </w:p>
+    <w:p>
+      <w:pPr>
+        <w:spacing w:line="360" w:lineRule="auto"/>
+        <w:ind w:firstLine="709"/>
+        <w:jc w:val="both"/>
+        <w:rPr>
+          <w:rFonts w:ascii="Arial" w:hAnsi="Arial" w:cs="Arial"/>
+          <w:b/>
+          <w:sz w:val="24"/>
+          <w:szCs w:val="24"/>
+        </w:rPr>
+      </w:pPr>
+      <w:r>
+        <w:rPr>
+          <w:rFonts w:ascii="Arial" w:hAnsi="Arial" w:cs="Arial"/>
+          <w:b/>
+          <w:sz w:val="24"/>
+          <w:szCs w:val="24"/>
+        </w:rPr>
+        <w:t>Regra de Negócio</w:t>
+      </w:r>
+    </w:p>
+    <w:p>
+      <w:pPr>
+        <w:spacing w:line="360" w:lineRule="auto"/>
+        <w:ind w:firstLine="709"/>
+        <w:jc w:val="both"/>
+        <w:rPr>
+          <w:rFonts w:ascii="Arial" w:hAnsi="Arial" w:cs="Arial"/>
+          <w:b/>
+          <w:sz w:val="24"/>
+          <w:szCs w:val="24"/>
+        </w:rPr>
+      </w:pPr>
+      <w:r>
+        <w:rPr>
+          <w:rFonts w:ascii="Arial" w:hAnsi="Arial" w:cs="Arial"/>
+          <w:b/>
+          <w:noProof/>
+          <w:sz w:val="24"/>
+          <w:szCs w:val="24"/>
+        </w:rPr>
+        <w:drawing>
+          <wp:inline distT="0" distB="0" distL="0" distR="0" wp14:anchorId="47B781AA" wp14:editId="0C9C7BE3">
+            <wp:extent cx="4396740" cy="4831080"/>
+            <wp:effectExtent l="0" t="0" r="3810" b="7620"/>
+            <wp:docPr id="9" name="Imagem 9"/>
+            <wp:cNvGraphicFramePr>
+              <a:graphicFrameLocks xmlns:a="http://schemas.openxmlformats.org/drawingml/2006/main" noChangeAspect="1"/>
+            </wp:cNvGraphicFramePr>
+            <a:graphic xmlns:a="http://schemas.openxmlformats.org/drawingml/2006/main">
+              <a:graphicData uri="http://schemas.openxmlformats.org/drawingml/2006/picture">
+                <pic:pic xmlns:pic="http://schemas.openxmlformats.org/drawingml/2006/picture">
+                  <pic:nvPicPr>
+                    <pic:cNvPr id="9" name="Captura de tela 2026-02-13 091207.png"/>
+                    <pic:cNvPicPr/>
+                  </pic:nvPicPr>
+                  <pic:blipFill>
+                    <a:blip r:embed="rId11">
+                      <a:extLst>
+                        <a:ext uri="{28A0092B-C50C-407E-A947-70E740481C1C}">
+                          <a14:useLocalDpi xmlns:a14="http://schemas.microsoft.com/office/drawing/2010/main" val="0"/>
+                        </a:ext>
+                      </a:extLst>
+                    </a:blip>
+                    <a:stretch>
+                      <a:fillRect/>
+                    </a:stretch>
+                  </pic:blipFill>
+                  <pic:spPr>
+                    <a:xfrm>
+                      <a:off x="0" y="0"/>
+                      <a:ext cx="4396803" cy="4831149"/>
+                    </a:xfrm>
+                    <a:prstGeom prst="rect">
+                      <a:avLst/>
+                    </a:prstGeom>
+                  </pic:spPr>
+                </pic:pic>
+              </a:graphicData>
+            </a:graphic>
+          </wp:inline>
+        </w:drawing>
+      </w:r>
+    </w:p>
+    <w:p>
+      <w:pPr>
+        <w:spacing w:line="360" w:lineRule="auto"/>
+        <w:ind w:firstLine="709"/>
+        <w:jc w:val="both"/>
+        <w:rPr>
+          <w:rFonts w:ascii="Arial" w:hAnsi="Arial" w:cs="Arial"/>
+          <w:sz w:val="18"/>
+          <w:szCs w:val="18"/>
+        </w:rPr>
+      </w:pPr>
+      <w:r>
+        <w:rPr>
+          <w:rFonts w:ascii="Arial" w:hAnsi="Arial" w:cs="Arial"/>
+          <w:b/>
+          <w:sz w:val="18"/>
+          <w:szCs w:val="18"/>
+        </w:rPr>
+        <w:t xml:space="preserve">Fonte: </w:t>
+      </w:r>
+      <w:r>
+        <w:rPr>
+          <w:rFonts w:ascii="Arial" w:hAnsi="Arial" w:cs="Arial"/>
+          <w:sz w:val="18"/>
+          <w:szCs w:val="18"/>
+        </w:rPr>
+        <w:t>Os autores</w:t>
+      </w:r>
+    </w:p>
+    <w:p>
+      <w:pPr>
+        <w:spacing w:line="360" w:lineRule="auto"/>
+        <w:ind w:firstLine="709"/>
+        <w:jc w:val="both"/>
+        <w:rPr>
+          <w:rFonts w:ascii="Arial" w:hAnsi="Arial" w:cs="Arial"/>
+          <w:sz w:val="18"/>
+          <w:szCs w:val="18"/>
+        </w:rPr>
+      </w:pPr>
+    </w:p>
+    <w:p>
+      <w:pPr>
+        <w:spacing w:line="360" w:lineRule="auto"/>
+        <w:ind w:firstLine="709"/>
+        <w:jc w:val="both"/>
+        <w:rPr>
+          <w:rFonts w:ascii="Arial" w:hAnsi="Arial" w:cs="Arial"/>
+          <w:sz w:val="18"/>
+          <w:szCs w:val="18"/>
+        </w:rPr>
+      </w:pPr>
+    </w:p>
+    <w:p>
+      <w:pPr>
+        <w:spacing w:line="360" w:lineRule="auto"/>
+        <w:ind w:firstLine="709"/>
+        <w:jc w:val="both"/>
+        <w:rPr>
+          <w:rFonts w:ascii="Arial" w:hAnsi="Arial" w:cs="Arial"/>
+          <w:sz w:val="18"/>
+          <w:szCs w:val="18"/>
+        </w:rPr>
+      </w:pPr>
+    </w:p>
+    <w:p>
+      <w:pPr>
+        <w:spacing w:line="360" w:lineRule="auto"/>
+        <w:ind w:firstLine="709"/>
+        <w:jc w:val="both"/>
+        <w:rPr>
+          <w:rFonts w:ascii="Arial" w:hAnsi="Arial" w:cs="Arial"/>
+          <w:sz w:val="18"/>
+          <w:szCs w:val="18"/>
+        </w:rPr>
+      </w:pPr>
+    </w:p>
+    <w:p>
+      <w:pPr>
+        <w:spacing w:line="360" w:lineRule="auto"/>
+        <w:ind w:firstLine="709"/>
+        <w:jc w:val="both"/>
+        <w:rPr>
+          <w:rFonts w:ascii="Arial" w:hAnsi="Arial" w:cs="Arial"/>
+          <w:sz w:val="18"/>
+          <w:szCs w:val="18"/>
+        </w:rPr>
+      </w:pPr>
+    </w:p>
+    <w:p>
+      <w:pPr>
+        <w:spacing w:line="360" w:lineRule="auto"/>
+        <w:ind w:firstLine="709"/>
+        <w:jc w:val="both"/>
+        <w:rPr>
+          <w:rFonts w:ascii="Arial" w:hAnsi="Arial" w:cs="Arial"/>
+          <w:sz w:val="18"/>
+          <w:szCs w:val="18"/>
+        </w:rPr>
+      </w:pPr>
+    </w:p>
+    <w:p>
+      <w:pPr>
+        <w:spacing w:line="360" w:lineRule="auto"/>
+        <w:ind w:firstLine="709"/>
+        <w:jc w:val="both"/>
+        <w:rPr>
+          <w:rFonts w:ascii="Arial" w:hAnsi="Arial" w:cs="Arial"/>
+          <w:sz w:val="18"/>
+          <w:szCs w:val="18"/>
+        </w:rPr>
+      </w:pPr>
+    </w:p>
+    <w:p>
+      <w:pPr>
+        <w:spacing w:line="360" w:lineRule="auto"/>
+        <w:ind w:firstLine="709"/>
+        <w:jc w:val="both"/>
+        <w:rPr>
+          <w:rFonts w:ascii="Arial" w:hAnsi="Arial" w:cs="Arial"/>
+          <w:b/>
+          <w:sz w:val="24"/>
+          <w:szCs w:val="24"/>
+        </w:rPr>
+      </w:pPr>
+      <w:r>
+        <w:rPr>
+          <w:rFonts w:ascii="Arial" w:hAnsi="Arial" w:cs="Arial"/>
+          <w:b/>
+          <w:sz w:val="24"/>
+          <w:szCs w:val="24"/>
+        </w:rPr>
+        <w:t>História do Usuário</w:t>
+      </w:r>
+    </w:p>
+    <w:p>
+      <w:pPr>
+        <w:spacing w:line="360" w:lineRule="auto"/>
+        <w:ind w:firstLine="709"/>
+        <w:jc w:val="both"/>
+        <w:rPr>
+          <w:rFonts w:ascii="Arial" w:hAnsi="Arial" w:cs="Arial"/>
+          <w:sz w:val="24"/>
+          <w:szCs w:val="24"/>
+        </w:rPr>
+      </w:pPr>
+      <w:r>
+        <w:rPr>
+          <w:rFonts w:ascii="Arial" w:hAnsi="Arial" w:cs="Arial"/>
+          <w:noProof/>
+          <w:sz w:val="24"/>
+          <w:szCs w:val="24"/>
+        </w:rPr>
+        <w:drawing>
+          <wp:inline distT="0" distB="0" distL="0" distR="0" wp14:anchorId="299045E7" wp14:editId="2CC34B04">
+            <wp:extent cx="4754880" cy="4975860"/>
+            <wp:effectExtent l="0" t="0" r="7620" b="0"/>
+            <wp:docPr id="10" name="Imagem 10"/>
+            <wp:cNvGraphicFramePr>
+              <a:graphicFrameLocks xmlns:a="http://schemas.openxmlformats.org/drawingml/2006/main" noChangeAspect="1"/>
+            </wp:cNvGraphicFramePr>
+            <a:graphic xmlns:a="http://schemas.openxmlformats.org/drawingml/2006/main">
+              <a:graphicData uri="http://schemas.openxmlformats.org/drawingml/2006/picture">
+                <pic:pic xmlns:pic="http://schemas.openxmlformats.org/drawingml/2006/picture">
+                  <pic:nvPicPr>
+                    <pic:cNvPr id="10" name="Captura de tela 2026-02-13 093724.png"/>
+                    <pic:cNvPicPr/>
+                  </pic:nvPicPr>
+                  <pic:blipFill>
+                    <a:blip r:embed="rId12">
+                      <a:extLst>
+                        <a:ext uri="{28A0092B-C50C-407E-A947-70E740481C1C}">
+                          <a14:useLocalDpi xmlns:a14="http://schemas.microsoft.com/office/drawing/2010/main" val="0"/>
+                        </a:ext>
+                      </a:extLst>
+                    </a:blip>
+                    <a:stretch>
+                      <a:fillRect/>
+                    </a:stretch>
+                  </pic:blipFill>
+                  <pic:spPr>
+                    <a:xfrm>
+                      <a:off x="0" y="0"/>
+                      <a:ext cx="4755045" cy="4976033"/>
+                    </a:xfrm>
+                    <a:prstGeom prst="rect">
+                      <a:avLst/>
+                    </a:prstGeom>
+                  </pic:spPr>
+                </pic:pic>
+              </a:graphicData>
+            </a:graphic>
+          </wp:inline>
+        </w:drawing>
+      </w:r>
+    </w:p>
+    <w:p>
+      <w:pPr>
+        <w:spacing w:line="360" w:lineRule="auto"/>
+        <w:ind w:firstLine="709"/>
+        <w:jc w:val="both"/>
+        <w:rPr>
+          <w:rFonts w:ascii="Arial" w:hAnsi="Arial" w:cs="Arial"/>
+          <w:sz w:val="18"/>
+          <w:szCs w:val="18"/>
+        </w:rPr>
+      </w:pPr>
+      <w:r>
+        <w:rPr>
+          <w:rFonts w:ascii="Arial" w:hAnsi="Arial" w:cs="Arial"/>
+          <w:b/>
+          <w:sz w:val="18"/>
+          <w:szCs w:val="18"/>
+        </w:rPr>
+        <w:t xml:space="preserve">Fonte: </w:t>
+      </w:r>
+      <w:r>
+        <w:rPr>
+          <w:rFonts w:ascii="Arial" w:hAnsi="Arial" w:cs="Arial"/>
+          <w:sz w:val="18"/>
+          <w:szCs w:val="18"/>
+        </w:rPr>
+        <w:t>Os Autores</w:t>
+      </w:r>
+    </w:p>
+    <w:p>
+      <w:pPr>
+        <w:spacing w:line="360" w:lineRule="auto"/>
+        <w:ind w:firstLine="709"/>
+        <w:jc w:val="both"/>
+        <w:rPr>
+          <w:rFonts w:ascii="Arial" w:hAnsi="Arial" w:cs="Arial"/>
+          <w:sz w:val="18"/>
+          <w:szCs w:val="18"/>
+        </w:rPr>
+      </w:pPr>
+    </w:p>
+    <w:p>
+      <w:pPr>
+        <w:spacing w:line="360" w:lineRule="auto"/>
+        <w:ind w:firstLine="709"/>
+        <w:jc w:val="both"/>
+        <w:rPr>
+          <w:rFonts w:ascii="Arial" w:hAnsi="Arial" w:cs="Arial"/>
+          <w:sz w:val="18"/>
+          <w:szCs w:val="18"/>
+        </w:rPr>
+      </w:pPr>
+    </w:p>
+    <w:p>
+      <w:pPr>
+        <w:spacing w:line="360" w:lineRule="auto"/>
+        <w:ind w:firstLine="709"/>
+        <w:jc w:val="both"/>
+        <w:rPr>
+          <w:rFonts w:ascii="Arial" w:hAnsi="Arial" w:cs="Arial"/>
+          <w:sz w:val="18"/>
+          <w:szCs w:val="18"/>
+        </w:rPr>
+      </w:pPr>
+    </w:p>
+    <w:p>
+      <w:pPr>
+        <w:spacing w:line="360" w:lineRule="auto"/>
+        <w:ind w:firstLine="709"/>
+        <w:jc w:val="both"/>
+        <w:rPr>
+          <w:rFonts w:ascii="Arial" w:hAnsi="Arial" w:cs="Arial"/>
+          <w:sz w:val="18"/>
+          <w:szCs w:val="18"/>
+        </w:rPr>
+      </w:pPr>
+    </w:p>
+    <w:p>
+      <w:pPr>
+        <w:spacing w:line="360" w:lineRule="auto"/>
+        <w:ind w:firstLine="709"/>
+        <w:jc w:val="both"/>
+        <w:rPr>
+          <w:rFonts w:ascii="Arial" w:hAnsi="Arial" w:cs="Arial"/>
+          <w:sz w:val="18"/>
+          <w:szCs w:val="18"/>
+        </w:rPr>
+      </w:pPr>
+    </w:p>
+    <w:p>
+      <w:pPr>
+        <w:spacing w:line="360" w:lineRule="auto"/>
+        <w:ind w:firstLine="709"/>
+        <w:jc w:val="both"/>
+        <w:rPr>
+          <w:rFonts w:ascii="Arial" w:hAnsi="Arial" w:cs="Arial"/>
+          <w:sz w:val="18"/>
+          <w:szCs w:val="18"/>
+        </w:rPr>
+      </w:pPr>
+    </w:p>
+    <w:p>
+      <w:pPr>
+        <w:spacing w:line="360" w:lineRule="auto"/>
+        <w:ind w:firstLine="709"/>
+        <w:jc w:val="both"/>
+        <w:rPr>
+          <w:rFonts w:ascii="Arial" w:hAnsi="Arial" w:cs="Arial"/>
+          <w:sz w:val="18"/>
+          <w:szCs w:val="18"/>
+        </w:rPr>
+      </w:pPr>
+    </w:p>
+    <w:p>
+      <w:pPr>
+        <w:spacing w:line="360" w:lineRule="auto"/>
+        <w:ind w:firstLine="709"/>
+        <w:jc w:val="both"/>
+        <w:rPr>
+          <w:rFonts w:ascii="Arial" w:hAnsi="Arial" w:cs="Arial"/>
+          <w:b/>
+          <w:sz w:val="24"/>
+          <w:szCs w:val="24"/>
+        </w:rPr>
+      </w:pPr>
+      <w:r>
+        <w:rPr>
+          <w:rFonts w:ascii="Arial" w:hAnsi="Arial" w:cs="Arial"/>
+          <w:b/>
+          <w:sz w:val="24"/>
+          <w:szCs w:val="24"/>
+        </w:rPr>
+        <w:t>Requisitos da Infraestrutura</w:t>
+      </w:r>
+    </w:p>
+    <w:p>
+      <w:pPr>
+        <w:pStyle w:val="PargrafodaLista"/>
+        <w:numPr>
+          <w:ilvl w:val="0"/>
+          <w:numId w:val="5"/>
+        </w:numPr>
+        <w:shd w:val="clear" w:color="auto" w:fill="FFFFFF"/>
+        <w:spacing w:after="0" w:line="360" w:lineRule="auto"/>
+        <w:jc w:val="both"/>
+        <w:rPr>
+          <w:rFonts w:ascii="Arial" w:eastAsia="Times New Roman" w:hAnsi="Arial" w:cs="Arial"/>
+          <w:color w:val="202124"/>
+          <w:kern w:val="36"/>
+          <w:sz w:val="24"/>
+          <w:szCs w:val="24"/>
+          <w:lang w:eastAsia="pt-BR"/>
+        </w:rPr>
+      </w:pPr>
+      <w:r>
+        <w:rPr>
+          <w:rFonts w:ascii="Arial" w:eastAsia="Times New Roman" w:hAnsi="Arial" w:cs="Arial"/>
+          <w:color w:val="202124"/>
+          <w:kern w:val="36"/>
+          <w:sz w:val="24"/>
+          <w:szCs w:val="24"/>
+          <w:lang w:eastAsia="pt-BR"/>
+        </w:rPr>
+        <w:t>Sistema Gerenciador de Banco de Dados (SGBD)</w:t>
+      </w:r>
+    </w:p>
+    <w:p>
+      <w:pPr>
+        <w:pStyle w:val="PargrafodaLista"/>
+        <w:numPr>
+          <w:ilvl w:val="0"/>
+          <w:numId w:val="2"/>
+        </w:numPr>
+        <w:shd w:val="clear" w:color="auto" w:fill="FFFFFF"/>
+        <w:spacing w:after="0" w:line="360" w:lineRule="auto"/>
+        <w:ind w:left="1077" w:firstLine="709"/>
+        <w:jc w:val="both"/>
+        <w:rPr>
+          <w:rFonts w:ascii="Arial" w:eastAsia="Times New Roman" w:hAnsi="Arial" w:cs="Arial"/>
+          <w:color w:val="202124"/>
+          <w:kern w:val="36"/>
+          <w:sz w:val="24"/>
+          <w:szCs w:val="24"/>
+          <w:lang w:eastAsia="pt-BR"/>
+        </w:rPr>
+      </w:pPr>
+      <w:r>
+        <w:rPr>
+          <w:rFonts w:ascii="Arial" w:eastAsia="Times New Roman" w:hAnsi="Arial" w:cs="Arial"/>
+          <w:b/>
+          <w:color w:val="202124"/>
+          <w:kern w:val="36"/>
+          <w:sz w:val="24"/>
+          <w:szCs w:val="24"/>
+          <w:lang w:eastAsia="pt-BR"/>
+        </w:rPr>
+        <w:t>Nome do SGBD:</w:t>
+      </w:r>
+      <w:r>
+        <w:rPr>
+          <w:rFonts w:ascii="Arial" w:eastAsia="Times New Roman" w:hAnsi="Arial" w:cs="Arial"/>
+          <w:color w:val="202124"/>
+          <w:kern w:val="36"/>
+          <w:sz w:val="24"/>
+          <w:szCs w:val="24"/>
+          <w:lang w:eastAsia="pt-BR"/>
+        </w:rPr>
+        <w:t xml:space="preserve"> </w:t>
+      </w:r>
+      <w:r>
+        <w:rPr>
+          <w:rFonts w:ascii="Arial" w:hAnsi="Arial" w:cs="Arial"/>
+          <w:color w:val="1F1F1F"/>
+          <w:sz w:val="24"/>
+          <w:szCs w:val="24"/>
+          <w:shd w:val="clear" w:color="auto" w:fill="FFFFFF"/>
+        </w:rPr>
+        <w:t>MYSQL</w:t>
+      </w:r>
+      <w:r>
+        <w:rPr>
+          <w:rFonts w:ascii="Arial" w:eastAsia="Times New Roman" w:hAnsi="Arial" w:cs="Arial"/>
+          <w:color w:val="202124"/>
+          <w:kern w:val="36"/>
+          <w:sz w:val="24"/>
+          <w:szCs w:val="24"/>
+          <w:lang w:eastAsia="pt-BR"/>
+        </w:rPr>
+        <w:t>.</w:t>
+      </w:r>
+    </w:p>
+    <w:p>
+      <w:pPr>
+        <w:pStyle w:val="PargrafodaLista"/>
+        <w:numPr>
+          <w:ilvl w:val="0"/>
+          <w:numId w:val="2"/>
+        </w:numPr>
+        <w:shd w:val="clear" w:color="auto" w:fill="FFFFFF"/>
+        <w:spacing w:after="0" w:line="360" w:lineRule="auto"/>
+        <w:ind w:left="1077" w:firstLine="709"/>
+        <w:jc w:val="both"/>
+        <w:rPr>
+          <w:rFonts w:ascii="Arial" w:eastAsia="Times New Roman" w:hAnsi="Arial" w:cs="Arial"/>
+          <w:color w:val="202124"/>
+          <w:kern w:val="36"/>
+          <w:sz w:val="24"/>
+          <w:szCs w:val="24"/>
+          <w:lang w:eastAsia="pt-BR"/>
+        </w:rPr>
+      </w:pPr>
+      <w:r>
+        <w:rPr>
+          <w:rFonts w:ascii="Arial" w:eastAsia="Times New Roman" w:hAnsi="Arial" w:cs="Arial"/>
+          <w:b/>
+          <w:color w:val="202124"/>
+          <w:kern w:val="36"/>
+          <w:sz w:val="24"/>
+          <w:szCs w:val="24"/>
+          <w:lang w:eastAsia="pt-BR"/>
+        </w:rPr>
+        <w:t>Versão:</w:t>
+      </w:r>
+      <w:r>
+        <w:rPr>
+          <w:rFonts w:ascii="Arial" w:eastAsia="Times New Roman" w:hAnsi="Arial" w:cs="Arial"/>
+          <w:color w:val="202124"/>
+          <w:kern w:val="36"/>
+          <w:sz w:val="24"/>
+          <w:szCs w:val="24"/>
+          <w:lang w:eastAsia="pt-BR"/>
+        </w:rPr>
+        <w:t xml:space="preserve"> </w:t>
+      </w:r>
+      <w:r>
+        <w:rPr>
+          <w:rFonts w:ascii="Arial" w:eastAsia="Times New Roman" w:hAnsi="Arial" w:cs="Arial"/>
+          <w:color w:val="202124"/>
+          <w:kern w:val="36"/>
+          <w:sz w:val="24"/>
+          <w:szCs w:val="24"/>
+          <w:lang w:eastAsia="pt-BR"/>
+        </w:rPr>
+        <w:t>8.3.0 – MySQL Community Server - GPL</w:t>
+      </w:r>
+    </w:p>
+    <w:p>
+      <w:pPr>
+        <w:pStyle w:val="PargrafodaLista"/>
+        <w:numPr>
+          <w:ilvl w:val="0"/>
+          <w:numId w:val="2"/>
+        </w:numPr>
+        <w:shd w:val="clear" w:color="auto" w:fill="FFFFFF"/>
+        <w:spacing w:after="0" w:line="360" w:lineRule="auto"/>
+        <w:ind w:left="1077" w:firstLine="709"/>
+        <w:jc w:val="both"/>
+        <w:rPr>
+          <w:rFonts w:ascii="Arial" w:eastAsia="Times New Roman" w:hAnsi="Arial" w:cs="Arial"/>
+          <w:b/>
+          <w:color w:val="202124"/>
+          <w:kern w:val="36"/>
+          <w:sz w:val="24"/>
+          <w:szCs w:val="24"/>
+          <w:lang w:eastAsia="pt-BR"/>
+        </w:rPr>
+      </w:pPr>
+      <w:r>
+        <w:rPr>
+          <w:rFonts w:ascii="Arial" w:eastAsia="Times New Roman" w:hAnsi="Arial" w:cs="Arial"/>
+          <w:b/>
+          <w:color w:val="202124"/>
+          <w:kern w:val="36"/>
+          <w:sz w:val="24"/>
+          <w:szCs w:val="24"/>
+          <w:lang w:eastAsia="pt-BR"/>
+        </w:rPr>
+        <w:t xml:space="preserve">Justificativa da escolha: </w:t>
+      </w:r>
+      <w:r>
+        <w:rPr>
+          <w:rFonts w:ascii="Arial" w:eastAsia="Times New Roman" w:hAnsi="Arial" w:cs="Arial"/>
+          <w:color w:val="202124"/>
+          <w:kern w:val="36"/>
+          <w:sz w:val="24"/>
+          <w:szCs w:val="24"/>
+          <w:lang w:eastAsia="pt-BR"/>
+        </w:rPr>
+        <w:t>O grupo escolheu por ter mais afinidade, tendo como ser mais acessível para outras pessoas tendo mais facilidade no uso.</w:t>
+      </w:r>
+    </w:p>
+    <w:p>
+      <w:pPr>
+        <w:shd w:val="clear" w:color="auto" w:fill="FFFFFF"/>
+        <w:spacing w:after="0" w:line="360" w:lineRule="auto"/>
+        <w:jc w:val="both"/>
+        <w:rPr>
+          <w:rFonts w:ascii="Arial" w:eastAsia="Times New Roman" w:hAnsi="Arial" w:cs="Arial"/>
+          <w:color w:val="202124"/>
+          <w:kern w:val="36"/>
+          <w:sz w:val="24"/>
+          <w:szCs w:val="24"/>
+          <w:lang w:eastAsia="pt-BR"/>
+        </w:rPr>
+      </w:pPr>
+    </w:p>
+    <w:p>
+      <w:pPr>
+        <w:pStyle w:val="PargrafodaLista"/>
+        <w:numPr>
+          <w:ilvl w:val="0"/>
+          <w:numId w:val="5"/>
+        </w:numPr>
+        <w:shd w:val="clear" w:color="auto" w:fill="FFFFFF"/>
+        <w:spacing w:after="0" w:line="360" w:lineRule="auto"/>
+        <w:jc w:val="both"/>
+        <w:rPr>
+          <w:rFonts w:ascii="Arial" w:eastAsia="Times New Roman" w:hAnsi="Arial" w:cs="Arial"/>
+          <w:color w:val="202124"/>
+          <w:kern w:val="36"/>
+          <w:sz w:val="24"/>
+          <w:szCs w:val="24"/>
+          <w:lang w:eastAsia="pt-BR"/>
+        </w:rPr>
+      </w:pPr>
+      <w:r>
+        <w:rPr>
+          <w:rFonts w:ascii="Arial" w:eastAsia="Times New Roman" w:hAnsi="Arial" w:cs="Arial"/>
+          <w:color w:val="202124"/>
+          <w:kern w:val="36"/>
+          <w:sz w:val="24"/>
+          <w:szCs w:val="24"/>
+          <w:lang w:eastAsia="pt-BR"/>
+        </w:rPr>
+        <w:t xml:space="preserve">Sistema Operacional </w:t>
+      </w:r>
+    </w:p>
+    <w:p>
+      <w:pPr>
+        <w:pStyle w:val="PargrafodaLista"/>
+        <w:numPr>
+          <w:ilvl w:val="0"/>
+          <w:numId w:val="3"/>
+        </w:numPr>
+        <w:shd w:val="clear" w:color="auto" w:fill="FFFFFF"/>
+        <w:spacing w:after="0" w:line="360" w:lineRule="auto"/>
+        <w:ind w:left="1077" w:firstLine="709"/>
+        <w:jc w:val="both"/>
+        <w:rPr>
+          <w:rFonts w:ascii="Arial" w:eastAsia="Times New Roman" w:hAnsi="Arial" w:cs="Arial"/>
+          <w:color w:val="202124"/>
+          <w:kern w:val="36"/>
+          <w:sz w:val="24"/>
+          <w:szCs w:val="24"/>
+          <w:lang w:eastAsia="pt-BR"/>
+        </w:rPr>
+      </w:pPr>
+      <w:r>
+        <w:rPr>
+          <w:rFonts w:ascii="Arial" w:eastAsia="Times New Roman" w:hAnsi="Arial" w:cs="Arial"/>
+          <w:b/>
+          <w:color w:val="202124"/>
+          <w:kern w:val="36"/>
+          <w:sz w:val="24"/>
+          <w:szCs w:val="24"/>
+          <w:lang w:eastAsia="pt-BR"/>
+        </w:rPr>
+        <w:t>Nome do Sistema Operacional:</w:t>
+      </w:r>
+      <w:r>
+        <w:rPr>
+          <w:rFonts w:ascii="Arial" w:eastAsia="Times New Roman" w:hAnsi="Arial" w:cs="Arial"/>
+          <w:color w:val="202124"/>
+          <w:kern w:val="36"/>
+          <w:sz w:val="24"/>
+          <w:szCs w:val="24"/>
+          <w:lang w:eastAsia="pt-BR"/>
+        </w:rPr>
+        <w:t xml:space="preserve"> Windows 11</w:t>
+      </w:r>
+    </w:p>
+    <w:p>
+      <w:pPr>
+        <w:pStyle w:val="PargrafodaLista"/>
+        <w:numPr>
+          <w:ilvl w:val="0"/>
+          <w:numId w:val="3"/>
+        </w:numPr>
+        <w:shd w:val="clear" w:color="auto" w:fill="FFFFFF"/>
+        <w:spacing w:after="0" w:line="360" w:lineRule="auto"/>
+        <w:ind w:left="1077" w:firstLine="709"/>
+        <w:jc w:val="both"/>
+        <w:rPr>
+          <w:rFonts w:ascii="Arial" w:eastAsia="Times New Roman" w:hAnsi="Arial" w:cs="Arial"/>
+          <w:color w:val="202124"/>
+          <w:kern w:val="36"/>
+          <w:sz w:val="24"/>
+          <w:szCs w:val="24"/>
+          <w:lang w:eastAsia="pt-BR"/>
+        </w:rPr>
+      </w:pPr>
+      <w:r>
+        <w:rPr>
+          <w:rFonts w:ascii="Arial" w:eastAsia="Times New Roman" w:hAnsi="Arial" w:cs="Arial"/>
+          <w:b/>
+          <w:color w:val="202124"/>
+          <w:kern w:val="36"/>
+          <w:sz w:val="24"/>
+          <w:szCs w:val="24"/>
+          <w:lang w:eastAsia="pt-BR"/>
+        </w:rPr>
+        <w:t>Versão:</w:t>
+      </w:r>
+      <w:r>
+        <w:rPr>
+          <w:rFonts w:ascii="Arial" w:eastAsia="Times New Roman" w:hAnsi="Arial" w:cs="Arial"/>
+          <w:color w:val="202124"/>
+          <w:kern w:val="36"/>
+          <w:sz w:val="24"/>
+          <w:szCs w:val="24"/>
+          <w:lang w:eastAsia="pt-BR"/>
+        </w:rPr>
+        <w:t xml:space="preserve"> </w:t>
+      </w:r>
+      <w:r>
+        <w:rPr>
+          <w:rFonts w:ascii="Arial" w:eastAsia="Times New Roman" w:hAnsi="Arial" w:cs="Arial"/>
+          <w:color w:val="202124"/>
+          <w:kern w:val="36"/>
+          <w:sz w:val="24"/>
+          <w:szCs w:val="24"/>
+          <w:lang w:eastAsia="pt-BR"/>
+        </w:rPr>
+        <w:t>24H2/25H2</w:t>
+      </w:r>
+    </w:p>
+    <w:p>
+      <w:pPr>
+        <w:pStyle w:val="PargrafodaLista"/>
+        <w:numPr>
+          <w:ilvl w:val="0"/>
+          <w:numId w:val="3"/>
+        </w:numPr>
+        <w:shd w:val="clear" w:color="auto" w:fill="FFFFFF"/>
+        <w:spacing w:after="0" w:line="360" w:lineRule="auto"/>
+        <w:ind w:left="1077" w:firstLine="709"/>
+        <w:jc w:val="both"/>
+        <w:rPr>
+          <w:rFonts w:ascii="Arial" w:eastAsia="Times New Roman" w:hAnsi="Arial" w:cs="Arial"/>
+          <w:color w:val="202124"/>
+          <w:kern w:val="36"/>
+          <w:sz w:val="24"/>
+          <w:szCs w:val="24"/>
+          <w:lang w:eastAsia="pt-BR"/>
+        </w:rPr>
+      </w:pPr>
+      <w:r>
+        <w:rPr>
+          <w:rFonts w:ascii="Arial" w:eastAsia="Times New Roman" w:hAnsi="Arial" w:cs="Arial"/>
+          <w:b/>
+          <w:color w:val="202124"/>
+          <w:kern w:val="36"/>
+          <w:sz w:val="24"/>
+          <w:szCs w:val="24"/>
+          <w:lang w:eastAsia="pt-BR"/>
+        </w:rPr>
+        <w:t>Arquitetura:</w:t>
+      </w:r>
+      <w:r>
+        <w:rPr>
+          <w:rFonts w:ascii="Arial" w:eastAsia="Times New Roman" w:hAnsi="Arial" w:cs="Arial"/>
+          <w:color w:val="202124"/>
+          <w:kern w:val="36"/>
+          <w:sz w:val="24"/>
+          <w:szCs w:val="24"/>
+          <w:lang w:eastAsia="pt-BR"/>
+        </w:rPr>
+        <w:t xml:space="preserve"> </w:t>
+      </w:r>
+      <w:r>
+        <w:rPr>
+          <w:rFonts w:ascii="Arial" w:eastAsia="Times New Roman" w:hAnsi="Arial" w:cs="Arial"/>
+          <w:color w:val="202124"/>
+          <w:kern w:val="36"/>
+          <w:sz w:val="24"/>
+          <w:szCs w:val="24"/>
+          <w:lang w:eastAsia="pt-BR"/>
+        </w:rPr>
+        <w:t>x64 (</w:t>
+      </w:r>
+      <w:r>
+        <w:rPr>
+          <w:rFonts w:ascii="Arial" w:eastAsia="Times New Roman" w:hAnsi="Arial" w:cs="Arial"/>
+          <w:color w:val="202124"/>
+          <w:kern w:val="36"/>
+          <w:sz w:val="24"/>
+          <w:szCs w:val="24"/>
+          <w:lang w:eastAsia="pt-BR"/>
+        </w:rPr>
+        <w:t>Intel</w:t>
+      </w:r>
+      <w:r>
+        <w:rPr>
+          <w:rFonts w:ascii="Arial" w:eastAsia="Times New Roman" w:hAnsi="Arial" w:cs="Arial"/>
+          <w:color w:val="202124"/>
+          <w:kern w:val="36"/>
+          <w:sz w:val="24"/>
+          <w:szCs w:val="24"/>
+          <w:lang w:eastAsia="pt-BR"/>
+        </w:rPr>
+        <w:t xml:space="preserve">/AMD) and ARM64 architectures. </w:t>
+      </w:r>
+    </w:p>
+    <w:p>
+      <w:pPr>
+        <w:pStyle w:val="PargrafodaLista"/>
+        <w:numPr>
+          <w:ilvl w:val="0"/>
+          <w:numId w:val="3"/>
+        </w:numPr>
+        <w:shd w:val="clear" w:color="auto" w:fill="FFFFFF"/>
+        <w:spacing w:after="0" w:line="360" w:lineRule="auto"/>
+        <w:ind w:left="1077" w:firstLine="709"/>
+        <w:jc w:val="both"/>
+        <w:rPr>
+          <w:rFonts w:ascii="Arial" w:eastAsia="Times New Roman" w:hAnsi="Arial" w:cs="Arial"/>
+          <w:color w:val="202124"/>
+          <w:kern w:val="36"/>
+          <w:sz w:val="24"/>
+          <w:szCs w:val="24"/>
+          <w:lang w:eastAsia="pt-BR"/>
+        </w:rPr>
+      </w:pPr>
+      <w:r>
+        <w:rPr>
+          <w:rFonts w:ascii="Arial" w:eastAsia="Times New Roman" w:hAnsi="Arial" w:cs="Arial"/>
+          <w:b/>
+          <w:color w:val="202124"/>
+          <w:kern w:val="36"/>
+          <w:sz w:val="24"/>
+          <w:szCs w:val="24"/>
+          <w:lang w:eastAsia="pt-BR"/>
+        </w:rPr>
+        <w:t>Justificativa da escolha:</w:t>
+      </w:r>
+      <w:r>
+        <w:rPr>
+          <w:rFonts w:ascii="Arial" w:eastAsia="Times New Roman" w:hAnsi="Arial" w:cs="Arial"/>
+          <w:color w:val="202124"/>
+          <w:kern w:val="36"/>
+          <w:sz w:val="24"/>
+          <w:szCs w:val="24"/>
+          <w:lang w:eastAsia="pt-BR"/>
+        </w:rPr>
+        <w:t xml:space="preserve"> </w:t>
+      </w:r>
+      <w:r>
+        <w:rPr>
+          <w:rFonts w:ascii="Arial" w:eastAsia="Times New Roman" w:hAnsi="Arial" w:cs="Arial"/>
+          <w:color w:val="202124"/>
+          <w:kern w:val="36"/>
+          <w:sz w:val="24"/>
+          <w:szCs w:val="24"/>
+          <w:lang w:eastAsia="pt-BR"/>
+        </w:rPr>
+        <w:t>O</w:t>
+      </w:r>
+      <w:r>
+        <w:rPr>
+          <w:rFonts w:ascii="Arial" w:eastAsia="Times New Roman" w:hAnsi="Arial" w:cs="Arial"/>
+          <w:color w:val="202124"/>
+          <w:kern w:val="36"/>
+          <w:sz w:val="24"/>
+          <w:szCs w:val="24"/>
+          <w:lang w:eastAsia="pt-BR"/>
+        </w:rPr>
+        <w:t xml:space="preserve"> grupo escolheu por ter disponível nas maguinhas, melhor performasse e por ser mais utilizado.</w:t>
+      </w:r>
+    </w:p>
+    <w:p>
+      <w:pPr>
+        <w:pStyle w:val="PargrafodaLista"/>
+        <w:shd w:val="clear" w:color="auto" w:fill="FFFFFF"/>
+        <w:spacing w:after="0" w:line="360" w:lineRule="auto"/>
+        <w:ind w:left="1440" w:firstLine="709"/>
+        <w:jc w:val="both"/>
+        <w:rPr>
+          <w:rFonts w:ascii="Arial" w:eastAsia="Times New Roman" w:hAnsi="Arial" w:cs="Arial"/>
+          <w:color w:val="202124"/>
+          <w:kern w:val="36"/>
+          <w:sz w:val="24"/>
+          <w:szCs w:val="24"/>
+          <w:lang w:eastAsia="pt-BR"/>
+        </w:rPr>
+      </w:pPr>
+    </w:p>
+    <w:p>
+      <w:pPr>
+        <w:pStyle w:val="PargrafodaLista"/>
+        <w:numPr>
+          <w:ilvl w:val="0"/>
+          <w:numId w:val="5"/>
+        </w:numPr>
+        <w:shd w:val="clear" w:color="auto" w:fill="FFFFFF"/>
+        <w:spacing w:after="0" w:line="360" w:lineRule="auto"/>
+        <w:jc w:val="both"/>
+        <w:rPr>
+          <w:rFonts w:ascii="Arial" w:eastAsia="Times New Roman" w:hAnsi="Arial" w:cs="Arial"/>
+          <w:color w:val="202124"/>
+          <w:kern w:val="36"/>
+          <w:sz w:val="24"/>
+          <w:szCs w:val="24"/>
+          <w:lang w:eastAsia="pt-BR"/>
+        </w:rPr>
+      </w:pPr>
+      <w:r>
+        <w:rPr>
+          <w:rFonts w:ascii="Arial" w:eastAsia="Times New Roman" w:hAnsi="Arial" w:cs="Arial"/>
+          <w:color w:val="202124"/>
+          <w:kern w:val="36"/>
+          <w:sz w:val="24"/>
+          <w:szCs w:val="24"/>
+          <w:lang w:eastAsia="pt-BR"/>
+        </w:rPr>
+        <w:t>Linguagem de Programação</w:t>
+      </w:r>
+    </w:p>
+    <w:p>
+      <w:pPr>
+        <w:pStyle w:val="PargrafodaLista"/>
+        <w:numPr>
+          <w:ilvl w:val="0"/>
+          <w:numId w:val="4"/>
+        </w:numPr>
+        <w:shd w:val="clear" w:color="auto" w:fill="FFFFFF"/>
+        <w:spacing w:after="0" w:line="360" w:lineRule="auto"/>
+        <w:ind w:firstLine="709"/>
+        <w:jc w:val="both"/>
+        <w:rPr>
+          <w:rFonts w:ascii="Arial" w:eastAsia="Times New Roman" w:hAnsi="Arial" w:cs="Arial"/>
+          <w:color w:val="202124"/>
+          <w:kern w:val="36"/>
+          <w:sz w:val="24"/>
+          <w:szCs w:val="24"/>
+          <w:lang w:eastAsia="pt-BR"/>
+        </w:rPr>
+      </w:pPr>
+      <w:r>
+        <w:rPr>
+          <w:rFonts w:ascii="Arial" w:eastAsia="Times New Roman" w:hAnsi="Arial" w:cs="Arial"/>
+          <w:b/>
+          <w:color w:val="202124"/>
+          <w:kern w:val="36"/>
+          <w:sz w:val="24"/>
+          <w:szCs w:val="24"/>
+          <w:lang w:eastAsia="pt-BR"/>
+        </w:rPr>
+        <w:t>Linguagem utilizada:</w:t>
+      </w:r>
+      <w:r>
+        <w:rPr>
+          <w:rFonts w:ascii="Arial" w:eastAsia="Times New Roman" w:hAnsi="Arial" w:cs="Arial"/>
+          <w:color w:val="202124"/>
+          <w:kern w:val="36"/>
+          <w:sz w:val="24"/>
+          <w:szCs w:val="24"/>
+          <w:lang w:eastAsia="pt-BR"/>
+        </w:rPr>
+        <w:t xml:space="preserve"> JavaScrit.</w:t>
+      </w:r>
+    </w:p>
+    <w:p>
+      <w:pPr>
+        <w:pStyle w:val="PargrafodaLista"/>
+        <w:numPr>
+          <w:ilvl w:val="0"/>
+          <w:numId w:val="4"/>
+        </w:numPr>
+        <w:shd w:val="clear" w:color="auto" w:fill="FFFFFF"/>
+        <w:spacing w:after="0" w:line="360" w:lineRule="auto"/>
+        <w:ind w:firstLine="709"/>
+        <w:jc w:val="both"/>
+        <w:rPr>
+          <w:rFonts w:ascii="Arial" w:eastAsia="Times New Roman" w:hAnsi="Arial" w:cs="Arial"/>
+          <w:color w:val="202124"/>
+          <w:kern w:val="36"/>
+          <w:sz w:val="24"/>
+          <w:szCs w:val="24"/>
+          <w:lang w:eastAsia="pt-BR"/>
+        </w:rPr>
+      </w:pPr>
+      <w:r>
+        <w:rPr>
+          <w:rFonts w:ascii="Arial" w:eastAsia="Times New Roman" w:hAnsi="Arial" w:cs="Arial"/>
+          <w:b/>
+          <w:color w:val="202124"/>
+          <w:kern w:val="36"/>
+          <w:sz w:val="24"/>
+          <w:szCs w:val="24"/>
+          <w:lang w:eastAsia="pt-BR"/>
+        </w:rPr>
+        <w:t>Versão:</w:t>
+      </w:r>
+      <w:r>
+        <w:rPr>
+          <w:rFonts w:ascii="Arial" w:eastAsia="Times New Roman" w:hAnsi="Arial" w:cs="Arial"/>
+          <w:color w:val="202124"/>
+          <w:kern w:val="36"/>
+          <w:sz w:val="24"/>
+          <w:szCs w:val="24"/>
+          <w:lang w:eastAsia="pt-BR"/>
+        </w:rPr>
+        <w:t xml:space="preserve"> ECMAScript 2025 (ES16)</w:t>
+      </w:r>
+    </w:p>
+    <w:p>
+      <w:pPr>
+        <w:pStyle w:val="PargrafodaLista"/>
+        <w:numPr>
+          <w:ilvl w:val="0"/>
+          <w:numId w:val="4"/>
+        </w:numPr>
+        <w:shd w:val="clear" w:color="auto" w:fill="FFFFFF"/>
+        <w:spacing w:after="0" w:line="360" w:lineRule="auto"/>
+        <w:ind w:firstLine="709"/>
+        <w:jc w:val="both"/>
+        <w:rPr>
+          <w:rFonts w:ascii="Arial" w:eastAsia="Times New Roman" w:hAnsi="Arial" w:cs="Arial"/>
+          <w:color w:val="202124"/>
+          <w:kern w:val="36"/>
+          <w:sz w:val="24"/>
+          <w:szCs w:val="24"/>
+          <w:lang w:eastAsia="pt-BR"/>
+        </w:rPr>
+      </w:pPr>
+      <w:r>
+        <w:rPr>
+          <w:rFonts w:ascii="Arial" w:eastAsia="Times New Roman" w:hAnsi="Arial" w:cs="Arial"/>
+          <w:b/>
+          <w:color w:val="202124"/>
+          <w:kern w:val="36"/>
+          <w:sz w:val="24"/>
+          <w:szCs w:val="24"/>
+          <w:lang w:eastAsia="pt-BR"/>
+        </w:rPr>
+        <w:t>Justificativa da escolha:</w:t>
+      </w:r>
+      <w:r>
+        <w:rPr>
+          <w:rFonts w:ascii="Arial" w:eastAsia="Times New Roman" w:hAnsi="Arial" w:cs="Arial"/>
+          <w:color w:val="202124"/>
+          <w:kern w:val="36"/>
+          <w:sz w:val="24"/>
+          <w:szCs w:val="24"/>
+          <w:lang w:eastAsia="pt-BR"/>
+        </w:rPr>
+        <w:t xml:space="preserve"> O grupo escolheu por ser a linguagem principal por ser mais utiliza e ser mais fácil de se manusear  </w:t>
+      </w:r>
+    </w:p>
+    <w:p>
+      <w:pPr>
+        <w:shd w:val="clear" w:color="auto" w:fill="FFFFFF"/>
+        <w:spacing w:after="0" w:line="240" w:lineRule="auto"/>
+        <w:jc w:val="center"/>
+        <w:outlineLvl w:val="0"/>
+        <w:rPr>
+          <w:rFonts w:ascii="Times New Roman" w:eastAsia="Times New Roman" w:hAnsi="Times New Roman" w:cs="Times New Roman"/>
+          <w:color w:val="202124"/>
+          <w:kern w:val="36"/>
+          <w:sz w:val="24"/>
+          <w:szCs w:val="24"/>
+          <w:lang w:eastAsia="pt-BR"/>
+        </w:rPr>
+      </w:pPr>
+    </w:p>
+    <w:p>
+      <w:pPr>
+        <w:shd w:val="clear" w:color="auto" w:fill="FFFFFF"/>
+        <w:spacing w:after="0" w:line="240" w:lineRule="auto"/>
+        <w:outlineLvl w:val="0"/>
+        <w:rPr>
+          <w:rFonts w:ascii="Arial" w:eastAsia="Times New Roman" w:hAnsi="Arial" w:cs="Arial"/>
+          <w:color w:val="202124"/>
+          <w:kern w:val="36"/>
+          <w:sz w:val="18"/>
+          <w:szCs w:val="18"/>
+          <w:lang w:eastAsia="pt-BR"/>
+        </w:rPr>
+      </w:pPr>
+      <w:r>
+        <w:rPr>
+          <w:rFonts w:ascii="Arial" w:eastAsia="Times New Roman" w:hAnsi="Arial" w:cs="Arial"/>
+          <w:b/>
+          <w:color w:val="202124"/>
+          <w:kern w:val="36"/>
+          <w:sz w:val="18"/>
+          <w:szCs w:val="18"/>
+          <w:lang w:eastAsia="pt-BR"/>
+        </w:rPr>
+        <w:t>Fonte:</w:t>
+      </w:r>
+      <w:r>
+        <w:rPr>
+          <w:rFonts w:ascii="Arial" w:eastAsia="Times New Roman" w:hAnsi="Arial" w:cs="Arial"/>
+          <w:color w:val="202124"/>
+          <w:kern w:val="36"/>
+          <w:sz w:val="18"/>
+          <w:szCs w:val="18"/>
+          <w:lang w:eastAsia="pt-BR"/>
+        </w:rPr>
+        <w:t xml:space="preserve"> Os </w:t>
+      </w:r>
+      <w:r>
+        <w:rPr>
+          <w:rFonts w:ascii="Arial" w:eastAsia="Times New Roman" w:hAnsi="Arial" w:cs="Arial"/>
+          <w:color w:val="202124"/>
+          <w:kern w:val="36"/>
+          <w:sz w:val="18"/>
+          <w:szCs w:val="18"/>
+          <w:lang w:eastAsia="pt-BR"/>
+        </w:rPr>
+        <w:t>A</w:t>
+      </w:r>
+      <w:r>
+        <w:rPr>
+          <w:rFonts w:ascii="Arial" w:eastAsia="Times New Roman" w:hAnsi="Arial" w:cs="Arial"/>
+          <w:color w:val="202124"/>
+          <w:kern w:val="36"/>
+          <w:sz w:val="18"/>
+          <w:szCs w:val="18"/>
+          <w:lang w:eastAsia="pt-BR"/>
+        </w:rPr>
+        <w:t>utores</w:t>
+      </w:r>
+    </w:p>
+    <w:p>
+      <w:pPr>
+        <w:shd w:val="clear" w:color="auto" w:fill="FFFFFF"/>
+        <w:spacing w:after="0" w:line="240" w:lineRule="auto"/>
+        <w:jc w:val="center"/>
+        <w:outlineLvl w:val="0"/>
+        <w:rPr>
+          <w:rFonts w:ascii="Times New Roman" w:eastAsia="Times New Roman" w:hAnsi="Times New Roman" w:cs="Times New Roman"/>
+          <w:color w:val="202124"/>
+          <w:kern w:val="36"/>
+          <w:sz w:val="24"/>
+          <w:szCs w:val="24"/>
+          <w:lang w:eastAsia="pt-BR"/>
+        </w:rPr>
+      </w:pPr>
+    </w:p>
+    <w:p>
+      <w:pPr>
+        <w:spacing w:line="360" w:lineRule="auto"/>
+        <w:ind w:firstLine="709"/>
+        <w:jc w:val="both"/>
+        <w:rPr>
+          <w:rFonts w:ascii="Arial" w:hAnsi="Arial" w:cs="Arial"/>
+          <w:b/>
+          <w:sz w:val="24"/>
+          <w:szCs w:val="24"/>
+        </w:rPr>
+      </w:pPr>
+    </w:p>
+    <w:p>
+      <w:pPr>
+        <w:spacing w:line="360" w:lineRule="auto"/>
+        <w:ind w:firstLine="709"/>
+        <w:jc w:val="both"/>
+        <w:rPr>
+          <w:rFonts w:ascii="Arial" w:hAnsi="Arial" w:cs="Arial"/>
+          <w:b/>
+          <w:sz w:val="24"/>
+          <w:szCs w:val="24"/>
+        </w:rPr>
+      </w:pPr>
+    </w:p>
+    <w:p>
+      <w:pPr>
+        <w:spacing w:line="360" w:lineRule="auto"/>
+        <w:ind w:firstLine="709"/>
+        <w:jc w:val="both"/>
+        <w:rPr>
+          <w:rFonts w:ascii="Arial" w:hAnsi="Arial" w:cs="Arial"/>
+          <w:b/>
+        </w:rPr>
+      </w:pPr>
+    </w:p>
+    <w:p>
+      <w:pPr>
+        <w:spacing w:line="360" w:lineRule="auto"/>
+        <w:ind w:firstLine="709"/>
+        <w:jc w:val="both"/>
+        <w:rPr>
+          <w:rFonts w:ascii="Arial" w:hAnsi="Arial" w:cs="Arial"/>
+          <w:b/>
+        </w:rPr>
+      </w:pPr>
+    </w:p>
+    <w:p>
+      <w:pPr>
+        <w:spacing w:line="360" w:lineRule="auto"/>
+        <w:ind w:firstLine="709"/>
+        <w:jc w:val="both"/>
+        <w:rPr>
+          <w:rFonts w:ascii="Arial" w:hAnsi="Arial" w:cs="Arial"/>
+          <w:b/>
+          <w:sz w:val="24"/>
+          <w:szCs w:val="24"/>
+        </w:rPr>
+      </w:pPr>
+      <w:r>
+        <w:rPr>
+          <w:rFonts w:ascii="Arial" w:hAnsi="Arial" w:cs="Arial"/>
+          <w:b/>
+          <w:sz w:val="24"/>
+          <w:szCs w:val="24"/>
+        </w:rPr>
+        <w:t xml:space="preserve">Tabela 1 – Custo Total do </w:t>
+      </w:r>
+      <w:r>
+        <w:rPr>
+          <w:rFonts w:ascii="Arial" w:hAnsi="Arial" w:cs="Arial"/>
+          <w:b/>
+          <w:sz w:val="24"/>
+          <w:szCs w:val="24"/>
+        </w:rPr>
+        <w:t>P</w:t>
+      </w:r>
+      <w:r>
+        <w:rPr>
+          <w:rFonts w:ascii="Arial" w:hAnsi="Arial" w:cs="Arial"/>
+          <w:b/>
+          <w:sz w:val="24"/>
+          <w:szCs w:val="24"/>
+        </w:rPr>
+        <w:t>rojeto</w:t>
+      </w:r>
+    </w:p>
+    <w:p>
+      <w:pPr>
+        <w:spacing w:line="360" w:lineRule="auto"/>
+        <w:ind w:firstLine="709"/>
+        <w:jc w:val="both"/>
+        <w:rPr>
+          <w:rFonts w:ascii="Arial" w:hAnsi="Arial" w:cs="Arial"/>
+          <w:b/>
+          <w:sz w:val="24"/>
+          <w:szCs w:val="24"/>
+        </w:rPr>
+      </w:pPr>
+      <w:r>
+        <w:rPr>
+          <w:rFonts w:ascii="Arial" w:hAnsi="Arial" w:cs="Arial"/>
+          <w:b/>
+          <w:sz w:val="24"/>
+          <w:szCs w:val="24"/>
+        </w:rPr>
+        <w:t xml:space="preserve"> </w:t>
+      </w:r>
+      <w:r>
+        <w:rPr>
+          <w:rFonts w:ascii="Arial" w:hAnsi="Arial" w:cs="Arial"/>
+          <w:b/>
+          <w:noProof/>
+          <w:sz w:val="24"/>
+          <w:szCs w:val="24"/>
+        </w:rPr>
+        <w:drawing>
+          <wp:inline distT="0" distB="0" distL="0" distR="0" wp14:anchorId="61D9FFA4" wp14:editId="5D6EA43F">
+            <wp:extent cx="3848637" cy="1152686"/>
+            <wp:effectExtent l="0" t="0" r="0" b="9525"/>
+            <wp:docPr id="13" name="Imagem 13"/>
+            <wp:cNvGraphicFramePr>
+              <a:graphicFrameLocks xmlns:a="http://schemas.openxmlformats.org/drawingml/2006/main" noChangeAspect="1"/>
+            </wp:cNvGraphicFramePr>
+            <a:graphic xmlns:a="http://schemas.openxmlformats.org/drawingml/2006/main">
+              <a:graphicData uri="http://schemas.openxmlformats.org/drawingml/2006/picture">
+                <pic:pic xmlns:pic="http://schemas.openxmlformats.org/drawingml/2006/picture">
+                  <pic:nvPicPr>
+                    <pic:cNvPr id="13" name="Captura de tela 2026-02-13 095748.png"/>
+                    <pic:cNvPicPr/>
+                  </pic:nvPicPr>
+                  <pic:blipFill>
+                    <a:blip r:embed="rId13">
+                      <a:extLst>
+                        <a:ext uri="{28A0092B-C50C-407E-A947-70E740481C1C}">
+                          <a14:useLocalDpi xmlns:a14="http://schemas.microsoft.com/office/drawing/2010/main" val="0"/>
+                        </a:ext>
+                      </a:extLst>
+                    </a:blip>
+                    <a:stretch>
+                      <a:fillRect/>
+                    </a:stretch>
+                  </pic:blipFill>
+                  <pic:spPr>
+                    <a:xfrm>
+                      <a:off x="0" y="0"/>
+                      <a:ext cx="3848637" cy="1152686"/>
+                    </a:xfrm>
+                    <a:prstGeom prst="rect">
+                      <a:avLst/>
+                    </a:prstGeom>
+                  </pic:spPr>
+                </pic:pic>
+              </a:graphicData>
+            </a:graphic>
+          </wp:inline>
+        </w:drawing>
+      </w:r>
+    </w:p>
+    <w:p>
+      <w:pPr>
+        <w:spacing w:line="360" w:lineRule="auto"/>
+        <w:ind w:firstLine="709"/>
+        <w:jc w:val="both"/>
+        <w:rPr>
+          <w:rFonts w:ascii="Arial" w:hAnsi="Arial" w:cs="Arial"/>
+          <w:sz w:val="18"/>
+          <w:szCs w:val="18"/>
+        </w:rPr>
+      </w:pPr>
+      <w:r>
+        <w:rPr>
+          <w:rFonts w:ascii="Arial" w:hAnsi="Arial" w:cs="Arial"/>
+          <w:b/>
+          <w:sz w:val="18"/>
+          <w:szCs w:val="18"/>
+        </w:rPr>
+        <w:t xml:space="preserve">Fonte: </w:t>
+      </w:r>
+      <w:r>
+        <w:rPr>
+          <w:rFonts w:ascii="Arial" w:hAnsi="Arial" w:cs="Arial"/>
+          <w:sz w:val="18"/>
+          <w:szCs w:val="18"/>
+        </w:rPr>
+        <w:t>Os Autores</w:t>
+      </w:r>
+    </w:p>
+    <w:p>
+      <w:pPr>
+        <w:spacing w:line="360" w:lineRule="auto"/>
+        <w:ind w:firstLine="709"/>
+        <w:jc w:val="both"/>
+        <w:rPr>
+          <w:rFonts w:ascii="Arial" w:hAnsi="Arial" w:cs="Arial"/>
+          <w:b/>
+          <w:sz w:val="24"/>
+          <w:szCs w:val="24"/>
+        </w:rPr>
+      </w:pPr>
+    </w:p>
+    <w:p>
+      <w:pPr>
+        <w:spacing w:line="360" w:lineRule="auto"/>
+        <w:ind w:firstLine="709"/>
+        <w:jc w:val="both"/>
+        <w:rPr>
+          <w:rFonts w:ascii="Arial" w:hAnsi="Arial" w:cs="Arial"/>
+          <w:b/>
+          <w:sz w:val="24"/>
+          <w:szCs w:val="24"/>
+        </w:rPr>
+      </w:pPr>
+      <w:r>
+        <w:rPr>
+          <w:rFonts w:ascii="Arial" w:hAnsi="Arial" w:cs="Arial"/>
+          <w:b/>
+          <w:sz w:val="24"/>
+          <w:szCs w:val="24"/>
+        </w:rPr>
+        <w:t>Tabela 2 – Custo Total da Manutenção</w:t>
+      </w:r>
+    </w:p>
+    <w:p>
+      <w:pPr>
+        <w:spacing w:line="360" w:lineRule="auto"/>
+        <w:ind w:firstLine="709"/>
+        <w:jc w:val="both"/>
+        <w:rPr>
+          <w:rFonts w:ascii="Arial" w:hAnsi="Arial" w:cs="Arial"/>
+          <w:b/>
+          <w:sz w:val="24"/>
+          <w:szCs w:val="24"/>
+        </w:rPr>
+      </w:pPr>
+      <w:r>
+        <w:rPr>
+          <w:rFonts w:ascii="Arial" w:hAnsi="Arial" w:cs="Arial"/>
+          <w:b/>
+          <w:noProof/>
+          <w:sz w:val="24"/>
+          <w:szCs w:val="24"/>
+        </w:rPr>
+        <w:drawing>
+          <wp:inline distT="0" distB="0" distL="0" distR="0" wp14:anchorId="1C35C2FC" wp14:editId="77CA4A09">
+            <wp:extent cx="4858428" cy="1152686"/>
+            <wp:effectExtent l="0" t="0" r="0" b="9525"/>
+            <wp:docPr id="14" name="Imagem 14"/>
+            <wp:cNvGraphicFramePr>
+              <a:graphicFrameLocks xmlns:a="http://schemas.openxmlformats.org/drawingml/2006/main" noChangeAspect="1"/>
+            </wp:cNvGraphicFramePr>
+            <a:graphic xmlns:a="http://schemas.openxmlformats.org/drawingml/2006/main">
+              <a:graphicData uri="http://schemas.openxmlformats.org/drawingml/2006/picture">
+                <pic:pic xmlns:pic="http://schemas.openxmlformats.org/drawingml/2006/picture">
+                  <pic:nvPicPr>
+                    <pic:cNvPr id="14" name="Captura de tela 2026-02-13 095754.png"/>
+                    <pic:cNvPicPr/>
+                  </pic:nvPicPr>
+                  <pic:blipFill>
+                    <a:blip r:embed="rId14">
+                      <a:extLst>
+                        <a:ext uri="{28A0092B-C50C-407E-A947-70E740481C1C}">
+                          <a14:useLocalDpi xmlns:a14="http://schemas.microsoft.com/office/drawing/2010/main" val="0"/>
+                        </a:ext>
+                      </a:extLst>
+                    </a:blip>
+                    <a:stretch>
+                      <a:fillRect/>
+                    </a:stretch>
+                  </pic:blipFill>
+                  <pic:spPr>
+                    <a:xfrm>
+                      <a:off x="0" y="0"/>
+                      <a:ext cx="4858428" cy="1152686"/>
+                    </a:xfrm>
+                    <a:prstGeom prst="rect">
+                      <a:avLst/>
+                    </a:prstGeom>
+                  </pic:spPr>
+                </pic:pic>
+              </a:graphicData>
+            </a:graphic>
+          </wp:inline>
+        </w:drawing>
+      </w:r>
+      <w:bookmarkStart w:id="0" w:name="_GoBack"/>
+      <w:bookmarkEnd w:id="0"/>
+    </w:p>
+    <w:p>
+      <w:pPr>
+        <w:spacing w:line="360" w:lineRule="auto"/>
+        <w:ind w:firstLine="709"/>
+        <w:jc w:val="both"/>
+        <w:rPr>
+          <w:rFonts w:ascii="Arial" w:hAnsi="Arial" w:cs="Arial"/>
+          <w:sz w:val="18"/>
+          <w:szCs w:val="18"/>
+        </w:rPr>
+      </w:pPr>
+      <w:r>
+        <w:rPr>
+          <w:rFonts w:ascii="Arial" w:hAnsi="Arial" w:cs="Arial"/>
+          <w:b/>
+          <w:sz w:val="18"/>
+          <w:szCs w:val="18"/>
+        </w:rPr>
+        <w:t xml:space="preserve">Fonte: </w:t>
+      </w:r>
+      <w:r>
+        <w:rPr>
+          <w:rFonts w:ascii="Arial" w:hAnsi="Arial" w:cs="Arial"/>
+          <w:sz w:val="18"/>
+          <w:szCs w:val="18"/>
+        </w:rPr>
+        <w:t>Os Autores</w:t>
+      </w:r>
     </w:p>
     <w:sectPr>
-      <w:headerReference w:type="default" r:id="rId9"/>
+      <w:headerReference w:type="default" r:id="rId15"/>
       <w:pgSz w:w="11906" w:h="16838"/>
       <w:pgMar w:top="1417" w:right="1701" w:bottom="1417" w:left="1701" w:header="708" w:footer="708" w:gutter="0"/>
       <w:cols w:space="708"/>
@@ -2295,7 +3895,7 @@
           <w:pPr>
             <w:jc w:val="center"/>
             <w:rPr>
-              <w:rFonts w:ascii="Times New Roman" w:hAnsi="Times New Roman" w:cs="Times New Roman"/>
+              <w:rFonts w:ascii="Arial" w:hAnsi="Arial" w:cs="Arial"/>
               <w:b/>
             </w:rPr>
           </w:pPr>
@@ -2304,7 +3904,7 @@
           <w:pPr>
             <w:jc w:val="center"/>
             <w:rPr>
-              <w:rFonts w:ascii="Times New Roman" w:hAnsi="Times New Roman" w:cs="Times New Roman"/>
+              <w:rFonts w:ascii="Arial" w:hAnsi="Arial" w:cs="Arial"/>
               <w:b/>
               <w:sz w:val="24"/>
               <w:szCs w:val="24"/>
@@ -2312,7 +3912,7 @@
           </w:pPr>
           <w:r>
             <w:rPr>
-              <w:rFonts w:ascii="Times New Roman" w:hAnsi="Times New Roman" w:cs="Times New Roman"/>
+              <w:rFonts w:ascii="Arial" w:hAnsi="Arial" w:cs="Arial"/>
               <w:b/>
               <w:sz w:val="24"/>
               <w:szCs w:val="24"/>
@@ -2324,7 +3924,7 @@
           <w:pPr>
             <w:jc w:val="center"/>
             <w:rPr>
-              <w:rFonts w:ascii="Times New Roman" w:hAnsi="Times New Roman" w:cs="Times New Roman"/>
+              <w:rFonts w:ascii="Arial" w:hAnsi="Arial" w:cs="Arial"/>
             </w:rPr>
           </w:pPr>
         </w:p>
@@ -2356,7 +3956,7 @@
         <w:p>
           <w:pPr>
             <w:rPr>
-              <w:rFonts w:ascii="Times New Roman" w:hAnsi="Times New Roman" w:cs="Times New Roman"/>
+              <w:rFonts w:ascii="Arial" w:hAnsi="Arial" w:cs="Arial"/>
             </w:rPr>
           </w:pPr>
         </w:p>
@@ -2364,7 +3964,7 @@
           <w:pPr>
             <w:jc w:val="center"/>
             <w:rPr>
-              <w:rFonts w:ascii="Times New Roman" w:hAnsi="Times New Roman" w:cs="Times New Roman"/>
+              <w:rFonts w:ascii="Arial" w:hAnsi="Arial" w:cs="Arial"/>
               <w:b/>
               <w:sz w:val="24"/>
               <w:szCs w:val="24"/>
@@ -2372,7 +3972,7 @@
           </w:pPr>
           <w:r>
             <w:rPr>
-              <w:rFonts w:ascii="Times New Roman" w:hAnsi="Times New Roman" w:cs="Times New Roman"/>
+              <w:rFonts w:ascii="Arial" w:hAnsi="Arial" w:cs="Arial"/>
               <w:b/>
               <w:sz w:val="24"/>
               <w:szCs w:val="24"/>
@@ -2383,7 +3983,7 @@
         <w:p>
           <w:pPr>
             <w:rPr>
-              <w:rFonts w:ascii="Times New Roman" w:hAnsi="Times New Roman" w:cs="Times New Roman"/>
+              <w:rFonts w:ascii="Arial" w:hAnsi="Arial" w:cs="Arial"/>
             </w:rPr>
           </w:pPr>
         </w:p>
@@ -2406,10 +4006,70 @@
             <w:rPr>
               <w:noProof/>
             </w:rPr>
+            <w:drawing>
+              <wp:anchor distT="0" distB="0" distL="114300" distR="114300" simplePos="0" relativeHeight="251658240" behindDoc="0" locked="0" layoutInCell="1" allowOverlap="1" wp14:anchorId="07201FEF" wp14:editId="4676FF63">
+                <wp:simplePos x="0" y="0"/>
+                <wp:positionH relativeFrom="column">
+                  <wp:posOffset>657225</wp:posOffset>
+                </wp:positionH>
+                <wp:positionV relativeFrom="paragraph">
+                  <wp:posOffset>-657860</wp:posOffset>
+                </wp:positionV>
+                <wp:extent cx="1493520" cy="1264920"/>
+                <wp:effectExtent l="0" t="0" r="0" b="0"/>
+                <wp:wrapNone/>
+                <wp:docPr id="3" name="Imagem 3"/>
+                <wp:cNvGraphicFramePr>
+                  <a:graphicFrameLocks xmlns:a="http://schemas.openxmlformats.org/drawingml/2006/main" noChangeAspect="1"/>
+                </wp:cNvGraphicFramePr>
+                <a:graphic xmlns:a="http://schemas.openxmlformats.org/drawingml/2006/main">
+                  <a:graphicData uri="http://schemas.openxmlformats.org/drawingml/2006/picture">
+                    <pic:pic xmlns:pic="http://schemas.openxmlformats.org/drawingml/2006/picture">
+                      <pic:nvPicPr>
+                        <pic:cNvPr id="3" name="Green_and_White_Bold_Cattle_Farm_Logo_(1).png"/>
+                        <pic:cNvPicPr/>
+                      </pic:nvPicPr>
+                      <pic:blipFill>
+                        <a:blip r:embed="rId1">
+                          <a:extLst>
+                            <a:ext uri="{28A0092B-C50C-407E-A947-70E740481C1C}">
+                              <a14:useLocalDpi xmlns:a14="http://schemas.microsoft.com/office/drawing/2010/main" val="0"/>
+                            </a:ext>
+                          </a:extLst>
+                        </a:blip>
+                        <a:stretch>
+                          <a:fillRect/>
+                        </a:stretch>
+                      </pic:blipFill>
+                      <pic:spPr>
+                        <a:xfrm>
+                          <a:off x="0" y="0"/>
+                          <a:ext cx="1493520" cy="1264920"/>
+                        </a:xfrm>
+                        <a:prstGeom prst="rect">
+                          <a:avLst/>
+                        </a:prstGeom>
+                      </pic:spPr>
+                    </pic:pic>
+                  </a:graphicData>
+                </a:graphic>
+                <wp14:sizeRelH relativeFrom="margin">
+                  <wp14:pctWidth>0</wp14:pctWidth>
+                </wp14:sizeRelH>
+                <wp14:sizeRelV relativeFrom="margin">
+                  <wp14:pctHeight>0</wp14:pctHeight>
+                </wp14:sizeRelV>
+              </wp:anchor>
+            </w:drawing>
+          </w:r>
+          <w:r>
+            <w:rPr>
+              <w:noProof/>
+            </w:rPr>
             <mc:AlternateContent>
               <mc:Choice Requires="wps">
                 <w:drawing>
-                  <wp:inline distT="0" distB="0" distL="0" distR="0" wp14:anchorId="081B1030" wp14:editId="1148A8A1">
+                  <wp:inline distT="0" distB="0" distL="0" distR="0" wp14:anchorId="081B1030" wp14:editId="2C9E1704">
                     <wp:extent cx="304800" cy="304800"/>
                     <wp:effectExtent l="0" t="0" r="0" b="0"/>
                     <wp:docPr id="1" name="Retângulo 1" descr="Green_Illustrated_Harvest_Hill_Logo.png"/>
@@ -2465,7 +4125,7 @@
               </mc:Choice>
               <mc:Fallback>
                 <w:pict>
-                  <v:rect w14:anchorId="1245E26D" id="Retângulo 1" o:spid="_x0000_s1026" alt="Green_Illustrated_Harvest_Hill_Logo.png" style="width:24pt;height:24pt;visibility:visible;mso-wrap-style:square;mso-left-percent:-10001;mso-top-percent:-10001;mso-position-horizontal:absolute;mso-position-horizontal-relative:char;mso-position-vertical:absolute;mso-position-vertical-relative:line;mso-left-percent:-10001;mso-top-percent:-10001;v-text-anchor:top" o:gfxdata="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" filled="f" stroked="f">
+                  <v:rect w14:anchorId="5E17EAA6" id="Retângulo 1" o:spid="_x0000_s1026" alt="Green_Illustrated_Harvest_Hill_Logo.png" style="width:24pt;height:24pt;visibility:visible;mso-wrap-style:square;mso-left-percent:-10001;mso-top-percent:-10001;mso-position-horizontal:absolute;mso-position-horizontal-relative:char;mso-position-vertical:absolute;mso-position-vertical-relative:line;mso-left-percent:-10001;mso-top-percent:-10001;v-text-anchor:top" o:gfxdata="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" filled="f" stroked="f">
                     <o:lock v:ext="edit" aspectratio="t"/>
                     <w10:anchorlock/>
                   </v:rect>
@@ -2484,6 +4144,537 @@
     </w:pPr>
   </w:p>
 </w:hdr>
+</file>
+
+<file path=word/numbering.xml><?xml version="1.0" encoding="utf-8"?>
+<w:numbering xmlns:wpc="http://schemas.microsoft.com/office/word/2010/wordprocessingCanvas" xmlns:cx="http://schemas.microsoft.com/office/drawing/2014/chartex" xmlns:cx1="http://schemas.microsoft.com/office/drawing/2015/9/8/chartex" xmlns:cx2="http://schemas.microsoft.com/office/drawing/2015/10/21/chartex" xmlns:cx3="http://schemas.microsoft.com/office/drawing/2016/5/9/chartex" xmlns:cx4="http://schemas.microsoft.com/office/drawing/2016/5/10/chartex" xmlns:cx5="http://schemas.microsoft.com/office/drawing/2016/5/11/chartex" xmlns:cx6="http://schemas.microsoft.com/office/drawing/2016/5/12/chartex" xmlns:cx7="http://schemas.microsoft.com/office/drawing/2016/5/13/chartex" xmlns:cx8="http://schemas.microsoft.com/office/drawing/2016/5/14/chartex" xmlns:mc="http://schemas.openxmlformats.org/markup-compatibility/2006" xmlns:aink="http://schemas.microsoft.com/office/drawing/2016/ink" xmlns:am3d="http://schemas.microsoft.com/office/drawing/2017/model3d" xmlns:o="urn:schemas-microsoft-com:office:office" xmlns:r="http://schemas.openxmlformats.org/officeDocument/2006/relationships" xmlns:m="http://schemas.openxmlformats.org/officeDocument/2006/math" xmlns:v="urn:schemas-microsoft-com:vml" xmlns:wp14="http://schemas.microsoft.com/office/word/2010/wordprocessingDrawing" xmlns:wp="http://schemas.openxmlformats.org/drawingml/2006/wordprocessingDrawing" xmlns:w10="urn:schemas-microsoft-com:office:word" xmlns:w="http://schemas.openxmlformats.org/wordprocessingml/2006/main" xmlns:w14="http://schemas.microsoft.com/office/word/2010/wordml" xmlns:w15="http://schemas.microsoft.com/office/word/2012/wordml" xmlns:w16cid="http://schemas.microsoft.com/office/word/2016/wordml/cid" xmlns:w16se="http://schemas.microsoft.com/office/word/2015/wordml/symex" xmlns:wpg="http://schemas.microsoft.com/office/word/2010/wordprocessingGroup" xmlns:wpi="http://schemas.microsoft.com/office/word/2010/wordprocessingInk" xmlns:wne="http://schemas.microsoft.com/office/word/2006/wordml" xmlns:wps="http://schemas.microsoft.com/office/word/2010/wordprocessingShape" mc:Ignorable="w14 w15 w16se w16cid wp14">
+  <w:abstractNum w:abstractNumId="0" w15:restartNumberingAfterBreak="0">
+    <w:nsid w:val="2FF87216"/>
+    <w:multiLevelType w:val="hybridMultilevel"/>
+    <w:tmpl w:val="F864D74E"/>
+    <w:lvl w:ilvl="0" w:tplc="04160001">
+      <w:start w:val="1"/>
+      <w:numFmt w:val="bullet"/>
+      <w:lvlText w:val=""/>
+      <w:lvlJc w:val="left"/>
+      <w:pPr>
+        <w:ind w:left="6325" w:hanging="360"/>
+      </w:pPr>
+      <w:rPr>
+        <w:rFonts w:ascii="Symbol" w:hAnsi="Symbol" w:hint="default"/>
+      </w:rPr>
+    </w:lvl>
+    <w:lvl w:ilvl="1" w:tplc="04160003" w:tentative="1">
+      <w:start w:val="1"/>
+      <w:numFmt w:val="bullet"/>
+      <w:lvlText w:val="o"/>
+      <w:lvlJc w:val="left"/>
+      <w:pPr>
+        <w:ind w:left="7045" w:hanging="360"/>
+      </w:pPr>
+      <w:rPr>
+        <w:rFonts w:ascii="Courier New" w:hAnsi="Courier New" w:cs="Courier New" w:hint="default"/>
+      </w:rPr>
+    </w:lvl>
+    <w:lvl w:ilvl="2" w:tplc="04160005" w:tentative="1">
+      <w:start w:val="1"/>
+      <w:numFmt w:val="bullet"/>
+      <w:lvlText w:val=""/>
+      <w:lvlJc w:val="left"/>
+      <w:pPr>
+        <w:ind w:left="7765" w:hanging="360"/>
+      </w:pPr>
+      <w:rPr>
+        <w:rFonts w:ascii="Wingdings" w:hAnsi="Wingdings" w:hint="default"/>
+      </w:rPr>
+    </w:lvl>
+    <w:lvl w:ilvl="3" w:tplc="04160001" w:tentative="1">
+      <w:start w:val="1"/>
+      <w:numFmt w:val="bullet"/>
+      <w:lvlText w:val=""/>
+      <w:lvlJc w:val="left"/>
+      <w:pPr>
+        <w:ind w:left="8485" w:hanging="360"/>
+      </w:pPr>
+      <w:rPr>
+        <w:rFonts w:ascii="Symbol" w:hAnsi="Symbol" w:hint="default"/>
+      </w:rPr>
+    </w:lvl>
+    <w:lvl w:ilvl="4" w:tplc="04160003" w:tentative="1">
+      <w:start w:val="1"/>
+      <w:numFmt w:val="bullet"/>
+      <w:lvlText w:val="o"/>
+      <w:lvlJc w:val="left"/>
+      <w:pPr>
+        <w:ind w:left="9205" w:hanging="360"/>
+      </w:pPr>
+      <w:rPr>
+        <w:rFonts w:ascii="Courier New" w:hAnsi="Courier New" w:cs="Courier New" w:hint="default"/>
+      </w:rPr>
+    </w:lvl>
+    <w:lvl w:ilvl="5" w:tplc="04160005" w:tentative="1">
+      <w:start w:val="1"/>
+      <w:numFmt w:val="bullet"/>
+      <w:lvlText w:val=""/>
+      <w:lvlJc w:val="left"/>
+      <w:pPr>
+        <w:ind w:left="9925" w:hanging="360"/>
+      </w:pPr>
+      <w:rPr>
+        <w:rFonts w:ascii="Wingdings" w:hAnsi="Wingdings" w:hint="default"/>
+      </w:rPr>
+    </w:lvl>
+    <w:lvl w:ilvl="6" w:tplc="04160001" w:tentative="1">
+      <w:start w:val="1"/>
+      <w:numFmt w:val="bullet"/>
+      <w:lvlText w:val=""/>
+      <w:lvlJc w:val="left"/>
+      <w:pPr>
+        <w:ind w:left="10645" w:hanging="360"/>
+      </w:pPr>
+      <w:rPr>
+        <w:rFonts w:ascii="Symbol" w:hAnsi="Symbol" w:hint="default"/>
+      </w:rPr>
+    </w:lvl>
+    <w:lvl w:ilvl="7" w:tplc="04160003" w:tentative="1">
+      <w:start w:val="1"/>
+      <w:numFmt w:val="bullet"/>
+      <w:lvlText w:val="o"/>
+      <w:lvlJc w:val="left"/>
+      <w:pPr>
+        <w:ind w:left="11365" w:hanging="360"/>
+      </w:pPr>
+      <w:rPr>
+        <w:rFonts w:ascii="Courier New" w:hAnsi="Courier New" w:cs="Courier New" w:hint="default"/>
+      </w:rPr>
+    </w:lvl>
+    <w:lvl w:ilvl="8" w:tplc="04160005" w:tentative="1">
+      <w:start w:val="1"/>
+      <w:numFmt w:val="bullet"/>
+      <w:lvlText w:val=""/>
+      <w:lvlJc w:val="left"/>
+      <w:pPr>
+        <w:ind w:left="12085" w:hanging="360"/>
+      </w:pPr>
+      <w:rPr>
+        <w:rFonts w:ascii="Wingdings" w:hAnsi="Wingdings" w:hint="default"/>
+      </w:rPr>
+    </w:lvl>
+  </w:abstractNum>
+  <w:abstractNum w:abstractNumId="1" w15:restartNumberingAfterBreak="0">
+    <w:nsid w:val="35484BEA"/>
+    <w:multiLevelType w:val="hybridMultilevel"/>
+    <w:tmpl w:val="89DADF76"/>
+    <w:lvl w:ilvl="0" w:tplc="04160001">
+      <w:start w:val="1"/>
+      <w:numFmt w:val="bullet"/>
+      <w:lvlText w:val=""/>
+      <w:lvlJc w:val="left"/>
+      <w:pPr>
+        <w:ind w:left="1440" w:hanging="360"/>
+      </w:pPr>
+      <w:rPr>
+        <w:rFonts w:ascii="Symbol" w:hAnsi="Symbol" w:hint="default"/>
+      </w:rPr>
+    </w:lvl>
+    <w:lvl w:ilvl="1" w:tplc="04160003" w:tentative="1">
+      <w:start w:val="1"/>
+      <w:numFmt w:val="bullet"/>
+      <w:lvlText w:val="o"/>
+      <w:lvlJc w:val="left"/>
+      <w:pPr>
+        <w:ind w:left="2160" w:hanging="360"/>
+      </w:pPr>
+      <w:rPr>
+        <w:rFonts w:ascii="Courier New" w:hAnsi="Courier New" w:cs="Courier New" w:hint="default"/>
+      </w:rPr>
+    </w:lvl>
+    <w:lvl w:ilvl="2" w:tplc="04160005" w:tentative="1">
+      <w:start w:val="1"/>
+      <w:numFmt w:val="bullet"/>
+      <w:lvlText w:val=""/>
+      <w:lvlJc w:val="left"/>
+      <w:pPr>
+        <w:ind w:left="2880" w:hanging="360"/>
+      </w:pPr>
+      <w:rPr>
+        <w:rFonts w:ascii="Wingdings" w:hAnsi="Wingdings" w:hint="default"/>
+      </w:rPr>
+    </w:lvl>
+    <w:lvl w:ilvl="3" w:tplc="04160001" w:tentative="1">
+      <w:start w:val="1"/>
+      <w:numFmt w:val="bullet"/>
+      <w:lvlText w:val=""/>
+      <w:lvlJc w:val="left"/>
+      <w:pPr>
+        <w:ind w:left="3600" w:hanging="360"/>
+      </w:pPr>
+      <w:rPr>
+        <w:rFonts w:ascii="Symbol" w:hAnsi="Symbol" w:hint="default"/>
+      </w:rPr>
+    </w:lvl>
+    <w:lvl w:ilvl="4" w:tplc="04160003" w:tentative="1">
+      <w:start w:val="1"/>
+      <w:numFmt w:val="bullet"/>
+      <w:lvlText w:val="o"/>
+      <w:lvlJc w:val="left"/>
+      <w:pPr>
+        <w:ind w:left="4320" w:hanging="360"/>
+      </w:pPr>
+      <w:rPr>
+        <w:rFonts w:ascii="Courier New" w:hAnsi="Courier New" w:cs="Courier New" w:hint="default"/>
+      </w:rPr>
+    </w:lvl>
+    <w:lvl w:ilvl="5" w:tplc="04160005" w:tentative="1">
+      <w:start w:val="1"/>
+      <w:numFmt w:val="bullet"/>
+      <w:lvlText w:val=""/>
+      <w:lvlJc w:val="left"/>
+      <w:pPr>
+        <w:ind w:left="5040" w:hanging="360"/>
+      </w:pPr>
+      <w:rPr>
+        <w:rFonts w:ascii="Wingdings" w:hAnsi="Wingdings" w:hint="default"/>
+      </w:rPr>
+    </w:lvl>
+    <w:lvl w:ilvl="6" w:tplc="04160001" w:tentative="1">
+      <w:start w:val="1"/>
+      <w:numFmt w:val="bullet"/>
+      <w:lvlText w:val=""/>
+      <w:lvlJc w:val="left"/>
+      <w:pPr>
+        <w:ind w:left="5760" w:hanging="360"/>
+      </w:pPr>
+      <w:rPr>
+        <w:rFonts w:ascii="Symbol" w:hAnsi="Symbol" w:hint="default"/>
+      </w:rPr>
+    </w:lvl>
+    <w:lvl w:ilvl="7" w:tplc="04160003" w:tentative="1">
+      <w:start w:val="1"/>
+      <w:numFmt w:val="bullet"/>
+      <w:lvlText w:val="o"/>
+      <w:lvlJc w:val="left"/>
+      <w:pPr>
+        <w:ind w:left="6480" w:hanging="360"/>
+      </w:pPr>
+      <w:rPr>
+        <w:rFonts w:ascii="Courier New" w:hAnsi="Courier New" w:cs="Courier New" w:hint="default"/>
+      </w:rPr>
+    </w:lvl>
+    <w:lvl w:ilvl="8" w:tplc="04160005" w:tentative="1">
+      <w:start w:val="1"/>
+      <w:numFmt w:val="bullet"/>
+      <w:lvlText w:val=""/>
+      <w:lvlJc w:val="left"/>
+      <w:pPr>
+        <w:ind w:left="7200" w:hanging="360"/>
+      </w:pPr>
+      <w:rPr>
+        <w:rFonts w:ascii="Wingdings" w:hAnsi="Wingdings" w:hint="default"/>
+      </w:rPr>
+    </w:lvl>
+  </w:abstractNum>
+  <w:abstractNum w:abstractNumId="2" w15:restartNumberingAfterBreak="0">
+    <w:nsid w:val="45AC2AA1"/>
+    <w:multiLevelType w:val="hybridMultilevel"/>
+    <w:tmpl w:val="38380AF8"/>
+    <w:lvl w:ilvl="0" w:tplc="04160001">
+      <w:start w:val="1"/>
+      <w:numFmt w:val="bullet"/>
+      <w:lvlText w:val=""/>
+      <w:lvlJc w:val="left"/>
+      <w:pPr>
+        <w:ind w:left="1440" w:hanging="360"/>
+      </w:pPr>
+      <w:rPr>
+        <w:rFonts w:ascii="Symbol" w:hAnsi="Symbol" w:hint="default"/>
+      </w:rPr>
+    </w:lvl>
+    <w:lvl w:ilvl="1" w:tplc="04160003" w:tentative="1">
+      <w:start w:val="1"/>
+      <w:numFmt w:val="bullet"/>
+      <w:lvlText w:val="o"/>
+      <w:lvlJc w:val="left"/>
+      <w:pPr>
+        <w:ind w:left="2160" w:hanging="360"/>
+      </w:pPr>
+      <w:rPr>
+        <w:rFonts w:ascii="Courier New" w:hAnsi="Courier New" w:cs="Courier New" w:hint="default"/>
+      </w:rPr>
+    </w:lvl>
+    <w:lvl w:ilvl="2" w:tplc="04160005" w:tentative="1">
+      <w:start w:val="1"/>
+      <w:numFmt w:val="bullet"/>
+      <w:lvlText w:val=""/>
+      <w:lvlJc w:val="left"/>
+      <w:pPr>
+        <w:ind w:left="2880" w:hanging="360"/>
+      </w:pPr>
+      <w:rPr>
+        <w:rFonts w:ascii="Wingdings" w:hAnsi="Wingdings" w:hint="default"/>
+      </w:rPr>
+    </w:lvl>
+    <w:lvl w:ilvl="3" w:tplc="04160001" w:tentative="1">
+      <w:start w:val="1"/>
+      <w:numFmt w:val="bullet"/>
+      <w:lvlText w:val=""/>
+      <w:lvlJc w:val="left"/>
+      <w:pPr>
+        <w:ind w:left="3600" w:hanging="360"/>
+      </w:pPr>
+      <w:rPr>
+        <w:rFonts w:ascii="Symbol" w:hAnsi="Symbol" w:hint="default"/>
+      </w:rPr>
+    </w:lvl>
+    <w:lvl w:ilvl="4" w:tplc="04160003" w:tentative="1">
+      <w:start w:val="1"/>
+      <w:numFmt w:val="bullet"/>
+      <w:lvlText w:val="o"/>
+      <w:lvlJc w:val="left"/>
+      <w:pPr>
+        <w:ind w:left="4320" w:hanging="360"/>
+      </w:pPr>
+      <w:rPr>
+        <w:rFonts w:ascii="Courier New" w:hAnsi="Courier New" w:cs="Courier New" w:hint="default"/>
+      </w:rPr>
+    </w:lvl>
+    <w:lvl w:ilvl="5" w:tplc="04160005" w:tentative="1">
+      <w:start w:val="1"/>
+      <w:numFmt w:val="bullet"/>
+      <w:lvlText w:val=""/>
+      <w:lvlJc w:val="left"/>
+      <w:pPr>
+        <w:ind w:left="5040" w:hanging="360"/>
+      </w:pPr>
+      <w:rPr>
+        <w:rFonts w:ascii="Wingdings" w:hAnsi="Wingdings" w:hint="default"/>
+      </w:rPr>
+    </w:lvl>
+    <w:lvl w:ilvl="6" w:tplc="04160001" w:tentative="1">
+      <w:start w:val="1"/>
+      <w:numFmt w:val="bullet"/>
+      <w:lvlText w:val=""/>
+      <w:lvlJc w:val="left"/>
+      <w:pPr>
+        <w:ind w:left="5760" w:hanging="360"/>
+      </w:pPr>
+      <w:rPr>
+        <w:rFonts w:ascii="Symbol" w:hAnsi="Symbol" w:hint="default"/>
+      </w:rPr>
+    </w:lvl>
+    <w:lvl w:ilvl="7" w:tplc="04160003" w:tentative="1">
+      <w:start w:val="1"/>
+      <w:numFmt w:val="bullet"/>
+      <w:lvlText w:val="o"/>
+      <w:lvlJc w:val="left"/>
+      <w:pPr>
+        <w:ind w:left="6480" w:hanging="360"/>
+      </w:pPr>
+      <w:rPr>
+        <w:rFonts w:ascii="Courier New" w:hAnsi="Courier New" w:cs="Courier New" w:hint="default"/>
+      </w:rPr>
+    </w:lvl>
+    <w:lvl w:ilvl="8" w:tplc="04160005" w:tentative="1">
+      <w:start w:val="1"/>
+      <w:numFmt w:val="bullet"/>
+      <w:lvlText w:val=""/>
+      <w:lvlJc w:val="left"/>
+      <w:pPr>
+        <w:ind w:left="7200" w:hanging="360"/>
+      </w:pPr>
+      <w:rPr>
+        <w:rFonts w:ascii="Wingdings" w:hAnsi="Wingdings" w:hint="default"/>
+      </w:rPr>
+    </w:lvl>
+  </w:abstractNum>
+  <w:abstractNum w:abstractNumId="3" w15:restartNumberingAfterBreak="0">
+    <w:nsid w:val="53C61F3D"/>
+    <w:multiLevelType w:val="hybridMultilevel"/>
+    <w:tmpl w:val="60C25782"/>
+    <w:lvl w:ilvl="0" w:tplc="0416000F">
+      <w:start w:val="1"/>
+      <w:numFmt w:val="decimal"/>
+      <w:lvlText w:val="%1."/>
+      <w:lvlJc w:val="left"/>
+      <w:pPr>
+        <w:ind w:left="1429" w:hanging="360"/>
+      </w:pPr>
+    </w:lvl>
+    <w:lvl w:ilvl="1" w:tplc="04160019" w:tentative="1">
+      <w:start w:val="1"/>
+      <w:numFmt w:val="lowerLetter"/>
+      <w:lvlText w:val="%2."/>
+      <w:lvlJc w:val="left"/>
+      <w:pPr>
+        <w:ind w:left="2149" w:hanging="360"/>
+      </w:pPr>
+    </w:lvl>
+    <w:lvl w:ilvl="2" w:tplc="0416001B" w:tentative="1">
+      <w:start w:val="1"/>
+      <w:numFmt w:val="lowerRoman"/>
+      <w:lvlText w:val="%3."/>
+      <w:lvlJc w:val="right"/>
+      <w:pPr>
+        <w:ind w:left="2869" w:hanging="180"/>
+      </w:pPr>
+    </w:lvl>
+    <w:lvl w:ilvl="3" w:tplc="0416000F" w:tentative="1">
+      <w:start w:val="1"/>
+      <w:numFmt w:val="decimal"/>
+      <w:lvlText w:val="%4."/>
+      <w:lvlJc w:val="left"/>
+      <w:pPr>
+        <w:ind w:left="3589" w:hanging="360"/>
+      </w:pPr>
+    </w:lvl>
+    <w:lvl w:ilvl="4" w:tplc="04160019" w:tentative="1">
+      <w:start w:val="1"/>
+      <w:numFmt w:val="lowerLetter"/>
+      <w:lvlText w:val="%5."/>
+      <w:lvlJc w:val="left"/>
+      <w:pPr>
+        <w:ind w:left="4309" w:hanging="360"/>
+      </w:pPr>
+    </w:lvl>
+    <w:lvl w:ilvl="5" w:tplc="0416001B" w:tentative="1">
+      <w:start w:val="1"/>
+      <w:numFmt w:val="lowerRoman"/>
+      <w:lvlText w:val="%6."/>
+      <w:lvlJc w:val="right"/>
+      <w:pPr>
+        <w:ind w:left="5029" w:hanging="180"/>
+      </w:pPr>
+    </w:lvl>
+    <w:lvl w:ilvl="6" w:tplc="0416000F" w:tentative="1">
+      <w:start w:val="1"/>
+      <w:numFmt w:val="decimal"/>
+      <w:lvlText w:val="%7."/>
+      <w:lvlJc w:val="left"/>
+      <w:pPr>
+        <w:ind w:left="5749" w:hanging="360"/>
+      </w:pPr>
+    </w:lvl>
+    <w:lvl w:ilvl="7" w:tplc="04160019" w:tentative="1">
+      <w:start w:val="1"/>
+      <w:numFmt w:val="lowerLetter"/>
+      <w:lvlText w:val="%8."/>
+      <w:lvlJc w:val="left"/>
+      <w:pPr>
+        <w:ind w:left="6469" w:hanging="360"/>
+      </w:pPr>
+    </w:lvl>
+    <w:lvl w:ilvl="8" w:tplc="0416001B" w:tentative="1">
+      <w:start w:val="1"/>
+      <w:numFmt w:val="lowerRoman"/>
+      <w:lvlText w:val="%9."/>
+      <w:lvlJc w:val="right"/>
+      <w:pPr>
+        <w:ind w:left="7189" w:hanging="180"/>
+      </w:pPr>
+    </w:lvl>
+  </w:abstractNum>
+  <w:abstractNum w:abstractNumId="4" w15:restartNumberingAfterBreak="0">
+    <w:nsid w:val="651947C9"/>
+    <w:multiLevelType w:val="hybridMultilevel"/>
+    <w:tmpl w:val="BC42C6E0"/>
+    <w:lvl w:ilvl="0" w:tplc="0416000F">
+      <w:start w:val="1"/>
+      <w:numFmt w:val="decimal"/>
+      <w:lvlText w:val="%1."/>
+      <w:lvlJc w:val="left"/>
+      <w:pPr>
+        <w:ind w:left="720" w:hanging="360"/>
+      </w:pPr>
+    </w:lvl>
+    <w:lvl w:ilvl="1" w:tplc="04160019" w:tentative="1">
+      <w:start w:val="1"/>
+      <w:numFmt w:val="lowerLetter"/>
+      <w:lvlText w:val="%2."/>
+      <w:lvlJc w:val="left"/>
+      <w:pPr>
+        <w:ind w:left="1440" w:hanging="360"/>
+      </w:pPr>
+    </w:lvl>
+    <w:lvl w:ilvl="2" w:tplc="0416001B" w:tentative="1">
+      <w:start w:val="1"/>
+      <w:numFmt w:val="lowerRoman"/>
+      <w:lvlText w:val="%3."/>
+      <w:lvlJc w:val="right"/>
+      <w:pPr>
+        <w:ind w:left="2160" w:hanging="180"/>
+      </w:pPr>
+    </w:lvl>
+    <w:lvl w:ilvl="3" w:tplc="0416000F" w:tentative="1">
+      <w:start w:val="1"/>
+      <w:numFmt w:val="decimal"/>
+      <w:lvlText w:val="%4."/>
+      <w:lvlJc w:val="left"/>
+      <w:pPr>
+        <w:ind w:left="2880" w:hanging="360"/>
+      </w:pPr>
+    </w:lvl>
+    <w:lvl w:ilvl="4" w:tplc="04160019" w:tentative="1">
+      <w:start w:val="1"/>
+      <w:numFmt w:val="lowerLetter"/>
+      <w:lvlText w:val="%5."/>
+      <w:lvlJc w:val="left"/>
+      <w:pPr>
+        <w:ind w:left="3600" w:hanging="360"/>
+      </w:pPr>
+    </w:lvl>
+    <w:lvl w:ilvl="5" w:tplc="0416001B" w:tentative="1">
+      <w:start w:val="1"/>
+      <w:numFmt w:val="lowerRoman"/>
+      <w:lvlText w:val="%6."/>
+      <w:lvlJc w:val="right"/>
+      <w:pPr>
+        <w:ind w:left="4320" w:hanging="180"/>
+      </w:pPr>
+    </w:lvl>
+    <w:lvl w:ilvl="6" w:tplc="0416000F" w:tentative="1">
+      <w:start w:val="1"/>
+      <w:numFmt w:val="decimal"/>
+      <w:lvlText w:val="%7."/>
+      <w:lvlJc w:val="left"/>
+      <w:pPr>
+        <w:ind w:left="5040" w:hanging="360"/>
+      </w:pPr>
+    </w:lvl>
+    <w:lvl w:ilvl="7" w:tplc="04160019" w:tentative="1">
+      <w:start w:val="1"/>
+      <w:numFmt w:val="lowerLetter"/>
+      <w:lvlText w:val="%8."/>
+      <w:lvlJc w:val="left"/>
+      <w:pPr>
+        <w:ind w:left="5760" w:hanging="360"/>
+      </w:pPr>
+    </w:lvl>
+    <w:lvl w:ilvl="8" w:tplc="0416001B" w:tentative="1">
+      <w:start w:val="1"/>
+      <w:numFmt w:val="lowerRoman"/>
+      <w:lvlText w:val="%9."/>
+      <w:lvlJc w:val="right"/>
+      <w:pPr>
+        <w:ind w:left="6480" w:hanging="180"/>
+      </w:pPr>
+    </w:lvl>
+  </w:abstractNum>
+  <w:num w:numId="1">
+    <w:abstractNumId w:val="4"/>
+  </w:num>
+  <w:num w:numId="2">
+    <w:abstractNumId w:val="1"/>
+  </w:num>
+  <w:num w:numId="3">
+    <w:abstractNumId w:val="0"/>
+  </w:num>
+  <w:num w:numId="4">
+    <w:abstractNumId w:val="2"/>
+  </w:num>
+  <w:num w:numId="5">
+    <w:abstractNumId w:val="3"/>
+  </w:num>
+</w:numbering>
 </file>
 
 <file path=word/styles.xml><?xml version="1.0" encoding="utf-8"?>
@@ -2992,6 +5183,17 @@
     <w:uiPriority w:val="99"/>
     <w:rsid w:val="0010066A"/>
   </w:style>
+  <w:style w:type="paragraph" w:styleId="PargrafodaLista">
+    <w:name w:val="List Paragraph"/>
+    <w:basedOn w:val="Normal"/>
+    <w:uiPriority w:val="34"/>
+    <w:qFormat/>
+    <w:rsid w:val="00B05FD6"/>
+    <w:pPr>
+      <w:ind w:left="720"/>
+      <w:contextualSpacing/>
+    </w:pPr>
+  </w:style>
 </w:styles>
 </file>
 

</xml_diff>

<commit_message>
Doc: Alteração nos erros do escopo
</commit_message>
<xml_diff>
--- a/Declação do Escopo.docx
+++ b/Declação do Escopo.docx
@@ -1735,16 +1735,12 @@
         </w:rPr>
       </w:pPr>
       <w:r>
-        <w:rPr>
-          <w:rFonts w:ascii="Arial" w:hAnsi="Arial" w:cs="Arial"/>
-          <w:b/>
-          <w:noProof/>
-        </w:rPr>
+        <w:lastRenderedPageBreak/>
         <w:drawing>
-          <wp:inline distT="0" distB="0" distL="0" distR="0" wp14:anchorId="6E288727" wp14:editId="0872589A">
-            <wp:extent cx="3329940" cy="4175760"/>
-            <wp:effectExtent l="0" t="0" r="3810" b="0"/>
-            <wp:docPr id="4" name="Imagem 4"/>
+          <wp:inline distT="0" distB="0" distL="0" distR="0" wp14:anchorId="374E9DD3" wp14:editId="5D2E02C9">
+            <wp:extent cx="4002642" cy="6675120"/>
+            <wp:effectExtent l="0" t="0" r="0" b="0"/>
+            <wp:docPr id="8" name="Imagem 8"/>
             <wp:cNvGraphicFramePr>
               <a:graphicFrameLocks xmlns:a="http://schemas.openxmlformats.org/drawingml/2006/main" noChangeAspect="1"/>
             </wp:cNvGraphicFramePr>
@@ -1752,8 +1748,10 @@
               <a:graphicData uri="http://schemas.openxmlformats.org/drawingml/2006/picture">
                 <pic:pic xmlns:pic="http://schemas.openxmlformats.org/drawingml/2006/picture">
                   <pic:nvPicPr>
-                    <pic:cNvPr id="4" name="Captura de tela 2026-02-03 071657.png"/>
-                    <pic:cNvPicPr/>
+                    <pic:cNvPr id="0" name="Picture 1"/>
+                    <pic:cNvPicPr>
+                      <a:picLocks noChangeAspect="1" noChangeArrowheads="1"/>
+                    </pic:cNvPicPr>
                   </pic:nvPicPr>
                   <pic:blipFill>
                     <a:blip r:embed="rId7">
@@ -1763,18 +1761,23 @@
                         </a:ext>
                       </a:extLst>
                     </a:blip>
+                    <a:srcRect/>
                     <a:stretch>
                       <a:fillRect/>
                     </a:stretch>
                   </pic:blipFill>
-                  <pic:spPr>
+                  <pic:spPr bwMode="auto">
                     <a:xfrm>
                       <a:off x="0" y="0"/>
-                      <a:ext cx="3330430" cy="4176374"/>
+                      <a:ext cx="4010622" cy="6688429"/>
                     </a:xfrm>
                     <a:prstGeom prst="rect">
                       <a:avLst/>
                     </a:prstGeom>
+                    <a:noFill/>
+                    <a:ln>
+                      <a:noFill/>
+                    </a:ln>
                   </pic:spPr>
                 </pic:pic>
               </a:graphicData>
@@ -1864,6 +1867,7 @@
           <w:b/>
           <w:noProof/>
         </w:rPr>
+        <w:lastRenderedPageBreak/>
         <w:drawing>
           <wp:inline distT="0" distB="0" distL="0" distR="0" wp14:anchorId="06EAD1F7" wp14:editId="53D2201E">
             <wp:extent cx="3360420" cy="3573145"/>
@@ -1914,8 +1918,7 @@
         <w:jc w:val="both"/>
         <w:rPr>
           <w:rFonts w:ascii="Arial" w:hAnsi="Arial" w:cs="Arial"/>
-          <w:sz w:val="18"/>
-          <w:szCs w:val="18"/>
+          <w:b/>
         </w:rPr>
       </w:pPr>
       <w:r>
@@ -2078,69 +2081,2590 @@
         <w:t>Cronograma</w:t>
       </w:r>
     </w:p>
+    <w:tbl>
+      <w:tblPr>
+        <w:tblW w:w="8360" w:type="dxa"/>
+        <w:tblCellMar>
+          <w:left w:w="70" w:type="dxa"/>
+          <w:right w:w="70" w:type="dxa"/>
+        </w:tblCellMar>
+        <w:tblLook w:val="04A0" w:firstRow="1" w:lastRow="0" w:firstColumn="1" w:lastColumn="0" w:noHBand="0" w:noVBand="1"/>
+      </w:tblPr>
+      <w:tblGrid>
+        <w:gridCol w:w="5791"/>
+        <w:gridCol w:w="1301"/>
+        <w:gridCol w:w="632"/>
+        <w:gridCol w:w="682"/>
+      </w:tblGrid>
+      <w:tr>
+        <w:trPr>
+          <w:trHeight w:val="288"/>
+        </w:trPr>
+        <w:tc>
+          <w:tcPr>
+            <w:tcW w:w="8360" w:type="dxa"/>
+            <w:gridSpan w:val="4"/>
+            <w:tcBorders>
+              <w:top w:val="single" w:sz="4" w:space="0" w:color="auto"/>
+              <w:left w:val="single" w:sz="4" w:space="0" w:color="auto"/>
+              <w:bottom w:val="single" w:sz="4" w:space="0" w:color="auto"/>
+              <w:right w:val="single" w:sz="4" w:space="0" w:color="auto"/>
+            </w:tcBorders>
+            <w:shd w:val="clear" w:color="000000" w:fill="74F87A"/>
+            <w:noWrap/>
+            <w:vAlign w:val="bottom"/>
+            <w:hideMark/>
+          </w:tcPr>
+          <w:p>
+            <w:pPr>
+              <w:spacing w:after="0" w:line="240" w:lineRule="auto"/>
+              <w:jc w:val="center"/>
+              <w:rPr>
+                <w:rFonts w:ascii="Calibri" w:eastAsia="Times New Roman" w:hAnsi="Calibri" w:cs="Calibri"/>
+                <w:b/>
+                <w:bCs/>
+                <w:color w:val="000000"/>
+                <w:lang w:eastAsia="pt-BR"/>
+              </w:rPr>
+            </w:pPr>
+            <w:r>
+              <w:rPr>
+                <w:rFonts w:ascii="Calibri" w:eastAsia="Times New Roman" w:hAnsi="Calibri" w:cs="Calibri"/>
+                <w:b/>
+                <w:bCs/>
+                <w:color w:val="000000"/>
+                <w:lang w:eastAsia="pt-BR"/>
+              </w:rPr>
+              <w:lastRenderedPageBreak/>
+              <w:t>CRONOGRAMA</w:t>
+            </w:r>
+          </w:p>
+        </w:tc>
+      </w:tr>
+      <w:tr>
+        <w:trPr>
+          <w:trHeight w:val="288"/>
+        </w:trPr>
+        <w:tc>
+          <w:tcPr>
+            <w:tcW w:w="5791" w:type="dxa"/>
+            <w:tcBorders>
+              <w:top w:val="nil"/>
+              <w:left w:val="single" w:sz="4" w:space="0" w:color="auto"/>
+              <w:bottom w:val="single" w:sz="4" w:space="0" w:color="auto"/>
+              <w:right w:val="single" w:sz="4" w:space="0" w:color="auto"/>
+            </w:tcBorders>
+            <w:shd w:val="clear" w:color="000000" w:fill="C6E0B4"/>
+            <w:noWrap/>
+            <w:vAlign w:val="bottom"/>
+            <w:hideMark/>
+          </w:tcPr>
+          <w:p>
+            <w:pPr>
+              <w:spacing w:after="0" w:line="240" w:lineRule="auto"/>
+              <w:jc w:val="center"/>
+              <w:rPr>
+                <w:rFonts w:ascii="Calibri" w:eastAsia="Times New Roman" w:hAnsi="Calibri" w:cs="Calibri"/>
+                <w:b/>
+                <w:bCs/>
+                <w:color w:val="000000"/>
+                <w:lang w:eastAsia="pt-BR"/>
+              </w:rPr>
+            </w:pPr>
+            <w:r>
+              <w:rPr>
+                <w:rFonts w:ascii="Calibri" w:eastAsia="Times New Roman" w:hAnsi="Calibri" w:cs="Calibri"/>
+                <w:b/>
+                <w:bCs/>
+                <w:color w:val="000000"/>
+                <w:lang w:eastAsia="pt-BR"/>
+              </w:rPr>
+              <w:t>PLANEJAMENTO ATIVIDADES</w:t>
+            </w:r>
+          </w:p>
+        </w:tc>
+        <w:tc>
+          <w:tcPr>
+            <w:tcW w:w="1301" w:type="dxa"/>
+            <w:tcBorders>
+              <w:top w:val="nil"/>
+              <w:left w:val="nil"/>
+              <w:bottom w:val="single" w:sz="4" w:space="0" w:color="auto"/>
+              <w:right w:val="single" w:sz="4" w:space="0" w:color="auto"/>
+            </w:tcBorders>
+            <w:shd w:val="clear" w:color="000000" w:fill="C6E0B4"/>
+            <w:noWrap/>
+            <w:vAlign w:val="bottom"/>
+            <w:hideMark/>
+          </w:tcPr>
+          <w:p>
+            <w:pPr>
+              <w:spacing w:after="0" w:line="240" w:lineRule="auto"/>
+              <w:jc w:val="center"/>
+              <w:rPr>
+                <w:rFonts w:ascii="Calibri" w:eastAsia="Times New Roman" w:hAnsi="Calibri" w:cs="Calibri"/>
+                <w:b/>
+                <w:bCs/>
+                <w:color w:val="000000"/>
+                <w:lang w:eastAsia="pt-BR"/>
+              </w:rPr>
+            </w:pPr>
+            <w:r>
+              <w:rPr>
+                <w:rFonts w:ascii="Calibri" w:eastAsia="Times New Roman" w:hAnsi="Calibri" w:cs="Calibri"/>
+                <w:b/>
+                <w:bCs/>
+                <w:color w:val="000000"/>
+                <w:lang w:eastAsia="pt-BR"/>
+              </w:rPr>
+              <w:t>STATUS</w:t>
+            </w:r>
+          </w:p>
+        </w:tc>
+        <w:tc>
+          <w:tcPr>
+            <w:tcW w:w="605" w:type="dxa"/>
+            <w:tcBorders>
+              <w:top w:val="nil"/>
+              <w:left w:val="nil"/>
+              <w:bottom w:val="single" w:sz="4" w:space="0" w:color="auto"/>
+              <w:right w:val="single" w:sz="4" w:space="0" w:color="auto"/>
+            </w:tcBorders>
+            <w:shd w:val="clear" w:color="000000" w:fill="C6E0B4"/>
+            <w:noWrap/>
+            <w:vAlign w:val="bottom"/>
+            <w:hideMark/>
+          </w:tcPr>
+          <w:p>
+            <w:pPr>
+              <w:spacing w:after="0" w:line="240" w:lineRule="auto"/>
+              <w:jc w:val="center"/>
+              <w:rPr>
+                <w:rFonts w:ascii="Calibri" w:eastAsia="Times New Roman" w:hAnsi="Calibri" w:cs="Calibri"/>
+                <w:b/>
+                <w:bCs/>
+                <w:color w:val="000000"/>
+                <w:lang w:eastAsia="pt-BR"/>
+              </w:rPr>
+            </w:pPr>
+            <w:r>
+              <w:rPr>
+                <w:rFonts w:ascii="Calibri" w:eastAsia="Times New Roman" w:hAnsi="Calibri" w:cs="Calibri"/>
+                <w:b/>
+                <w:bCs/>
+                <w:color w:val="000000"/>
+                <w:lang w:eastAsia="pt-BR"/>
+              </w:rPr>
+              <w:t>%</w:t>
+            </w:r>
+          </w:p>
+        </w:tc>
+        <w:tc>
+          <w:tcPr>
+            <w:tcW w:w="663" w:type="dxa"/>
+            <w:tcBorders>
+              <w:top w:val="nil"/>
+              <w:left w:val="nil"/>
+              <w:bottom w:val="single" w:sz="4" w:space="0" w:color="auto"/>
+              <w:right w:val="single" w:sz="4" w:space="0" w:color="auto"/>
+            </w:tcBorders>
+            <w:shd w:val="clear" w:color="000000" w:fill="C6E0B4"/>
+            <w:noWrap/>
+            <w:vAlign w:val="bottom"/>
+            <w:hideMark/>
+          </w:tcPr>
+          <w:p>
+            <w:pPr>
+              <w:spacing w:after="0" w:line="240" w:lineRule="auto"/>
+              <w:jc w:val="center"/>
+              <w:rPr>
+                <w:rFonts w:ascii="Calibri" w:eastAsia="Times New Roman" w:hAnsi="Calibri" w:cs="Calibri"/>
+                <w:b/>
+                <w:bCs/>
+                <w:color w:val="000000"/>
+                <w:lang w:eastAsia="pt-BR"/>
+              </w:rPr>
+            </w:pPr>
+            <w:r>
+              <w:rPr>
+                <w:rFonts w:ascii="Calibri" w:eastAsia="Times New Roman" w:hAnsi="Calibri" w:cs="Calibri"/>
+                <w:b/>
+                <w:bCs/>
+                <w:color w:val="000000"/>
+                <w:lang w:eastAsia="pt-BR"/>
+              </w:rPr>
+              <w:t>META</w:t>
+            </w:r>
+          </w:p>
+        </w:tc>
+      </w:tr>
+      <w:tr>
+        <w:trPr>
+          <w:trHeight w:val="288"/>
+        </w:trPr>
+        <w:tc>
+          <w:tcPr>
+            <w:tcW w:w="8360" w:type="dxa"/>
+            <w:gridSpan w:val="4"/>
+            <w:tcBorders>
+              <w:top w:val="single" w:sz="4" w:space="0" w:color="auto"/>
+              <w:left w:val="single" w:sz="4" w:space="0" w:color="auto"/>
+              <w:bottom w:val="single" w:sz="4" w:space="0" w:color="auto"/>
+              <w:right w:val="single" w:sz="4" w:space="0" w:color="auto"/>
+            </w:tcBorders>
+            <w:shd w:val="clear" w:color="000000" w:fill="FEFC9C"/>
+            <w:noWrap/>
+            <w:vAlign w:val="bottom"/>
+            <w:hideMark/>
+          </w:tcPr>
+          <w:p>
+            <w:pPr>
+              <w:spacing w:after="0" w:line="240" w:lineRule="auto"/>
+              <w:jc w:val="center"/>
+              <w:rPr>
+                <w:rFonts w:ascii="Calibri" w:eastAsia="Times New Roman" w:hAnsi="Calibri" w:cs="Calibri"/>
+                <w:b/>
+                <w:bCs/>
+                <w:color w:val="000000"/>
+                <w:lang w:eastAsia="pt-BR"/>
+              </w:rPr>
+            </w:pPr>
+            <w:r>
+              <w:rPr>
+                <w:rFonts w:ascii="Calibri" w:eastAsia="Times New Roman" w:hAnsi="Calibri" w:cs="Calibri"/>
+                <w:b/>
+                <w:bCs/>
+                <w:color w:val="000000"/>
+                <w:lang w:eastAsia="pt-BR"/>
+              </w:rPr>
+              <w:t>SPRINT 01</w:t>
+            </w:r>
+          </w:p>
+        </w:tc>
+      </w:tr>
+      <w:tr>
+        <w:trPr>
+          <w:trHeight w:val="288"/>
+        </w:trPr>
+        <w:tc>
+          <w:tcPr>
+            <w:tcW w:w="5791" w:type="dxa"/>
+            <w:tcBorders>
+              <w:top w:val="nil"/>
+              <w:left w:val="single" w:sz="4" w:space="0" w:color="auto"/>
+              <w:bottom w:val="single" w:sz="4" w:space="0" w:color="auto"/>
+              <w:right w:val="single" w:sz="4" w:space="0" w:color="auto"/>
+            </w:tcBorders>
+            <w:shd w:val="clear" w:color="auto" w:fill="auto"/>
+            <w:noWrap/>
+            <w:vAlign w:val="bottom"/>
+            <w:hideMark/>
+          </w:tcPr>
+          <w:p>
+            <w:pPr>
+              <w:spacing w:after="0" w:line="240" w:lineRule="auto"/>
+              <w:rPr>
+                <w:rFonts w:ascii="Calibri" w:eastAsia="Times New Roman" w:hAnsi="Calibri" w:cs="Calibri"/>
+                <w:color w:val="000000"/>
+                <w:lang w:eastAsia="pt-BR"/>
+              </w:rPr>
+            </w:pPr>
+            <w:r>
+              <w:rPr>
+                <w:rFonts w:ascii="Calibri" w:eastAsia="Times New Roman" w:hAnsi="Calibri" w:cs="Calibri"/>
+                <w:color w:val="000000"/>
+                <w:lang w:eastAsia="pt-BR"/>
+              </w:rPr>
+              <w:t xml:space="preserve">Levantamento de requisitos </w:t>
+            </w:r>
+          </w:p>
+        </w:tc>
+        <w:tc>
+          <w:tcPr>
+            <w:tcW w:w="1301" w:type="dxa"/>
+            <w:tcBorders>
+              <w:top w:val="single" w:sz="4" w:space="0" w:color="auto"/>
+              <w:left w:val="single" w:sz="4" w:space="0" w:color="auto"/>
+              <w:bottom w:val="single" w:sz="4" w:space="0" w:color="auto"/>
+              <w:right w:val="single" w:sz="4" w:space="0" w:color="auto"/>
+            </w:tcBorders>
+            <w:shd w:val="clear" w:color="000000" w:fill="C6E0B4"/>
+            <w:noWrap/>
+            <w:vAlign w:val="center"/>
+            <w:hideMark/>
+          </w:tcPr>
+          <w:p>
+            <w:pPr>
+              <w:spacing w:after="0" w:line="240" w:lineRule="auto"/>
+              <w:jc w:val="center"/>
+              <w:rPr>
+                <w:rFonts w:ascii="Calibri" w:eastAsia="Times New Roman" w:hAnsi="Calibri" w:cs="Calibri"/>
+                <w:color w:val="375623"/>
+                <w:lang w:eastAsia="pt-BR"/>
+              </w:rPr>
+            </w:pPr>
+            <w:r>
+              <w:rPr>
+                <w:rFonts w:ascii="Calibri" w:eastAsia="Times New Roman" w:hAnsi="Calibri" w:cs="Calibri"/>
+                <w:color w:val="375623"/>
+                <w:lang w:eastAsia="pt-BR"/>
+              </w:rPr>
+              <w:t xml:space="preserve">CONCLUIDO </w:t>
+            </w:r>
+          </w:p>
+        </w:tc>
+        <w:tc>
+          <w:tcPr>
+            <w:tcW w:w="605" w:type="dxa"/>
+            <w:tcBorders>
+              <w:top w:val="nil"/>
+              <w:left w:val="nil"/>
+              <w:bottom w:val="single" w:sz="4" w:space="0" w:color="auto"/>
+              <w:right w:val="single" w:sz="4" w:space="0" w:color="auto"/>
+            </w:tcBorders>
+            <w:shd w:val="clear" w:color="auto" w:fill="auto"/>
+            <w:noWrap/>
+            <w:vAlign w:val="bottom"/>
+            <w:hideMark/>
+          </w:tcPr>
+          <w:p>
+            <w:pPr>
+              <w:spacing w:after="0" w:line="240" w:lineRule="auto"/>
+              <w:jc w:val="right"/>
+              <w:rPr>
+                <w:rFonts w:ascii="Calibri" w:eastAsia="Times New Roman" w:hAnsi="Calibri" w:cs="Calibri"/>
+                <w:color w:val="000000"/>
+                <w:lang w:eastAsia="pt-BR"/>
+              </w:rPr>
+            </w:pPr>
+            <w:r>
+              <w:rPr>
+                <w:rFonts w:ascii="Calibri" w:eastAsia="Times New Roman" w:hAnsi="Calibri" w:cs="Calibri"/>
+                <w:color w:val="000000"/>
+                <w:lang w:eastAsia="pt-BR"/>
+              </w:rPr>
+              <w:t>100%</w:t>
+            </w:r>
+          </w:p>
+        </w:tc>
+        <w:tc>
+          <w:tcPr>
+            <w:tcW w:w="663" w:type="dxa"/>
+            <w:tcBorders>
+              <w:top w:val="nil"/>
+              <w:left w:val="nil"/>
+              <w:bottom w:val="single" w:sz="4" w:space="0" w:color="auto"/>
+              <w:right w:val="single" w:sz="4" w:space="0" w:color="auto"/>
+            </w:tcBorders>
+            <w:shd w:val="clear" w:color="auto" w:fill="auto"/>
+            <w:noWrap/>
+            <w:vAlign w:val="bottom"/>
+            <w:hideMark/>
+          </w:tcPr>
+          <w:p>
+            <w:pPr>
+              <w:spacing w:after="0" w:line="240" w:lineRule="auto"/>
+              <w:jc w:val="right"/>
+              <w:rPr>
+                <w:rFonts w:ascii="Calibri" w:eastAsia="Times New Roman" w:hAnsi="Calibri" w:cs="Calibri"/>
+                <w:color w:val="000000"/>
+                <w:lang w:eastAsia="pt-BR"/>
+              </w:rPr>
+            </w:pPr>
+            <w:r>
+              <w:rPr>
+                <w:rFonts w:ascii="Calibri" w:eastAsia="Times New Roman" w:hAnsi="Calibri" w:cs="Calibri"/>
+                <w:color w:val="000000"/>
+                <w:lang w:eastAsia="pt-BR"/>
+              </w:rPr>
+              <w:t>100%</w:t>
+            </w:r>
+          </w:p>
+        </w:tc>
+      </w:tr>
+      <w:tr>
+        <w:trPr>
+          <w:trHeight w:val="288"/>
+        </w:trPr>
+        <w:tc>
+          <w:tcPr>
+            <w:tcW w:w="5791" w:type="dxa"/>
+            <w:tcBorders>
+              <w:top w:val="nil"/>
+              <w:left w:val="single" w:sz="4" w:space="0" w:color="auto"/>
+              <w:bottom w:val="single" w:sz="4" w:space="0" w:color="auto"/>
+              <w:right w:val="single" w:sz="4" w:space="0" w:color="auto"/>
+            </w:tcBorders>
+            <w:shd w:val="clear" w:color="auto" w:fill="auto"/>
+            <w:noWrap/>
+            <w:vAlign w:val="bottom"/>
+            <w:hideMark/>
+          </w:tcPr>
+          <w:p>
+            <w:pPr>
+              <w:spacing w:after="0" w:line="240" w:lineRule="auto"/>
+              <w:rPr>
+                <w:rFonts w:ascii="Calibri" w:eastAsia="Times New Roman" w:hAnsi="Calibri" w:cs="Calibri"/>
+                <w:color w:val="000000"/>
+                <w:lang w:eastAsia="pt-BR"/>
+              </w:rPr>
+            </w:pPr>
+            <w:r>
+              <w:rPr>
+                <w:rFonts w:ascii="Calibri" w:eastAsia="Times New Roman" w:hAnsi="Calibri" w:cs="Calibri"/>
+                <w:color w:val="000000"/>
+                <w:lang w:eastAsia="pt-BR"/>
+              </w:rPr>
+              <w:t>Escopo do projeto</w:t>
+            </w:r>
+          </w:p>
+        </w:tc>
+        <w:tc>
+          <w:tcPr>
+            <w:tcW w:w="1301" w:type="dxa"/>
+            <w:tcBorders>
+              <w:top w:val="single" w:sz="4" w:space="0" w:color="auto"/>
+              <w:left w:val="single" w:sz="4" w:space="0" w:color="auto"/>
+              <w:bottom w:val="single" w:sz="4" w:space="0" w:color="auto"/>
+              <w:right w:val="single" w:sz="4" w:space="0" w:color="auto"/>
+            </w:tcBorders>
+            <w:shd w:val="clear" w:color="000000" w:fill="C6E0B4"/>
+            <w:noWrap/>
+            <w:vAlign w:val="center"/>
+            <w:hideMark/>
+          </w:tcPr>
+          <w:p>
+            <w:pPr>
+              <w:spacing w:after="0" w:line="240" w:lineRule="auto"/>
+              <w:jc w:val="center"/>
+              <w:rPr>
+                <w:rFonts w:ascii="Calibri" w:eastAsia="Times New Roman" w:hAnsi="Calibri" w:cs="Calibri"/>
+                <w:color w:val="375623"/>
+                <w:lang w:eastAsia="pt-BR"/>
+              </w:rPr>
+            </w:pPr>
+            <w:r>
+              <w:rPr>
+                <w:rFonts w:ascii="Calibri" w:eastAsia="Times New Roman" w:hAnsi="Calibri" w:cs="Calibri"/>
+                <w:color w:val="375623"/>
+                <w:lang w:eastAsia="pt-BR"/>
+              </w:rPr>
+              <w:t xml:space="preserve">CONCLUIDO </w:t>
+            </w:r>
+          </w:p>
+        </w:tc>
+        <w:tc>
+          <w:tcPr>
+            <w:tcW w:w="605" w:type="dxa"/>
+            <w:tcBorders>
+              <w:top w:val="nil"/>
+              <w:left w:val="nil"/>
+              <w:bottom w:val="single" w:sz="4" w:space="0" w:color="auto"/>
+              <w:right w:val="single" w:sz="4" w:space="0" w:color="auto"/>
+            </w:tcBorders>
+            <w:shd w:val="clear" w:color="auto" w:fill="auto"/>
+            <w:noWrap/>
+            <w:vAlign w:val="bottom"/>
+            <w:hideMark/>
+          </w:tcPr>
+          <w:p>
+            <w:pPr>
+              <w:spacing w:after="0" w:line="240" w:lineRule="auto"/>
+              <w:jc w:val="right"/>
+              <w:rPr>
+                <w:rFonts w:ascii="Calibri" w:eastAsia="Times New Roman" w:hAnsi="Calibri" w:cs="Calibri"/>
+                <w:color w:val="000000"/>
+                <w:u w:val="single"/>
+                <w:lang w:eastAsia="pt-BR"/>
+              </w:rPr>
+            </w:pPr>
+            <w:r>
+              <w:rPr>
+                <w:rFonts w:ascii="Calibri" w:eastAsia="Times New Roman" w:hAnsi="Calibri" w:cs="Calibri"/>
+                <w:color w:val="000000"/>
+                <w:u w:val="single"/>
+                <w:lang w:eastAsia="pt-BR"/>
+              </w:rPr>
+              <w:t>100%</w:t>
+            </w:r>
+          </w:p>
+        </w:tc>
+        <w:tc>
+          <w:tcPr>
+            <w:tcW w:w="663" w:type="dxa"/>
+            <w:tcBorders>
+              <w:top w:val="nil"/>
+              <w:left w:val="nil"/>
+              <w:bottom w:val="single" w:sz="4" w:space="0" w:color="auto"/>
+              <w:right w:val="single" w:sz="4" w:space="0" w:color="auto"/>
+            </w:tcBorders>
+            <w:shd w:val="clear" w:color="auto" w:fill="auto"/>
+            <w:noWrap/>
+            <w:vAlign w:val="bottom"/>
+            <w:hideMark/>
+          </w:tcPr>
+          <w:p>
+            <w:pPr>
+              <w:spacing w:after="0" w:line="240" w:lineRule="auto"/>
+              <w:jc w:val="right"/>
+              <w:rPr>
+                <w:rFonts w:ascii="Calibri" w:eastAsia="Times New Roman" w:hAnsi="Calibri" w:cs="Calibri"/>
+                <w:color w:val="000000"/>
+                <w:lang w:eastAsia="pt-BR"/>
+              </w:rPr>
+            </w:pPr>
+            <w:r>
+              <w:rPr>
+                <w:rFonts w:ascii="Calibri" w:eastAsia="Times New Roman" w:hAnsi="Calibri" w:cs="Calibri"/>
+                <w:color w:val="000000"/>
+                <w:lang w:eastAsia="pt-BR"/>
+              </w:rPr>
+              <w:t>100%</w:t>
+            </w:r>
+          </w:p>
+        </w:tc>
+      </w:tr>
+      <w:tr>
+        <w:trPr>
+          <w:trHeight w:val="288"/>
+        </w:trPr>
+        <w:tc>
+          <w:tcPr>
+            <w:tcW w:w="5791" w:type="dxa"/>
+            <w:tcBorders>
+              <w:top w:val="nil"/>
+              <w:left w:val="single" w:sz="4" w:space="0" w:color="auto"/>
+              <w:bottom w:val="single" w:sz="4" w:space="0" w:color="auto"/>
+              <w:right w:val="single" w:sz="4" w:space="0" w:color="auto"/>
+            </w:tcBorders>
+            <w:shd w:val="clear" w:color="auto" w:fill="auto"/>
+            <w:noWrap/>
+            <w:vAlign w:val="bottom"/>
+            <w:hideMark/>
+          </w:tcPr>
+          <w:p>
+            <w:pPr>
+              <w:spacing w:after="0" w:line="240" w:lineRule="auto"/>
+              <w:rPr>
+                <w:rFonts w:ascii="Calibri" w:eastAsia="Times New Roman" w:hAnsi="Calibri" w:cs="Calibri"/>
+                <w:color w:val="000000"/>
+                <w:lang w:eastAsia="pt-BR"/>
+              </w:rPr>
+            </w:pPr>
+            <w:r>
+              <w:rPr>
+                <w:rFonts w:ascii="Calibri" w:eastAsia="Times New Roman" w:hAnsi="Calibri" w:cs="Calibri"/>
+                <w:color w:val="000000"/>
+                <w:lang w:eastAsia="pt-BR"/>
+              </w:rPr>
+              <w:t>Cronograma</w:t>
+            </w:r>
+          </w:p>
+        </w:tc>
+        <w:tc>
+          <w:tcPr>
+            <w:tcW w:w="1301" w:type="dxa"/>
+            <w:tcBorders>
+              <w:top w:val="single" w:sz="4" w:space="0" w:color="auto"/>
+              <w:left w:val="single" w:sz="4" w:space="0" w:color="auto"/>
+              <w:bottom w:val="single" w:sz="4" w:space="0" w:color="auto"/>
+              <w:right w:val="single" w:sz="4" w:space="0" w:color="auto"/>
+            </w:tcBorders>
+            <w:shd w:val="clear" w:color="000000" w:fill="C6E0B4"/>
+            <w:noWrap/>
+            <w:vAlign w:val="center"/>
+            <w:hideMark/>
+          </w:tcPr>
+          <w:p>
+            <w:pPr>
+              <w:spacing w:after="0" w:line="240" w:lineRule="auto"/>
+              <w:jc w:val="center"/>
+              <w:rPr>
+                <w:rFonts w:ascii="Calibri" w:eastAsia="Times New Roman" w:hAnsi="Calibri" w:cs="Calibri"/>
+                <w:color w:val="375623"/>
+                <w:lang w:eastAsia="pt-BR"/>
+              </w:rPr>
+            </w:pPr>
+            <w:r>
+              <w:rPr>
+                <w:rFonts w:ascii="Calibri" w:eastAsia="Times New Roman" w:hAnsi="Calibri" w:cs="Calibri"/>
+                <w:color w:val="375623"/>
+                <w:lang w:eastAsia="pt-BR"/>
+              </w:rPr>
+              <w:t xml:space="preserve">CONCLUIDO </w:t>
+            </w:r>
+          </w:p>
+        </w:tc>
+        <w:tc>
+          <w:tcPr>
+            <w:tcW w:w="605" w:type="dxa"/>
+            <w:tcBorders>
+              <w:top w:val="nil"/>
+              <w:left w:val="nil"/>
+              <w:bottom w:val="single" w:sz="4" w:space="0" w:color="auto"/>
+              <w:right w:val="single" w:sz="4" w:space="0" w:color="auto"/>
+            </w:tcBorders>
+            <w:shd w:val="clear" w:color="auto" w:fill="auto"/>
+            <w:noWrap/>
+            <w:vAlign w:val="bottom"/>
+            <w:hideMark/>
+          </w:tcPr>
+          <w:p>
+            <w:pPr>
+              <w:spacing w:after="0" w:line="240" w:lineRule="auto"/>
+              <w:jc w:val="right"/>
+              <w:rPr>
+                <w:rFonts w:ascii="Calibri" w:eastAsia="Times New Roman" w:hAnsi="Calibri" w:cs="Calibri"/>
+                <w:color w:val="000000"/>
+                <w:lang w:eastAsia="pt-BR"/>
+              </w:rPr>
+            </w:pPr>
+            <w:r>
+              <w:rPr>
+                <w:rFonts w:ascii="Calibri" w:eastAsia="Times New Roman" w:hAnsi="Calibri" w:cs="Calibri"/>
+                <w:color w:val="000000"/>
+                <w:lang w:eastAsia="pt-BR"/>
+              </w:rPr>
+              <w:t>100%</w:t>
+            </w:r>
+          </w:p>
+        </w:tc>
+        <w:tc>
+          <w:tcPr>
+            <w:tcW w:w="663" w:type="dxa"/>
+            <w:tcBorders>
+              <w:top w:val="nil"/>
+              <w:left w:val="nil"/>
+              <w:bottom w:val="single" w:sz="4" w:space="0" w:color="auto"/>
+              <w:right w:val="single" w:sz="4" w:space="0" w:color="auto"/>
+            </w:tcBorders>
+            <w:shd w:val="clear" w:color="auto" w:fill="auto"/>
+            <w:noWrap/>
+            <w:vAlign w:val="bottom"/>
+            <w:hideMark/>
+          </w:tcPr>
+          <w:p>
+            <w:pPr>
+              <w:spacing w:after="0" w:line="240" w:lineRule="auto"/>
+              <w:jc w:val="right"/>
+              <w:rPr>
+                <w:rFonts w:ascii="Calibri" w:eastAsia="Times New Roman" w:hAnsi="Calibri" w:cs="Calibri"/>
+                <w:color w:val="000000"/>
+                <w:lang w:eastAsia="pt-BR"/>
+              </w:rPr>
+            </w:pPr>
+            <w:r>
+              <w:rPr>
+                <w:rFonts w:ascii="Calibri" w:eastAsia="Times New Roman" w:hAnsi="Calibri" w:cs="Calibri"/>
+                <w:color w:val="000000"/>
+                <w:lang w:eastAsia="pt-BR"/>
+              </w:rPr>
+              <w:t>100%</w:t>
+            </w:r>
+          </w:p>
+        </w:tc>
+      </w:tr>
+      <w:tr>
+        <w:trPr>
+          <w:trHeight w:val="288"/>
+        </w:trPr>
+        <w:tc>
+          <w:tcPr>
+            <w:tcW w:w="5791" w:type="dxa"/>
+            <w:tcBorders>
+              <w:top w:val="nil"/>
+              <w:left w:val="single" w:sz="4" w:space="0" w:color="auto"/>
+              <w:bottom w:val="single" w:sz="4" w:space="0" w:color="auto"/>
+              <w:right w:val="single" w:sz="4" w:space="0" w:color="auto"/>
+            </w:tcBorders>
+            <w:shd w:val="clear" w:color="auto" w:fill="auto"/>
+            <w:noWrap/>
+            <w:vAlign w:val="bottom"/>
+            <w:hideMark/>
+          </w:tcPr>
+          <w:p>
+            <w:pPr>
+              <w:spacing w:after="0" w:line="240" w:lineRule="auto"/>
+              <w:rPr>
+                <w:rFonts w:ascii="Calibri" w:eastAsia="Times New Roman" w:hAnsi="Calibri" w:cs="Calibri"/>
+                <w:color w:val="000000"/>
+                <w:lang w:eastAsia="pt-BR"/>
+              </w:rPr>
+            </w:pPr>
+            <w:r>
+              <w:rPr>
+                <w:rFonts w:ascii="Calibri" w:eastAsia="Times New Roman" w:hAnsi="Calibri" w:cs="Calibri"/>
+                <w:color w:val="000000"/>
+                <w:lang w:eastAsia="pt-BR"/>
+              </w:rPr>
+              <w:t>Custos do projeto</w:t>
+            </w:r>
+          </w:p>
+        </w:tc>
+        <w:tc>
+          <w:tcPr>
+            <w:tcW w:w="1301" w:type="dxa"/>
+            <w:tcBorders>
+              <w:top w:val="single" w:sz="4" w:space="0" w:color="auto"/>
+              <w:left w:val="single" w:sz="4" w:space="0" w:color="auto"/>
+              <w:bottom w:val="single" w:sz="4" w:space="0" w:color="auto"/>
+              <w:right w:val="single" w:sz="4" w:space="0" w:color="auto"/>
+            </w:tcBorders>
+            <w:shd w:val="clear" w:color="000000" w:fill="C6E0B4"/>
+            <w:noWrap/>
+            <w:vAlign w:val="center"/>
+            <w:hideMark/>
+          </w:tcPr>
+          <w:p>
+            <w:pPr>
+              <w:spacing w:after="0" w:line="240" w:lineRule="auto"/>
+              <w:jc w:val="center"/>
+              <w:rPr>
+                <w:rFonts w:ascii="Calibri" w:eastAsia="Times New Roman" w:hAnsi="Calibri" w:cs="Calibri"/>
+                <w:color w:val="375623"/>
+                <w:lang w:eastAsia="pt-BR"/>
+              </w:rPr>
+            </w:pPr>
+            <w:r>
+              <w:rPr>
+                <w:rFonts w:ascii="Calibri" w:eastAsia="Times New Roman" w:hAnsi="Calibri" w:cs="Calibri"/>
+                <w:color w:val="375623"/>
+                <w:lang w:eastAsia="pt-BR"/>
+              </w:rPr>
+              <w:t xml:space="preserve">CONCLUIDO </w:t>
+            </w:r>
+          </w:p>
+        </w:tc>
+        <w:tc>
+          <w:tcPr>
+            <w:tcW w:w="605" w:type="dxa"/>
+            <w:tcBorders>
+              <w:top w:val="nil"/>
+              <w:left w:val="nil"/>
+              <w:bottom w:val="single" w:sz="4" w:space="0" w:color="auto"/>
+              <w:right w:val="single" w:sz="4" w:space="0" w:color="auto"/>
+            </w:tcBorders>
+            <w:shd w:val="clear" w:color="auto" w:fill="auto"/>
+            <w:noWrap/>
+            <w:vAlign w:val="bottom"/>
+            <w:hideMark/>
+          </w:tcPr>
+          <w:p>
+            <w:pPr>
+              <w:spacing w:after="0" w:line="240" w:lineRule="auto"/>
+              <w:jc w:val="right"/>
+              <w:rPr>
+                <w:rFonts w:ascii="Calibri" w:eastAsia="Times New Roman" w:hAnsi="Calibri" w:cs="Calibri"/>
+                <w:color w:val="000000"/>
+                <w:lang w:eastAsia="pt-BR"/>
+              </w:rPr>
+            </w:pPr>
+            <w:r>
+              <w:rPr>
+                <w:rFonts w:ascii="Calibri" w:eastAsia="Times New Roman" w:hAnsi="Calibri" w:cs="Calibri"/>
+                <w:color w:val="000000"/>
+                <w:lang w:eastAsia="pt-BR"/>
+              </w:rPr>
+              <w:t>100%</w:t>
+            </w:r>
+          </w:p>
+        </w:tc>
+        <w:tc>
+          <w:tcPr>
+            <w:tcW w:w="663" w:type="dxa"/>
+            <w:tcBorders>
+              <w:top w:val="nil"/>
+              <w:left w:val="nil"/>
+              <w:bottom w:val="single" w:sz="4" w:space="0" w:color="auto"/>
+              <w:right w:val="single" w:sz="4" w:space="0" w:color="auto"/>
+            </w:tcBorders>
+            <w:shd w:val="clear" w:color="auto" w:fill="auto"/>
+            <w:noWrap/>
+            <w:vAlign w:val="bottom"/>
+            <w:hideMark/>
+          </w:tcPr>
+          <w:p>
+            <w:pPr>
+              <w:spacing w:after="0" w:line="240" w:lineRule="auto"/>
+              <w:jc w:val="right"/>
+              <w:rPr>
+                <w:rFonts w:ascii="Calibri" w:eastAsia="Times New Roman" w:hAnsi="Calibri" w:cs="Calibri"/>
+                <w:color w:val="000000"/>
+                <w:lang w:eastAsia="pt-BR"/>
+              </w:rPr>
+            </w:pPr>
+            <w:r>
+              <w:rPr>
+                <w:rFonts w:ascii="Calibri" w:eastAsia="Times New Roman" w:hAnsi="Calibri" w:cs="Calibri"/>
+                <w:color w:val="000000"/>
+                <w:lang w:eastAsia="pt-BR"/>
+              </w:rPr>
+              <w:t>100%</w:t>
+            </w:r>
+          </w:p>
+        </w:tc>
+      </w:tr>
+      <w:tr>
+        <w:trPr>
+          <w:trHeight w:val="288"/>
+        </w:trPr>
+        <w:tc>
+          <w:tcPr>
+            <w:tcW w:w="5791" w:type="dxa"/>
+            <w:tcBorders>
+              <w:top w:val="nil"/>
+              <w:left w:val="single" w:sz="4" w:space="0" w:color="auto"/>
+              <w:bottom w:val="single" w:sz="4" w:space="0" w:color="auto"/>
+              <w:right w:val="single" w:sz="4" w:space="0" w:color="auto"/>
+            </w:tcBorders>
+            <w:shd w:val="clear" w:color="auto" w:fill="auto"/>
+            <w:noWrap/>
+            <w:vAlign w:val="bottom"/>
+            <w:hideMark/>
+          </w:tcPr>
+          <w:p>
+            <w:pPr>
+              <w:spacing w:after="0" w:line="240" w:lineRule="auto"/>
+              <w:rPr>
+                <w:rFonts w:ascii="Calibri" w:eastAsia="Times New Roman" w:hAnsi="Calibri" w:cs="Calibri"/>
+                <w:color w:val="000000"/>
+                <w:lang w:eastAsia="pt-BR"/>
+              </w:rPr>
+            </w:pPr>
+            <w:r>
+              <w:rPr>
+                <w:rFonts w:ascii="Calibri" w:eastAsia="Times New Roman" w:hAnsi="Calibri" w:cs="Calibri"/>
+                <w:color w:val="000000"/>
+                <w:lang w:eastAsia="pt-BR"/>
+              </w:rPr>
+              <w:t>Desenvolvimento da Introdução do Relatório Técnico</w:t>
+            </w:r>
+          </w:p>
+        </w:tc>
+        <w:tc>
+          <w:tcPr>
+            <w:tcW w:w="1301" w:type="dxa"/>
+            <w:tcBorders>
+              <w:top w:val="single" w:sz="4" w:space="0" w:color="auto"/>
+              <w:left w:val="single" w:sz="4" w:space="0" w:color="auto"/>
+              <w:bottom w:val="single" w:sz="4" w:space="0" w:color="auto"/>
+              <w:right w:val="single" w:sz="4" w:space="0" w:color="auto"/>
+            </w:tcBorders>
+            <w:shd w:val="clear" w:color="000000" w:fill="C6E0B4"/>
+            <w:noWrap/>
+            <w:vAlign w:val="center"/>
+            <w:hideMark/>
+          </w:tcPr>
+          <w:p>
+            <w:pPr>
+              <w:spacing w:after="0" w:line="240" w:lineRule="auto"/>
+              <w:jc w:val="center"/>
+              <w:rPr>
+                <w:rFonts w:ascii="Calibri" w:eastAsia="Times New Roman" w:hAnsi="Calibri" w:cs="Calibri"/>
+                <w:color w:val="375623"/>
+                <w:lang w:eastAsia="pt-BR"/>
+              </w:rPr>
+            </w:pPr>
+            <w:r>
+              <w:rPr>
+                <w:rFonts w:ascii="Calibri" w:eastAsia="Times New Roman" w:hAnsi="Calibri" w:cs="Calibri"/>
+                <w:color w:val="375623"/>
+                <w:lang w:eastAsia="pt-BR"/>
+              </w:rPr>
+              <w:t xml:space="preserve">CONCLUIDO </w:t>
+            </w:r>
+          </w:p>
+        </w:tc>
+        <w:tc>
+          <w:tcPr>
+            <w:tcW w:w="605" w:type="dxa"/>
+            <w:tcBorders>
+              <w:top w:val="nil"/>
+              <w:left w:val="nil"/>
+              <w:bottom w:val="single" w:sz="4" w:space="0" w:color="auto"/>
+              <w:right w:val="single" w:sz="4" w:space="0" w:color="auto"/>
+            </w:tcBorders>
+            <w:shd w:val="clear" w:color="auto" w:fill="auto"/>
+            <w:noWrap/>
+            <w:vAlign w:val="bottom"/>
+            <w:hideMark/>
+          </w:tcPr>
+          <w:p>
+            <w:pPr>
+              <w:spacing w:after="0" w:line="240" w:lineRule="auto"/>
+              <w:jc w:val="right"/>
+              <w:rPr>
+                <w:rFonts w:ascii="Calibri" w:eastAsia="Times New Roman" w:hAnsi="Calibri" w:cs="Calibri"/>
+                <w:color w:val="000000"/>
+                <w:lang w:eastAsia="pt-BR"/>
+              </w:rPr>
+            </w:pPr>
+            <w:r>
+              <w:rPr>
+                <w:rFonts w:ascii="Calibri" w:eastAsia="Times New Roman" w:hAnsi="Calibri" w:cs="Calibri"/>
+                <w:color w:val="000000"/>
+                <w:lang w:eastAsia="pt-BR"/>
+              </w:rPr>
+              <w:t>100%</w:t>
+            </w:r>
+          </w:p>
+        </w:tc>
+        <w:tc>
+          <w:tcPr>
+            <w:tcW w:w="663" w:type="dxa"/>
+            <w:tcBorders>
+              <w:top w:val="nil"/>
+              <w:left w:val="nil"/>
+              <w:bottom w:val="single" w:sz="4" w:space="0" w:color="auto"/>
+              <w:right w:val="single" w:sz="4" w:space="0" w:color="auto"/>
+            </w:tcBorders>
+            <w:shd w:val="clear" w:color="auto" w:fill="auto"/>
+            <w:noWrap/>
+            <w:vAlign w:val="bottom"/>
+            <w:hideMark/>
+          </w:tcPr>
+          <w:p>
+            <w:pPr>
+              <w:spacing w:after="0" w:line="240" w:lineRule="auto"/>
+              <w:jc w:val="right"/>
+              <w:rPr>
+                <w:rFonts w:ascii="Calibri" w:eastAsia="Times New Roman" w:hAnsi="Calibri" w:cs="Calibri"/>
+                <w:color w:val="000000"/>
+                <w:lang w:eastAsia="pt-BR"/>
+              </w:rPr>
+            </w:pPr>
+            <w:r>
+              <w:rPr>
+                <w:rFonts w:ascii="Calibri" w:eastAsia="Times New Roman" w:hAnsi="Calibri" w:cs="Calibri"/>
+                <w:color w:val="000000"/>
+                <w:lang w:eastAsia="pt-BR"/>
+              </w:rPr>
+              <w:t>100%</w:t>
+            </w:r>
+          </w:p>
+        </w:tc>
+      </w:tr>
+      <w:tr>
+        <w:trPr>
+          <w:trHeight w:val="288"/>
+        </w:trPr>
+        <w:tc>
+          <w:tcPr>
+            <w:tcW w:w="5791" w:type="dxa"/>
+            <w:tcBorders>
+              <w:top w:val="nil"/>
+              <w:left w:val="single" w:sz="4" w:space="0" w:color="auto"/>
+              <w:bottom w:val="single" w:sz="4" w:space="0" w:color="auto"/>
+              <w:right w:val="single" w:sz="4" w:space="0" w:color="auto"/>
+            </w:tcBorders>
+            <w:shd w:val="clear" w:color="000000" w:fill="FEFC9C"/>
+            <w:noWrap/>
+            <w:vAlign w:val="bottom"/>
+            <w:hideMark/>
+          </w:tcPr>
+          <w:p>
+            <w:pPr>
+              <w:spacing w:after="0" w:line="240" w:lineRule="auto"/>
+              <w:jc w:val="center"/>
+              <w:rPr>
+                <w:rFonts w:ascii="Calibri" w:eastAsia="Times New Roman" w:hAnsi="Calibri" w:cs="Calibri"/>
+                <w:b/>
+                <w:bCs/>
+                <w:color w:val="000000"/>
+                <w:lang w:eastAsia="pt-BR"/>
+              </w:rPr>
+            </w:pPr>
+            <w:r>
+              <w:rPr>
+                <w:rFonts w:ascii="Calibri" w:eastAsia="Times New Roman" w:hAnsi="Calibri" w:cs="Calibri"/>
+                <w:b/>
+                <w:bCs/>
+                <w:color w:val="000000"/>
+                <w:lang w:eastAsia="pt-BR"/>
+              </w:rPr>
+              <w:t>SPRINT 02</w:t>
+            </w:r>
+          </w:p>
+        </w:tc>
+        <w:tc>
+          <w:tcPr>
+            <w:tcW w:w="1301" w:type="dxa"/>
+            <w:tcBorders>
+              <w:top w:val="nil"/>
+              <w:left w:val="nil"/>
+              <w:bottom w:val="single" w:sz="4" w:space="0" w:color="auto"/>
+              <w:right w:val="single" w:sz="4" w:space="0" w:color="auto"/>
+            </w:tcBorders>
+            <w:shd w:val="clear" w:color="000000" w:fill="FEFC9C"/>
+            <w:noWrap/>
+            <w:vAlign w:val="bottom"/>
+            <w:hideMark/>
+          </w:tcPr>
+          <w:p>
+            <w:pPr>
+              <w:spacing w:after="0" w:line="240" w:lineRule="auto"/>
+              <w:jc w:val="center"/>
+              <w:rPr>
+                <w:rFonts w:ascii="Calibri" w:eastAsia="Times New Roman" w:hAnsi="Calibri" w:cs="Calibri"/>
+                <w:color w:val="000000"/>
+                <w:lang w:eastAsia="pt-BR"/>
+              </w:rPr>
+            </w:pPr>
+            <w:r>
+              <w:rPr>
+                <w:rFonts w:ascii="Calibri" w:eastAsia="Times New Roman" w:hAnsi="Calibri" w:cs="Calibri"/>
+                <w:color w:val="000000"/>
+                <w:lang w:eastAsia="pt-BR"/>
+              </w:rPr>
+              <w:t> </w:t>
+            </w:r>
+          </w:p>
+        </w:tc>
+        <w:tc>
+          <w:tcPr>
+            <w:tcW w:w="605" w:type="dxa"/>
+            <w:tcBorders>
+              <w:top w:val="nil"/>
+              <w:left w:val="nil"/>
+              <w:bottom w:val="single" w:sz="4" w:space="0" w:color="auto"/>
+              <w:right w:val="single" w:sz="4" w:space="0" w:color="auto"/>
+            </w:tcBorders>
+            <w:shd w:val="clear" w:color="000000" w:fill="FEFC9C"/>
+            <w:noWrap/>
+            <w:vAlign w:val="bottom"/>
+            <w:hideMark/>
+          </w:tcPr>
+          <w:p>
+            <w:pPr>
+              <w:spacing w:after="0" w:line="240" w:lineRule="auto"/>
+              <w:jc w:val="center"/>
+              <w:rPr>
+                <w:rFonts w:ascii="Calibri" w:eastAsia="Times New Roman" w:hAnsi="Calibri" w:cs="Calibri"/>
+                <w:color w:val="000000"/>
+                <w:lang w:eastAsia="pt-BR"/>
+              </w:rPr>
+            </w:pPr>
+            <w:r>
+              <w:rPr>
+                <w:rFonts w:ascii="Calibri" w:eastAsia="Times New Roman" w:hAnsi="Calibri" w:cs="Calibri"/>
+                <w:color w:val="000000"/>
+                <w:lang w:eastAsia="pt-BR"/>
+              </w:rPr>
+              <w:t> </w:t>
+            </w:r>
+          </w:p>
+        </w:tc>
+        <w:tc>
+          <w:tcPr>
+            <w:tcW w:w="663" w:type="dxa"/>
+            <w:tcBorders>
+              <w:top w:val="nil"/>
+              <w:left w:val="nil"/>
+              <w:bottom w:val="single" w:sz="4" w:space="0" w:color="auto"/>
+              <w:right w:val="single" w:sz="4" w:space="0" w:color="auto"/>
+            </w:tcBorders>
+            <w:shd w:val="clear" w:color="000000" w:fill="FEFC9C"/>
+            <w:noWrap/>
+            <w:vAlign w:val="bottom"/>
+            <w:hideMark/>
+          </w:tcPr>
+          <w:p>
+            <w:pPr>
+              <w:spacing w:after="0" w:line="240" w:lineRule="auto"/>
+              <w:jc w:val="center"/>
+              <w:rPr>
+                <w:rFonts w:ascii="Calibri" w:eastAsia="Times New Roman" w:hAnsi="Calibri" w:cs="Calibri"/>
+                <w:color w:val="000000"/>
+                <w:lang w:eastAsia="pt-BR"/>
+              </w:rPr>
+            </w:pPr>
+            <w:r>
+              <w:rPr>
+                <w:rFonts w:ascii="Calibri" w:eastAsia="Times New Roman" w:hAnsi="Calibri" w:cs="Calibri"/>
+                <w:color w:val="000000"/>
+                <w:lang w:eastAsia="pt-BR"/>
+              </w:rPr>
+              <w:t> </w:t>
+            </w:r>
+          </w:p>
+        </w:tc>
+      </w:tr>
+      <w:tr>
+        <w:trPr>
+          <w:trHeight w:val="288"/>
+        </w:trPr>
+        <w:tc>
+          <w:tcPr>
+            <w:tcW w:w="5791" w:type="dxa"/>
+            <w:tcBorders>
+              <w:top w:val="nil"/>
+              <w:left w:val="single" w:sz="4" w:space="0" w:color="auto"/>
+              <w:bottom w:val="single" w:sz="4" w:space="0" w:color="auto"/>
+              <w:right w:val="single" w:sz="4" w:space="0" w:color="auto"/>
+            </w:tcBorders>
+            <w:shd w:val="clear" w:color="auto" w:fill="auto"/>
+            <w:noWrap/>
+            <w:vAlign w:val="bottom"/>
+            <w:hideMark/>
+          </w:tcPr>
+          <w:p>
+            <w:pPr>
+              <w:spacing w:after="0" w:line="240" w:lineRule="auto"/>
+              <w:rPr>
+                <w:rFonts w:ascii="Calibri" w:eastAsia="Times New Roman" w:hAnsi="Calibri" w:cs="Calibri"/>
+                <w:color w:val="000000"/>
+                <w:lang w:eastAsia="pt-BR"/>
+              </w:rPr>
+            </w:pPr>
+            <w:proofErr w:type="spellStart"/>
+            <w:r>
+              <w:rPr>
+                <w:rFonts w:ascii="Calibri" w:eastAsia="Times New Roman" w:hAnsi="Calibri" w:cs="Calibri"/>
+                <w:color w:val="000000"/>
+                <w:lang w:eastAsia="pt-BR"/>
+              </w:rPr>
+              <w:t>Wireframe</w:t>
+            </w:r>
+            <w:proofErr w:type="spellEnd"/>
+            <w:r>
+              <w:rPr>
+                <w:rFonts w:ascii="Calibri" w:eastAsia="Times New Roman" w:hAnsi="Calibri" w:cs="Calibri"/>
+                <w:color w:val="000000"/>
+                <w:lang w:eastAsia="pt-BR"/>
+              </w:rPr>
+              <w:t xml:space="preserve"> de Alta Fidelidade</w:t>
+            </w:r>
+          </w:p>
+        </w:tc>
+        <w:tc>
+          <w:tcPr>
+            <w:tcW w:w="1301" w:type="dxa"/>
+            <w:tcBorders>
+              <w:top w:val="single" w:sz="4" w:space="0" w:color="auto"/>
+              <w:left w:val="single" w:sz="4" w:space="0" w:color="auto"/>
+              <w:bottom w:val="single" w:sz="4" w:space="0" w:color="auto"/>
+              <w:right w:val="single" w:sz="4" w:space="0" w:color="auto"/>
+            </w:tcBorders>
+            <w:shd w:val="clear" w:color="000000" w:fill="FFB7B7"/>
+            <w:noWrap/>
+            <w:vAlign w:val="center"/>
+            <w:hideMark/>
+          </w:tcPr>
+          <w:p>
+            <w:pPr>
+              <w:spacing w:after="0" w:line="240" w:lineRule="auto"/>
+              <w:jc w:val="center"/>
+              <w:rPr>
+                <w:rFonts w:ascii="Calibri" w:eastAsia="Times New Roman" w:hAnsi="Calibri" w:cs="Calibri"/>
+                <w:color w:val="C00000"/>
+                <w:lang w:eastAsia="pt-BR"/>
+              </w:rPr>
+            </w:pPr>
+            <w:r>
+              <w:rPr>
+                <w:rFonts w:ascii="Calibri" w:eastAsia="Times New Roman" w:hAnsi="Calibri" w:cs="Calibri"/>
+                <w:color w:val="C00000"/>
+                <w:lang w:eastAsia="pt-BR"/>
+              </w:rPr>
+              <w:t>A FAZER</w:t>
+            </w:r>
+          </w:p>
+        </w:tc>
+        <w:tc>
+          <w:tcPr>
+            <w:tcW w:w="605" w:type="dxa"/>
+            <w:tcBorders>
+              <w:top w:val="nil"/>
+              <w:left w:val="nil"/>
+              <w:bottom w:val="single" w:sz="4" w:space="0" w:color="auto"/>
+              <w:right w:val="single" w:sz="4" w:space="0" w:color="auto"/>
+            </w:tcBorders>
+            <w:shd w:val="clear" w:color="auto" w:fill="auto"/>
+            <w:noWrap/>
+            <w:vAlign w:val="bottom"/>
+            <w:hideMark/>
+          </w:tcPr>
+          <w:p>
+            <w:pPr>
+              <w:spacing w:after="0" w:line="240" w:lineRule="auto"/>
+              <w:jc w:val="right"/>
+              <w:rPr>
+                <w:rFonts w:ascii="Calibri" w:eastAsia="Times New Roman" w:hAnsi="Calibri" w:cs="Calibri"/>
+                <w:color w:val="000000"/>
+                <w:lang w:eastAsia="pt-BR"/>
+              </w:rPr>
+            </w:pPr>
+            <w:r>
+              <w:rPr>
+                <w:rFonts w:ascii="Calibri" w:eastAsia="Times New Roman" w:hAnsi="Calibri" w:cs="Calibri"/>
+                <w:color w:val="000000"/>
+                <w:lang w:eastAsia="pt-BR"/>
+              </w:rPr>
+              <w:t>0%</w:t>
+            </w:r>
+          </w:p>
+        </w:tc>
+        <w:tc>
+          <w:tcPr>
+            <w:tcW w:w="663" w:type="dxa"/>
+            <w:tcBorders>
+              <w:top w:val="nil"/>
+              <w:left w:val="nil"/>
+              <w:bottom w:val="single" w:sz="4" w:space="0" w:color="auto"/>
+              <w:right w:val="single" w:sz="4" w:space="0" w:color="auto"/>
+            </w:tcBorders>
+            <w:shd w:val="clear" w:color="auto" w:fill="auto"/>
+            <w:noWrap/>
+            <w:vAlign w:val="bottom"/>
+            <w:hideMark/>
+          </w:tcPr>
+          <w:p>
+            <w:pPr>
+              <w:spacing w:after="0" w:line="240" w:lineRule="auto"/>
+              <w:jc w:val="right"/>
+              <w:rPr>
+                <w:rFonts w:ascii="Calibri" w:eastAsia="Times New Roman" w:hAnsi="Calibri" w:cs="Calibri"/>
+                <w:color w:val="000000"/>
+                <w:lang w:eastAsia="pt-BR"/>
+              </w:rPr>
+            </w:pPr>
+            <w:r>
+              <w:rPr>
+                <w:rFonts w:ascii="Calibri" w:eastAsia="Times New Roman" w:hAnsi="Calibri" w:cs="Calibri"/>
+                <w:color w:val="000000"/>
+                <w:lang w:eastAsia="pt-BR"/>
+              </w:rPr>
+              <w:t>100%</w:t>
+            </w:r>
+          </w:p>
+        </w:tc>
+      </w:tr>
+      <w:tr>
+        <w:trPr>
+          <w:trHeight w:val="288"/>
+        </w:trPr>
+        <w:tc>
+          <w:tcPr>
+            <w:tcW w:w="5791" w:type="dxa"/>
+            <w:tcBorders>
+              <w:top w:val="nil"/>
+              <w:left w:val="single" w:sz="4" w:space="0" w:color="auto"/>
+              <w:bottom w:val="single" w:sz="4" w:space="0" w:color="auto"/>
+              <w:right w:val="single" w:sz="4" w:space="0" w:color="auto"/>
+            </w:tcBorders>
+            <w:shd w:val="clear" w:color="auto" w:fill="auto"/>
+            <w:noWrap/>
+            <w:vAlign w:val="bottom"/>
+            <w:hideMark/>
+          </w:tcPr>
+          <w:p>
+            <w:pPr>
+              <w:spacing w:after="0" w:line="240" w:lineRule="auto"/>
+              <w:rPr>
+                <w:rFonts w:ascii="Calibri" w:eastAsia="Times New Roman" w:hAnsi="Calibri" w:cs="Calibri"/>
+                <w:color w:val="000000"/>
+                <w:lang w:eastAsia="pt-BR"/>
+              </w:rPr>
+            </w:pPr>
+            <w:r>
+              <w:rPr>
+                <w:rFonts w:ascii="Calibri" w:eastAsia="Times New Roman" w:hAnsi="Calibri" w:cs="Calibri"/>
+                <w:color w:val="000000"/>
+                <w:lang w:eastAsia="pt-BR"/>
+              </w:rPr>
+              <w:t>Front-</w:t>
+            </w:r>
+            <w:proofErr w:type="spellStart"/>
+            <w:r>
+              <w:rPr>
+                <w:rFonts w:ascii="Calibri" w:eastAsia="Times New Roman" w:hAnsi="Calibri" w:cs="Calibri"/>
+                <w:color w:val="000000"/>
+                <w:lang w:eastAsia="pt-BR"/>
+              </w:rPr>
+              <w:t>End</w:t>
+            </w:r>
+            <w:proofErr w:type="spellEnd"/>
+            <w:r>
+              <w:rPr>
+                <w:rFonts w:ascii="Calibri" w:eastAsia="Times New Roman" w:hAnsi="Calibri" w:cs="Calibri"/>
+                <w:color w:val="000000"/>
+                <w:lang w:eastAsia="pt-BR"/>
+              </w:rPr>
+              <w:t xml:space="preserve"> do Projeto</w:t>
+            </w:r>
+          </w:p>
+        </w:tc>
+        <w:tc>
+          <w:tcPr>
+            <w:tcW w:w="1301" w:type="dxa"/>
+            <w:tcBorders>
+              <w:top w:val="single" w:sz="4" w:space="0" w:color="auto"/>
+              <w:left w:val="single" w:sz="4" w:space="0" w:color="auto"/>
+              <w:bottom w:val="single" w:sz="4" w:space="0" w:color="auto"/>
+              <w:right w:val="single" w:sz="4" w:space="0" w:color="auto"/>
+            </w:tcBorders>
+            <w:shd w:val="clear" w:color="000000" w:fill="FFB7B7"/>
+            <w:noWrap/>
+            <w:vAlign w:val="center"/>
+            <w:hideMark/>
+          </w:tcPr>
+          <w:p>
+            <w:pPr>
+              <w:spacing w:after="0" w:line="240" w:lineRule="auto"/>
+              <w:jc w:val="center"/>
+              <w:rPr>
+                <w:rFonts w:ascii="Calibri" w:eastAsia="Times New Roman" w:hAnsi="Calibri" w:cs="Calibri"/>
+                <w:color w:val="C00000"/>
+                <w:lang w:eastAsia="pt-BR"/>
+              </w:rPr>
+            </w:pPr>
+            <w:r>
+              <w:rPr>
+                <w:rFonts w:ascii="Calibri" w:eastAsia="Times New Roman" w:hAnsi="Calibri" w:cs="Calibri"/>
+                <w:color w:val="C00000"/>
+                <w:lang w:eastAsia="pt-BR"/>
+              </w:rPr>
+              <w:t>A FAZER</w:t>
+            </w:r>
+          </w:p>
+        </w:tc>
+        <w:tc>
+          <w:tcPr>
+            <w:tcW w:w="605" w:type="dxa"/>
+            <w:tcBorders>
+              <w:top w:val="nil"/>
+              <w:left w:val="nil"/>
+              <w:bottom w:val="single" w:sz="4" w:space="0" w:color="auto"/>
+              <w:right w:val="single" w:sz="4" w:space="0" w:color="auto"/>
+            </w:tcBorders>
+            <w:shd w:val="clear" w:color="auto" w:fill="auto"/>
+            <w:noWrap/>
+            <w:vAlign w:val="bottom"/>
+            <w:hideMark/>
+          </w:tcPr>
+          <w:p>
+            <w:pPr>
+              <w:spacing w:after="0" w:line="240" w:lineRule="auto"/>
+              <w:jc w:val="right"/>
+              <w:rPr>
+                <w:rFonts w:ascii="Calibri" w:eastAsia="Times New Roman" w:hAnsi="Calibri" w:cs="Calibri"/>
+                <w:color w:val="000000"/>
+                <w:lang w:eastAsia="pt-BR"/>
+              </w:rPr>
+            </w:pPr>
+            <w:r>
+              <w:rPr>
+                <w:rFonts w:ascii="Calibri" w:eastAsia="Times New Roman" w:hAnsi="Calibri" w:cs="Calibri"/>
+                <w:color w:val="000000"/>
+                <w:lang w:eastAsia="pt-BR"/>
+              </w:rPr>
+              <w:t>0%</w:t>
+            </w:r>
+          </w:p>
+        </w:tc>
+        <w:tc>
+          <w:tcPr>
+            <w:tcW w:w="663" w:type="dxa"/>
+            <w:tcBorders>
+              <w:top w:val="nil"/>
+              <w:left w:val="nil"/>
+              <w:bottom w:val="single" w:sz="4" w:space="0" w:color="auto"/>
+              <w:right w:val="single" w:sz="4" w:space="0" w:color="auto"/>
+            </w:tcBorders>
+            <w:shd w:val="clear" w:color="auto" w:fill="auto"/>
+            <w:noWrap/>
+            <w:vAlign w:val="bottom"/>
+            <w:hideMark/>
+          </w:tcPr>
+          <w:p>
+            <w:pPr>
+              <w:spacing w:after="0" w:line="240" w:lineRule="auto"/>
+              <w:jc w:val="right"/>
+              <w:rPr>
+                <w:rFonts w:ascii="Calibri" w:eastAsia="Times New Roman" w:hAnsi="Calibri" w:cs="Calibri"/>
+                <w:color w:val="000000"/>
+                <w:lang w:eastAsia="pt-BR"/>
+              </w:rPr>
+            </w:pPr>
+            <w:r>
+              <w:rPr>
+                <w:rFonts w:ascii="Calibri" w:eastAsia="Times New Roman" w:hAnsi="Calibri" w:cs="Calibri"/>
+                <w:color w:val="000000"/>
+                <w:lang w:eastAsia="pt-BR"/>
+              </w:rPr>
+              <w:t>100%</w:t>
+            </w:r>
+          </w:p>
+        </w:tc>
+      </w:tr>
+      <w:tr>
+        <w:trPr>
+          <w:trHeight w:val="288"/>
+        </w:trPr>
+        <w:tc>
+          <w:tcPr>
+            <w:tcW w:w="5791" w:type="dxa"/>
+            <w:tcBorders>
+              <w:top w:val="nil"/>
+              <w:left w:val="single" w:sz="4" w:space="0" w:color="auto"/>
+              <w:bottom w:val="single" w:sz="4" w:space="0" w:color="auto"/>
+              <w:right w:val="single" w:sz="4" w:space="0" w:color="auto"/>
+            </w:tcBorders>
+            <w:shd w:val="clear" w:color="auto" w:fill="auto"/>
+            <w:noWrap/>
+            <w:vAlign w:val="bottom"/>
+            <w:hideMark/>
+          </w:tcPr>
+          <w:p>
+            <w:pPr>
+              <w:spacing w:after="0" w:line="240" w:lineRule="auto"/>
+              <w:rPr>
+                <w:rFonts w:ascii="Calibri" w:eastAsia="Times New Roman" w:hAnsi="Calibri" w:cs="Calibri"/>
+                <w:color w:val="000000"/>
+                <w:lang w:eastAsia="pt-BR"/>
+              </w:rPr>
+            </w:pPr>
+            <w:r>
+              <w:rPr>
+                <w:rFonts w:ascii="Calibri" w:eastAsia="Times New Roman" w:hAnsi="Calibri" w:cs="Calibri"/>
+                <w:color w:val="000000"/>
+                <w:lang w:eastAsia="pt-BR"/>
+              </w:rPr>
+              <w:t>Desenvolvimento da Metodologia do Relatório Técnico.</w:t>
+            </w:r>
+          </w:p>
+        </w:tc>
+        <w:tc>
+          <w:tcPr>
+            <w:tcW w:w="1301" w:type="dxa"/>
+            <w:tcBorders>
+              <w:top w:val="single" w:sz="4" w:space="0" w:color="auto"/>
+              <w:left w:val="single" w:sz="4" w:space="0" w:color="auto"/>
+              <w:bottom w:val="single" w:sz="4" w:space="0" w:color="auto"/>
+              <w:right w:val="single" w:sz="4" w:space="0" w:color="auto"/>
+            </w:tcBorders>
+            <w:shd w:val="clear" w:color="000000" w:fill="FFB7B7"/>
+            <w:noWrap/>
+            <w:vAlign w:val="center"/>
+            <w:hideMark/>
+          </w:tcPr>
+          <w:p>
+            <w:pPr>
+              <w:spacing w:after="0" w:line="240" w:lineRule="auto"/>
+              <w:jc w:val="center"/>
+              <w:rPr>
+                <w:rFonts w:ascii="Calibri" w:eastAsia="Times New Roman" w:hAnsi="Calibri" w:cs="Calibri"/>
+                <w:color w:val="C00000"/>
+                <w:lang w:eastAsia="pt-BR"/>
+              </w:rPr>
+            </w:pPr>
+            <w:r>
+              <w:rPr>
+                <w:rFonts w:ascii="Calibri" w:eastAsia="Times New Roman" w:hAnsi="Calibri" w:cs="Calibri"/>
+                <w:color w:val="C00000"/>
+                <w:lang w:eastAsia="pt-BR"/>
+              </w:rPr>
+              <w:t>A FAZER</w:t>
+            </w:r>
+          </w:p>
+        </w:tc>
+        <w:tc>
+          <w:tcPr>
+            <w:tcW w:w="605" w:type="dxa"/>
+            <w:tcBorders>
+              <w:top w:val="nil"/>
+              <w:left w:val="nil"/>
+              <w:bottom w:val="single" w:sz="4" w:space="0" w:color="auto"/>
+              <w:right w:val="single" w:sz="4" w:space="0" w:color="auto"/>
+            </w:tcBorders>
+            <w:shd w:val="clear" w:color="000000" w:fill="FFFFFF"/>
+            <w:noWrap/>
+            <w:vAlign w:val="bottom"/>
+            <w:hideMark/>
+          </w:tcPr>
+          <w:p>
+            <w:pPr>
+              <w:spacing w:after="0" w:line="240" w:lineRule="auto"/>
+              <w:jc w:val="right"/>
+              <w:rPr>
+                <w:rFonts w:ascii="Calibri" w:eastAsia="Times New Roman" w:hAnsi="Calibri" w:cs="Calibri"/>
+                <w:color w:val="000000"/>
+                <w:lang w:eastAsia="pt-BR"/>
+              </w:rPr>
+            </w:pPr>
+            <w:r>
+              <w:rPr>
+                <w:rFonts w:ascii="Calibri" w:eastAsia="Times New Roman" w:hAnsi="Calibri" w:cs="Calibri"/>
+                <w:color w:val="000000"/>
+                <w:lang w:eastAsia="pt-BR"/>
+              </w:rPr>
+              <w:t>0%</w:t>
+            </w:r>
+          </w:p>
+        </w:tc>
+        <w:tc>
+          <w:tcPr>
+            <w:tcW w:w="663" w:type="dxa"/>
+            <w:tcBorders>
+              <w:top w:val="nil"/>
+              <w:left w:val="nil"/>
+              <w:bottom w:val="single" w:sz="4" w:space="0" w:color="auto"/>
+              <w:right w:val="single" w:sz="4" w:space="0" w:color="auto"/>
+            </w:tcBorders>
+            <w:shd w:val="clear" w:color="000000" w:fill="FFFFFF"/>
+            <w:noWrap/>
+            <w:vAlign w:val="bottom"/>
+            <w:hideMark/>
+          </w:tcPr>
+          <w:p>
+            <w:pPr>
+              <w:spacing w:after="0" w:line="240" w:lineRule="auto"/>
+              <w:jc w:val="right"/>
+              <w:rPr>
+                <w:rFonts w:ascii="Calibri" w:eastAsia="Times New Roman" w:hAnsi="Calibri" w:cs="Calibri"/>
+                <w:color w:val="000000"/>
+                <w:lang w:eastAsia="pt-BR"/>
+              </w:rPr>
+            </w:pPr>
+            <w:r>
+              <w:rPr>
+                <w:rFonts w:ascii="Calibri" w:eastAsia="Times New Roman" w:hAnsi="Calibri" w:cs="Calibri"/>
+                <w:color w:val="000000"/>
+                <w:lang w:eastAsia="pt-BR"/>
+              </w:rPr>
+              <w:t>100%</w:t>
+            </w:r>
+          </w:p>
+        </w:tc>
+      </w:tr>
+      <w:tr>
+        <w:trPr>
+          <w:trHeight w:val="288"/>
+        </w:trPr>
+        <w:tc>
+          <w:tcPr>
+            <w:tcW w:w="5791" w:type="dxa"/>
+            <w:tcBorders>
+              <w:top w:val="nil"/>
+              <w:left w:val="single" w:sz="4" w:space="0" w:color="auto"/>
+              <w:bottom w:val="single" w:sz="4" w:space="0" w:color="auto"/>
+              <w:right w:val="nil"/>
+            </w:tcBorders>
+            <w:shd w:val="clear" w:color="000000" w:fill="FEFC9C"/>
+            <w:noWrap/>
+            <w:vAlign w:val="bottom"/>
+            <w:hideMark/>
+          </w:tcPr>
+          <w:p>
+            <w:pPr>
+              <w:spacing w:after="0" w:line="240" w:lineRule="auto"/>
+              <w:jc w:val="center"/>
+              <w:rPr>
+                <w:rFonts w:ascii="Calibri" w:eastAsia="Times New Roman" w:hAnsi="Calibri" w:cs="Calibri"/>
+                <w:b/>
+                <w:bCs/>
+                <w:color w:val="000000"/>
+                <w:lang w:eastAsia="pt-BR"/>
+              </w:rPr>
+            </w:pPr>
+            <w:r>
+              <w:rPr>
+                <w:rFonts w:ascii="Calibri" w:eastAsia="Times New Roman" w:hAnsi="Calibri" w:cs="Calibri"/>
+                <w:b/>
+                <w:bCs/>
+                <w:color w:val="000000"/>
+                <w:lang w:eastAsia="pt-BR"/>
+              </w:rPr>
+              <w:t>SPRINT 03</w:t>
+            </w:r>
+          </w:p>
+        </w:tc>
+        <w:tc>
+          <w:tcPr>
+            <w:tcW w:w="1301" w:type="dxa"/>
+            <w:tcBorders>
+              <w:top w:val="nil"/>
+              <w:left w:val="nil"/>
+              <w:bottom w:val="single" w:sz="4" w:space="0" w:color="auto"/>
+              <w:right w:val="nil"/>
+            </w:tcBorders>
+            <w:shd w:val="clear" w:color="000000" w:fill="FEFC9C"/>
+            <w:noWrap/>
+            <w:vAlign w:val="bottom"/>
+            <w:hideMark/>
+          </w:tcPr>
+          <w:p>
+            <w:pPr>
+              <w:spacing w:after="0" w:line="240" w:lineRule="auto"/>
+              <w:jc w:val="center"/>
+              <w:rPr>
+                <w:rFonts w:ascii="Calibri" w:eastAsia="Times New Roman" w:hAnsi="Calibri" w:cs="Calibri"/>
+                <w:b/>
+                <w:bCs/>
+                <w:color w:val="000000"/>
+                <w:lang w:eastAsia="pt-BR"/>
+              </w:rPr>
+            </w:pPr>
+            <w:r>
+              <w:rPr>
+                <w:rFonts w:ascii="Calibri" w:eastAsia="Times New Roman" w:hAnsi="Calibri" w:cs="Calibri"/>
+                <w:b/>
+                <w:bCs/>
+                <w:color w:val="000000"/>
+                <w:lang w:eastAsia="pt-BR"/>
+              </w:rPr>
+              <w:t> </w:t>
+            </w:r>
+          </w:p>
+        </w:tc>
+        <w:tc>
+          <w:tcPr>
+            <w:tcW w:w="605" w:type="dxa"/>
+            <w:tcBorders>
+              <w:top w:val="nil"/>
+              <w:left w:val="nil"/>
+              <w:bottom w:val="single" w:sz="4" w:space="0" w:color="auto"/>
+              <w:right w:val="nil"/>
+            </w:tcBorders>
+            <w:shd w:val="clear" w:color="000000" w:fill="FEFC9C"/>
+            <w:noWrap/>
+            <w:vAlign w:val="bottom"/>
+            <w:hideMark/>
+          </w:tcPr>
+          <w:p>
+            <w:pPr>
+              <w:spacing w:after="0" w:line="240" w:lineRule="auto"/>
+              <w:jc w:val="center"/>
+              <w:rPr>
+                <w:rFonts w:ascii="Calibri" w:eastAsia="Times New Roman" w:hAnsi="Calibri" w:cs="Calibri"/>
+                <w:b/>
+                <w:bCs/>
+                <w:color w:val="000000"/>
+                <w:lang w:eastAsia="pt-BR"/>
+              </w:rPr>
+            </w:pPr>
+            <w:r>
+              <w:rPr>
+                <w:rFonts w:ascii="Calibri" w:eastAsia="Times New Roman" w:hAnsi="Calibri" w:cs="Calibri"/>
+                <w:b/>
+                <w:bCs/>
+                <w:color w:val="000000"/>
+                <w:lang w:eastAsia="pt-BR"/>
+              </w:rPr>
+              <w:t> </w:t>
+            </w:r>
+          </w:p>
+        </w:tc>
+        <w:tc>
+          <w:tcPr>
+            <w:tcW w:w="663" w:type="dxa"/>
+            <w:tcBorders>
+              <w:top w:val="nil"/>
+              <w:left w:val="nil"/>
+              <w:bottom w:val="single" w:sz="4" w:space="0" w:color="auto"/>
+              <w:right w:val="single" w:sz="4" w:space="0" w:color="auto"/>
+            </w:tcBorders>
+            <w:shd w:val="clear" w:color="000000" w:fill="FEFC9C"/>
+            <w:noWrap/>
+            <w:vAlign w:val="bottom"/>
+            <w:hideMark/>
+          </w:tcPr>
+          <w:p>
+            <w:pPr>
+              <w:spacing w:after="0" w:line="240" w:lineRule="auto"/>
+              <w:jc w:val="center"/>
+              <w:rPr>
+                <w:rFonts w:ascii="Calibri" w:eastAsia="Times New Roman" w:hAnsi="Calibri" w:cs="Calibri"/>
+                <w:b/>
+                <w:bCs/>
+                <w:color w:val="000000"/>
+                <w:lang w:eastAsia="pt-BR"/>
+              </w:rPr>
+            </w:pPr>
+            <w:r>
+              <w:rPr>
+                <w:rFonts w:ascii="Calibri" w:eastAsia="Times New Roman" w:hAnsi="Calibri" w:cs="Calibri"/>
+                <w:b/>
+                <w:bCs/>
+                <w:color w:val="000000"/>
+                <w:lang w:eastAsia="pt-BR"/>
+              </w:rPr>
+              <w:t> </w:t>
+            </w:r>
+          </w:p>
+        </w:tc>
+      </w:tr>
+      <w:tr>
+        <w:trPr>
+          <w:trHeight w:val="288"/>
+        </w:trPr>
+        <w:tc>
+          <w:tcPr>
+            <w:tcW w:w="5791" w:type="dxa"/>
+            <w:tcBorders>
+              <w:top w:val="nil"/>
+              <w:left w:val="single" w:sz="4" w:space="0" w:color="auto"/>
+              <w:bottom w:val="single" w:sz="4" w:space="0" w:color="auto"/>
+              <w:right w:val="single" w:sz="4" w:space="0" w:color="auto"/>
+            </w:tcBorders>
+            <w:shd w:val="clear" w:color="auto" w:fill="auto"/>
+            <w:noWrap/>
+            <w:vAlign w:val="bottom"/>
+            <w:hideMark/>
+          </w:tcPr>
+          <w:p>
+            <w:pPr>
+              <w:spacing w:after="0" w:line="240" w:lineRule="auto"/>
+              <w:rPr>
+                <w:rFonts w:ascii="Calibri" w:eastAsia="Times New Roman" w:hAnsi="Calibri" w:cs="Calibri"/>
+                <w:color w:val="000000"/>
+                <w:lang w:eastAsia="pt-BR"/>
+              </w:rPr>
+            </w:pPr>
+            <w:r>
+              <w:rPr>
+                <w:rFonts w:ascii="Calibri" w:eastAsia="Times New Roman" w:hAnsi="Calibri" w:cs="Calibri"/>
+                <w:color w:val="000000"/>
+                <w:lang w:eastAsia="pt-BR"/>
+              </w:rPr>
+              <w:t>Programação Back-</w:t>
+            </w:r>
+            <w:proofErr w:type="spellStart"/>
+            <w:r>
+              <w:rPr>
+                <w:rFonts w:ascii="Calibri" w:eastAsia="Times New Roman" w:hAnsi="Calibri" w:cs="Calibri"/>
+                <w:color w:val="000000"/>
+                <w:lang w:eastAsia="pt-BR"/>
+              </w:rPr>
+              <w:t>End</w:t>
+            </w:r>
+            <w:proofErr w:type="spellEnd"/>
+          </w:p>
+        </w:tc>
+        <w:tc>
+          <w:tcPr>
+            <w:tcW w:w="1301" w:type="dxa"/>
+            <w:tcBorders>
+              <w:top w:val="single" w:sz="4" w:space="0" w:color="auto"/>
+              <w:left w:val="single" w:sz="4" w:space="0" w:color="auto"/>
+              <w:bottom w:val="single" w:sz="4" w:space="0" w:color="auto"/>
+              <w:right w:val="single" w:sz="4" w:space="0" w:color="auto"/>
+            </w:tcBorders>
+            <w:shd w:val="clear" w:color="000000" w:fill="FFB7B7"/>
+            <w:noWrap/>
+            <w:vAlign w:val="center"/>
+            <w:hideMark/>
+          </w:tcPr>
+          <w:p>
+            <w:pPr>
+              <w:spacing w:after="0" w:line="240" w:lineRule="auto"/>
+              <w:jc w:val="center"/>
+              <w:rPr>
+                <w:rFonts w:ascii="Calibri" w:eastAsia="Times New Roman" w:hAnsi="Calibri" w:cs="Calibri"/>
+                <w:color w:val="C00000"/>
+                <w:lang w:eastAsia="pt-BR"/>
+              </w:rPr>
+            </w:pPr>
+            <w:r>
+              <w:rPr>
+                <w:rFonts w:ascii="Calibri" w:eastAsia="Times New Roman" w:hAnsi="Calibri" w:cs="Calibri"/>
+                <w:color w:val="C00000"/>
+                <w:lang w:eastAsia="pt-BR"/>
+              </w:rPr>
+              <w:t>A FAZER</w:t>
+            </w:r>
+          </w:p>
+        </w:tc>
+        <w:tc>
+          <w:tcPr>
+            <w:tcW w:w="605" w:type="dxa"/>
+            <w:tcBorders>
+              <w:top w:val="nil"/>
+              <w:left w:val="nil"/>
+              <w:bottom w:val="single" w:sz="4" w:space="0" w:color="auto"/>
+              <w:right w:val="single" w:sz="4" w:space="0" w:color="auto"/>
+            </w:tcBorders>
+            <w:shd w:val="clear" w:color="auto" w:fill="auto"/>
+            <w:noWrap/>
+            <w:vAlign w:val="bottom"/>
+            <w:hideMark/>
+          </w:tcPr>
+          <w:p>
+            <w:pPr>
+              <w:spacing w:after="0" w:line="240" w:lineRule="auto"/>
+              <w:jc w:val="right"/>
+              <w:rPr>
+                <w:rFonts w:ascii="Calibri" w:eastAsia="Times New Roman" w:hAnsi="Calibri" w:cs="Calibri"/>
+                <w:color w:val="000000"/>
+                <w:lang w:eastAsia="pt-BR"/>
+              </w:rPr>
+            </w:pPr>
+            <w:r>
+              <w:rPr>
+                <w:rFonts w:ascii="Calibri" w:eastAsia="Times New Roman" w:hAnsi="Calibri" w:cs="Calibri"/>
+                <w:color w:val="000000"/>
+                <w:lang w:eastAsia="pt-BR"/>
+              </w:rPr>
+              <w:t>0%</w:t>
+            </w:r>
+          </w:p>
+        </w:tc>
+        <w:tc>
+          <w:tcPr>
+            <w:tcW w:w="663" w:type="dxa"/>
+            <w:tcBorders>
+              <w:top w:val="nil"/>
+              <w:left w:val="nil"/>
+              <w:bottom w:val="single" w:sz="4" w:space="0" w:color="auto"/>
+              <w:right w:val="single" w:sz="4" w:space="0" w:color="auto"/>
+            </w:tcBorders>
+            <w:shd w:val="clear" w:color="auto" w:fill="auto"/>
+            <w:noWrap/>
+            <w:vAlign w:val="bottom"/>
+            <w:hideMark/>
+          </w:tcPr>
+          <w:p>
+            <w:pPr>
+              <w:spacing w:after="0" w:line="240" w:lineRule="auto"/>
+              <w:jc w:val="right"/>
+              <w:rPr>
+                <w:rFonts w:ascii="Calibri" w:eastAsia="Times New Roman" w:hAnsi="Calibri" w:cs="Calibri"/>
+                <w:color w:val="000000"/>
+                <w:lang w:eastAsia="pt-BR"/>
+              </w:rPr>
+            </w:pPr>
+            <w:r>
+              <w:rPr>
+                <w:rFonts w:ascii="Calibri" w:eastAsia="Times New Roman" w:hAnsi="Calibri" w:cs="Calibri"/>
+                <w:color w:val="000000"/>
+                <w:lang w:eastAsia="pt-BR"/>
+              </w:rPr>
+              <w:t>100%</w:t>
+            </w:r>
+          </w:p>
+        </w:tc>
+      </w:tr>
+      <w:tr>
+        <w:trPr>
+          <w:trHeight w:val="288"/>
+        </w:trPr>
+        <w:tc>
+          <w:tcPr>
+            <w:tcW w:w="5791" w:type="dxa"/>
+            <w:tcBorders>
+              <w:top w:val="nil"/>
+              <w:left w:val="single" w:sz="4" w:space="0" w:color="auto"/>
+              <w:bottom w:val="single" w:sz="4" w:space="0" w:color="auto"/>
+              <w:right w:val="single" w:sz="4" w:space="0" w:color="auto"/>
+            </w:tcBorders>
+            <w:shd w:val="clear" w:color="auto" w:fill="auto"/>
+            <w:noWrap/>
+            <w:vAlign w:val="bottom"/>
+            <w:hideMark/>
+          </w:tcPr>
+          <w:p>
+            <w:pPr>
+              <w:spacing w:after="0" w:line="240" w:lineRule="auto"/>
+              <w:rPr>
+                <w:rFonts w:ascii="Calibri" w:eastAsia="Times New Roman" w:hAnsi="Calibri" w:cs="Calibri"/>
+                <w:color w:val="000000"/>
+                <w:lang w:eastAsia="pt-BR"/>
+              </w:rPr>
+            </w:pPr>
+            <w:r>
+              <w:rPr>
+                <w:rFonts w:ascii="Calibri" w:eastAsia="Times New Roman" w:hAnsi="Calibri" w:cs="Calibri"/>
+                <w:color w:val="000000"/>
+                <w:lang w:eastAsia="pt-BR"/>
+              </w:rPr>
+              <w:t>Código fonte do programa</w:t>
+            </w:r>
+          </w:p>
+        </w:tc>
+        <w:tc>
+          <w:tcPr>
+            <w:tcW w:w="1301" w:type="dxa"/>
+            <w:tcBorders>
+              <w:top w:val="single" w:sz="4" w:space="0" w:color="auto"/>
+              <w:left w:val="single" w:sz="4" w:space="0" w:color="auto"/>
+              <w:bottom w:val="single" w:sz="4" w:space="0" w:color="auto"/>
+              <w:right w:val="single" w:sz="4" w:space="0" w:color="auto"/>
+            </w:tcBorders>
+            <w:shd w:val="clear" w:color="000000" w:fill="FFB7B7"/>
+            <w:noWrap/>
+            <w:vAlign w:val="center"/>
+            <w:hideMark/>
+          </w:tcPr>
+          <w:p>
+            <w:pPr>
+              <w:spacing w:after="0" w:line="240" w:lineRule="auto"/>
+              <w:jc w:val="center"/>
+              <w:rPr>
+                <w:rFonts w:ascii="Calibri" w:eastAsia="Times New Roman" w:hAnsi="Calibri" w:cs="Calibri"/>
+                <w:color w:val="C00000"/>
+                <w:lang w:eastAsia="pt-BR"/>
+              </w:rPr>
+            </w:pPr>
+            <w:r>
+              <w:rPr>
+                <w:rFonts w:ascii="Calibri" w:eastAsia="Times New Roman" w:hAnsi="Calibri" w:cs="Calibri"/>
+                <w:color w:val="C00000"/>
+                <w:lang w:eastAsia="pt-BR"/>
+              </w:rPr>
+              <w:t>A FAZER</w:t>
+            </w:r>
+          </w:p>
+        </w:tc>
+        <w:tc>
+          <w:tcPr>
+            <w:tcW w:w="605" w:type="dxa"/>
+            <w:tcBorders>
+              <w:top w:val="nil"/>
+              <w:left w:val="nil"/>
+              <w:bottom w:val="single" w:sz="4" w:space="0" w:color="auto"/>
+              <w:right w:val="single" w:sz="4" w:space="0" w:color="auto"/>
+            </w:tcBorders>
+            <w:shd w:val="clear" w:color="auto" w:fill="auto"/>
+            <w:noWrap/>
+            <w:vAlign w:val="bottom"/>
+            <w:hideMark/>
+          </w:tcPr>
+          <w:p>
+            <w:pPr>
+              <w:spacing w:after="0" w:line="240" w:lineRule="auto"/>
+              <w:jc w:val="right"/>
+              <w:rPr>
+                <w:rFonts w:ascii="Calibri" w:eastAsia="Times New Roman" w:hAnsi="Calibri" w:cs="Calibri"/>
+                <w:color w:val="000000"/>
+                <w:lang w:eastAsia="pt-BR"/>
+              </w:rPr>
+            </w:pPr>
+            <w:r>
+              <w:rPr>
+                <w:rFonts w:ascii="Calibri" w:eastAsia="Times New Roman" w:hAnsi="Calibri" w:cs="Calibri"/>
+                <w:color w:val="000000"/>
+                <w:lang w:eastAsia="pt-BR"/>
+              </w:rPr>
+              <w:t>0%</w:t>
+            </w:r>
+          </w:p>
+        </w:tc>
+        <w:tc>
+          <w:tcPr>
+            <w:tcW w:w="663" w:type="dxa"/>
+            <w:tcBorders>
+              <w:top w:val="nil"/>
+              <w:left w:val="nil"/>
+              <w:bottom w:val="single" w:sz="4" w:space="0" w:color="auto"/>
+              <w:right w:val="single" w:sz="4" w:space="0" w:color="auto"/>
+            </w:tcBorders>
+            <w:shd w:val="clear" w:color="auto" w:fill="auto"/>
+            <w:noWrap/>
+            <w:vAlign w:val="bottom"/>
+            <w:hideMark/>
+          </w:tcPr>
+          <w:p>
+            <w:pPr>
+              <w:spacing w:after="0" w:line="240" w:lineRule="auto"/>
+              <w:jc w:val="right"/>
+              <w:rPr>
+                <w:rFonts w:ascii="Calibri" w:eastAsia="Times New Roman" w:hAnsi="Calibri" w:cs="Calibri"/>
+                <w:color w:val="000000"/>
+                <w:lang w:eastAsia="pt-BR"/>
+              </w:rPr>
+            </w:pPr>
+            <w:r>
+              <w:rPr>
+                <w:rFonts w:ascii="Calibri" w:eastAsia="Times New Roman" w:hAnsi="Calibri" w:cs="Calibri"/>
+                <w:color w:val="000000"/>
+                <w:lang w:eastAsia="pt-BR"/>
+              </w:rPr>
+              <w:t>100%</w:t>
+            </w:r>
+          </w:p>
+        </w:tc>
+      </w:tr>
+      <w:tr>
+        <w:trPr>
+          <w:trHeight w:val="288"/>
+        </w:trPr>
+        <w:tc>
+          <w:tcPr>
+            <w:tcW w:w="5791" w:type="dxa"/>
+            <w:tcBorders>
+              <w:top w:val="nil"/>
+              <w:left w:val="single" w:sz="4" w:space="0" w:color="auto"/>
+              <w:bottom w:val="single" w:sz="4" w:space="0" w:color="auto"/>
+              <w:right w:val="single" w:sz="4" w:space="0" w:color="auto"/>
+            </w:tcBorders>
+            <w:shd w:val="clear" w:color="auto" w:fill="auto"/>
+            <w:noWrap/>
+            <w:vAlign w:val="bottom"/>
+            <w:hideMark/>
+          </w:tcPr>
+          <w:p>
+            <w:pPr>
+              <w:spacing w:after="0" w:line="240" w:lineRule="auto"/>
+              <w:rPr>
+                <w:rFonts w:ascii="Calibri" w:eastAsia="Times New Roman" w:hAnsi="Calibri" w:cs="Calibri"/>
+                <w:color w:val="000000"/>
+                <w:lang w:eastAsia="pt-BR"/>
+              </w:rPr>
+            </w:pPr>
+            <w:r>
+              <w:rPr>
+                <w:rFonts w:ascii="Calibri" w:eastAsia="Times New Roman" w:hAnsi="Calibri" w:cs="Calibri"/>
+                <w:color w:val="000000"/>
+                <w:lang w:eastAsia="pt-BR"/>
+              </w:rPr>
+              <w:t>Documentação final</w:t>
+            </w:r>
+          </w:p>
+        </w:tc>
+        <w:tc>
+          <w:tcPr>
+            <w:tcW w:w="1301" w:type="dxa"/>
+            <w:tcBorders>
+              <w:top w:val="nil"/>
+              <w:left w:val="single" w:sz="4" w:space="0" w:color="auto"/>
+              <w:bottom w:val="single" w:sz="4" w:space="0" w:color="auto"/>
+              <w:right w:val="single" w:sz="4" w:space="0" w:color="auto"/>
+            </w:tcBorders>
+            <w:shd w:val="clear" w:color="000000" w:fill="FFB7B7"/>
+            <w:noWrap/>
+            <w:vAlign w:val="center"/>
+            <w:hideMark/>
+          </w:tcPr>
+          <w:p>
+            <w:pPr>
+              <w:spacing w:after="0" w:line="240" w:lineRule="auto"/>
+              <w:jc w:val="center"/>
+              <w:rPr>
+                <w:rFonts w:ascii="Calibri" w:eastAsia="Times New Roman" w:hAnsi="Calibri" w:cs="Calibri"/>
+                <w:color w:val="C00000"/>
+                <w:lang w:eastAsia="pt-BR"/>
+              </w:rPr>
+            </w:pPr>
+            <w:r>
+              <w:rPr>
+                <w:rFonts w:ascii="Calibri" w:eastAsia="Times New Roman" w:hAnsi="Calibri" w:cs="Calibri"/>
+                <w:color w:val="C00000"/>
+                <w:lang w:eastAsia="pt-BR"/>
+              </w:rPr>
+              <w:t>A FAZER</w:t>
+            </w:r>
+          </w:p>
+        </w:tc>
+        <w:tc>
+          <w:tcPr>
+            <w:tcW w:w="605" w:type="dxa"/>
+            <w:tcBorders>
+              <w:top w:val="nil"/>
+              <w:left w:val="nil"/>
+              <w:bottom w:val="single" w:sz="4" w:space="0" w:color="auto"/>
+              <w:right w:val="single" w:sz="4" w:space="0" w:color="auto"/>
+            </w:tcBorders>
+            <w:shd w:val="clear" w:color="auto" w:fill="auto"/>
+            <w:noWrap/>
+            <w:vAlign w:val="bottom"/>
+            <w:hideMark/>
+          </w:tcPr>
+          <w:p>
+            <w:pPr>
+              <w:spacing w:after="0" w:line="240" w:lineRule="auto"/>
+              <w:jc w:val="right"/>
+              <w:rPr>
+                <w:rFonts w:ascii="Calibri" w:eastAsia="Times New Roman" w:hAnsi="Calibri" w:cs="Calibri"/>
+                <w:color w:val="000000"/>
+                <w:lang w:eastAsia="pt-BR"/>
+              </w:rPr>
+            </w:pPr>
+            <w:r>
+              <w:rPr>
+                <w:rFonts w:ascii="Calibri" w:eastAsia="Times New Roman" w:hAnsi="Calibri" w:cs="Calibri"/>
+                <w:color w:val="000000"/>
+                <w:lang w:eastAsia="pt-BR"/>
+              </w:rPr>
+              <w:t>0%</w:t>
+            </w:r>
+          </w:p>
+        </w:tc>
+        <w:tc>
+          <w:tcPr>
+            <w:tcW w:w="663" w:type="dxa"/>
+            <w:tcBorders>
+              <w:top w:val="nil"/>
+              <w:left w:val="nil"/>
+              <w:bottom w:val="single" w:sz="4" w:space="0" w:color="auto"/>
+              <w:right w:val="single" w:sz="4" w:space="0" w:color="auto"/>
+            </w:tcBorders>
+            <w:shd w:val="clear" w:color="auto" w:fill="auto"/>
+            <w:noWrap/>
+            <w:vAlign w:val="bottom"/>
+            <w:hideMark/>
+          </w:tcPr>
+          <w:p>
+            <w:pPr>
+              <w:spacing w:after="0" w:line="240" w:lineRule="auto"/>
+              <w:jc w:val="right"/>
+              <w:rPr>
+                <w:rFonts w:ascii="Calibri" w:eastAsia="Times New Roman" w:hAnsi="Calibri" w:cs="Calibri"/>
+                <w:color w:val="000000"/>
+                <w:lang w:eastAsia="pt-BR"/>
+              </w:rPr>
+            </w:pPr>
+            <w:r>
+              <w:rPr>
+                <w:rFonts w:ascii="Calibri" w:eastAsia="Times New Roman" w:hAnsi="Calibri" w:cs="Calibri"/>
+                <w:color w:val="000000"/>
+                <w:lang w:eastAsia="pt-BR"/>
+              </w:rPr>
+              <w:t>100%</w:t>
+            </w:r>
+          </w:p>
+        </w:tc>
+      </w:tr>
+      <w:tr>
+        <w:trPr>
+          <w:trHeight w:val="288"/>
+        </w:trPr>
+        <w:tc>
+          <w:tcPr>
+            <w:tcW w:w="5791" w:type="dxa"/>
+            <w:tcBorders>
+              <w:top w:val="nil"/>
+              <w:left w:val="single" w:sz="4" w:space="0" w:color="auto"/>
+              <w:bottom w:val="single" w:sz="4" w:space="0" w:color="auto"/>
+              <w:right w:val="nil"/>
+            </w:tcBorders>
+            <w:shd w:val="clear" w:color="000000" w:fill="FEFC9C"/>
+            <w:noWrap/>
+            <w:vAlign w:val="bottom"/>
+            <w:hideMark/>
+          </w:tcPr>
+          <w:p>
+            <w:pPr>
+              <w:spacing w:after="0" w:line="240" w:lineRule="auto"/>
+              <w:jc w:val="center"/>
+              <w:rPr>
+                <w:rFonts w:ascii="Calibri" w:eastAsia="Times New Roman" w:hAnsi="Calibri" w:cs="Calibri"/>
+                <w:b/>
+                <w:bCs/>
+                <w:color w:val="000000"/>
+                <w:lang w:eastAsia="pt-BR"/>
+              </w:rPr>
+            </w:pPr>
+            <w:r>
+              <w:rPr>
+                <w:rFonts w:ascii="Calibri" w:eastAsia="Times New Roman" w:hAnsi="Calibri" w:cs="Calibri"/>
+                <w:b/>
+                <w:bCs/>
+                <w:color w:val="000000"/>
+                <w:lang w:eastAsia="pt-BR"/>
+              </w:rPr>
+              <w:t>SPRINT 04</w:t>
+            </w:r>
+          </w:p>
+        </w:tc>
+        <w:tc>
+          <w:tcPr>
+            <w:tcW w:w="1301" w:type="dxa"/>
+            <w:tcBorders>
+              <w:top w:val="nil"/>
+              <w:left w:val="nil"/>
+              <w:bottom w:val="single" w:sz="4" w:space="0" w:color="auto"/>
+              <w:right w:val="nil"/>
+            </w:tcBorders>
+            <w:shd w:val="clear" w:color="000000" w:fill="FEFC9C"/>
+            <w:noWrap/>
+            <w:vAlign w:val="bottom"/>
+            <w:hideMark/>
+          </w:tcPr>
+          <w:p>
+            <w:pPr>
+              <w:spacing w:after="0" w:line="240" w:lineRule="auto"/>
+              <w:jc w:val="center"/>
+              <w:rPr>
+                <w:rFonts w:ascii="Calibri" w:eastAsia="Times New Roman" w:hAnsi="Calibri" w:cs="Calibri"/>
+                <w:b/>
+                <w:bCs/>
+                <w:color w:val="000000"/>
+                <w:lang w:eastAsia="pt-BR"/>
+              </w:rPr>
+            </w:pPr>
+            <w:r>
+              <w:rPr>
+                <w:rFonts w:ascii="Calibri" w:eastAsia="Times New Roman" w:hAnsi="Calibri" w:cs="Calibri"/>
+                <w:b/>
+                <w:bCs/>
+                <w:color w:val="000000"/>
+                <w:lang w:eastAsia="pt-BR"/>
+              </w:rPr>
+              <w:t> </w:t>
+            </w:r>
+          </w:p>
+        </w:tc>
+        <w:tc>
+          <w:tcPr>
+            <w:tcW w:w="605" w:type="dxa"/>
+            <w:tcBorders>
+              <w:top w:val="nil"/>
+              <w:left w:val="nil"/>
+              <w:bottom w:val="single" w:sz="4" w:space="0" w:color="auto"/>
+              <w:right w:val="nil"/>
+            </w:tcBorders>
+            <w:shd w:val="clear" w:color="000000" w:fill="FEFC9C"/>
+            <w:noWrap/>
+            <w:vAlign w:val="bottom"/>
+            <w:hideMark/>
+          </w:tcPr>
+          <w:p>
+            <w:pPr>
+              <w:spacing w:after="0" w:line="240" w:lineRule="auto"/>
+              <w:jc w:val="center"/>
+              <w:rPr>
+                <w:rFonts w:ascii="Calibri" w:eastAsia="Times New Roman" w:hAnsi="Calibri" w:cs="Calibri"/>
+                <w:b/>
+                <w:bCs/>
+                <w:color w:val="000000"/>
+                <w:lang w:eastAsia="pt-BR"/>
+              </w:rPr>
+            </w:pPr>
+            <w:r>
+              <w:rPr>
+                <w:rFonts w:ascii="Calibri" w:eastAsia="Times New Roman" w:hAnsi="Calibri" w:cs="Calibri"/>
+                <w:b/>
+                <w:bCs/>
+                <w:color w:val="000000"/>
+                <w:lang w:eastAsia="pt-BR"/>
+              </w:rPr>
+              <w:t> </w:t>
+            </w:r>
+          </w:p>
+        </w:tc>
+        <w:tc>
+          <w:tcPr>
+            <w:tcW w:w="663" w:type="dxa"/>
+            <w:tcBorders>
+              <w:top w:val="nil"/>
+              <w:left w:val="nil"/>
+              <w:bottom w:val="single" w:sz="4" w:space="0" w:color="auto"/>
+              <w:right w:val="single" w:sz="4" w:space="0" w:color="auto"/>
+            </w:tcBorders>
+            <w:shd w:val="clear" w:color="000000" w:fill="FEFC9C"/>
+            <w:noWrap/>
+            <w:vAlign w:val="bottom"/>
+            <w:hideMark/>
+          </w:tcPr>
+          <w:p>
+            <w:pPr>
+              <w:spacing w:after="0" w:line="240" w:lineRule="auto"/>
+              <w:jc w:val="center"/>
+              <w:rPr>
+                <w:rFonts w:ascii="Calibri" w:eastAsia="Times New Roman" w:hAnsi="Calibri" w:cs="Calibri"/>
+                <w:b/>
+                <w:bCs/>
+                <w:color w:val="000000"/>
+                <w:lang w:eastAsia="pt-BR"/>
+              </w:rPr>
+            </w:pPr>
+            <w:r>
+              <w:rPr>
+                <w:rFonts w:ascii="Calibri" w:eastAsia="Times New Roman" w:hAnsi="Calibri" w:cs="Calibri"/>
+                <w:b/>
+                <w:bCs/>
+                <w:color w:val="000000"/>
+                <w:lang w:eastAsia="pt-BR"/>
+              </w:rPr>
+              <w:t> </w:t>
+            </w:r>
+          </w:p>
+        </w:tc>
+      </w:tr>
+      <w:tr>
+        <w:trPr>
+          <w:trHeight w:val="288"/>
+        </w:trPr>
+        <w:tc>
+          <w:tcPr>
+            <w:tcW w:w="5791" w:type="dxa"/>
+            <w:tcBorders>
+              <w:top w:val="nil"/>
+              <w:left w:val="single" w:sz="4" w:space="0" w:color="auto"/>
+              <w:bottom w:val="nil"/>
+              <w:right w:val="single" w:sz="4" w:space="0" w:color="auto"/>
+            </w:tcBorders>
+            <w:shd w:val="clear" w:color="auto" w:fill="auto"/>
+            <w:noWrap/>
+            <w:vAlign w:val="bottom"/>
+            <w:hideMark/>
+          </w:tcPr>
+          <w:p>
+            <w:pPr>
+              <w:spacing w:after="0" w:line="240" w:lineRule="auto"/>
+              <w:rPr>
+                <w:rFonts w:ascii="Calibri" w:eastAsia="Times New Roman" w:hAnsi="Calibri" w:cs="Calibri"/>
+                <w:color w:val="000000"/>
+                <w:lang w:eastAsia="pt-BR"/>
+              </w:rPr>
+            </w:pPr>
+            <w:r>
+              <w:rPr>
+                <w:rFonts w:ascii="Calibri" w:eastAsia="Times New Roman" w:hAnsi="Calibri" w:cs="Calibri"/>
+                <w:color w:val="000000"/>
+                <w:lang w:eastAsia="pt-BR"/>
+              </w:rPr>
+              <w:t>Projeto Final do Semestre</w:t>
+            </w:r>
+          </w:p>
+        </w:tc>
+        <w:tc>
+          <w:tcPr>
+            <w:tcW w:w="1301" w:type="dxa"/>
+            <w:tcBorders>
+              <w:top w:val="single" w:sz="4" w:space="0" w:color="auto"/>
+              <w:left w:val="single" w:sz="4" w:space="0" w:color="auto"/>
+              <w:bottom w:val="nil"/>
+              <w:right w:val="single" w:sz="4" w:space="0" w:color="auto"/>
+            </w:tcBorders>
+            <w:shd w:val="clear" w:color="000000" w:fill="FFB7B7"/>
+            <w:noWrap/>
+            <w:vAlign w:val="center"/>
+            <w:hideMark/>
+          </w:tcPr>
+          <w:p>
+            <w:pPr>
+              <w:spacing w:after="0" w:line="240" w:lineRule="auto"/>
+              <w:jc w:val="center"/>
+              <w:rPr>
+                <w:rFonts w:ascii="Calibri" w:eastAsia="Times New Roman" w:hAnsi="Calibri" w:cs="Calibri"/>
+                <w:color w:val="C00000"/>
+                <w:lang w:eastAsia="pt-BR"/>
+              </w:rPr>
+            </w:pPr>
+            <w:r>
+              <w:rPr>
+                <w:rFonts w:ascii="Calibri" w:eastAsia="Times New Roman" w:hAnsi="Calibri" w:cs="Calibri"/>
+                <w:color w:val="C00000"/>
+                <w:lang w:eastAsia="pt-BR"/>
+              </w:rPr>
+              <w:t>A FAZER</w:t>
+            </w:r>
+          </w:p>
+        </w:tc>
+        <w:tc>
+          <w:tcPr>
+            <w:tcW w:w="605" w:type="dxa"/>
+            <w:tcBorders>
+              <w:top w:val="nil"/>
+              <w:left w:val="nil"/>
+              <w:bottom w:val="nil"/>
+              <w:right w:val="single" w:sz="4" w:space="0" w:color="auto"/>
+            </w:tcBorders>
+            <w:shd w:val="clear" w:color="auto" w:fill="auto"/>
+            <w:noWrap/>
+            <w:vAlign w:val="bottom"/>
+            <w:hideMark/>
+          </w:tcPr>
+          <w:p>
+            <w:pPr>
+              <w:spacing w:after="0" w:line="240" w:lineRule="auto"/>
+              <w:jc w:val="right"/>
+              <w:rPr>
+                <w:rFonts w:ascii="Calibri" w:eastAsia="Times New Roman" w:hAnsi="Calibri" w:cs="Calibri"/>
+                <w:color w:val="000000"/>
+                <w:lang w:eastAsia="pt-BR"/>
+              </w:rPr>
+            </w:pPr>
+            <w:r>
+              <w:rPr>
+                <w:rFonts w:ascii="Calibri" w:eastAsia="Times New Roman" w:hAnsi="Calibri" w:cs="Calibri"/>
+                <w:color w:val="000000"/>
+                <w:lang w:eastAsia="pt-BR"/>
+              </w:rPr>
+              <w:t>0%</w:t>
+            </w:r>
+          </w:p>
+        </w:tc>
+        <w:tc>
+          <w:tcPr>
+            <w:tcW w:w="663" w:type="dxa"/>
+            <w:tcBorders>
+              <w:top w:val="nil"/>
+              <w:left w:val="nil"/>
+              <w:bottom w:val="nil"/>
+              <w:right w:val="single" w:sz="4" w:space="0" w:color="auto"/>
+            </w:tcBorders>
+            <w:shd w:val="clear" w:color="auto" w:fill="auto"/>
+            <w:noWrap/>
+            <w:vAlign w:val="bottom"/>
+            <w:hideMark/>
+          </w:tcPr>
+          <w:p>
+            <w:pPr>
+              <w:spacing w:after="0" w:line="240" w:lineRule="auto"/>
+              <w:jc w:val="right"/>
+              <w:rPr>
+                <w:rFonts w:ascii="Calibri" w:eastAsia="Times New Roman" w:hAnsi="Calibri" w:cs="Calibri"/>
+                <w:color w:val="000000"/>
+                <w:lang w:eastAsia="pt-BR"/>
+              </w:rPr>
+            </w:pPr>
+            <w:r>
+              <w:rPr>
+                <w:rFonts w:ascii="Calibri" w:eastAsia="Times New Roman" w:hAnsi="Calibri" w:cs="Calibri"/>
+                <w:color w:val="000000"/>
+                <w:lang w:eastAsia="pt-BR"/>
+              </w:rPr>
+              <w:t>100%</w:t>
+            </w:r>
+          </w:p>
+        </w:tc>
+      </w:tr>
+      <w:tr>
+        <w:trPr>
+          <w:trHeight w:val="288"/>
+        </w:trPr>
+        <w:tc>
+          <w:tcPr>
+            <w:tcW w:w="5791" w:type="dxa"/>
+            <w:tcBorders>
+              <w:top w:val="single" w:sz="4" w:space="0" w:color="auto"/>
+              <w:left w:val="single" w:sz="4" w:space="0" w:color="auto"/>
+              <w:bottom w:val="single" w:sz="4" w:space="0" w:color="auto"/>
+              <w:right w:val="single" w:sz="4" w:space="0" w:color="auto"/>
+            </w:tcBorders>
+            <w:shd w:val="clear" w:color="auto" w:fill="auto"/>
+            <w:noWrap/>
+            <w:vAlign w:val="bottom"/>
+            <w:hideMark/>
+          </w:tcPr>
+          <w:p>
+            <w:pPr>
+              <w:spacing w:after="0" w:line="240" w:lineRule="auto"/>
+              <w:rPr>
+                <w:rFonts w:ascii="Calibri" w:eastAsia="Times New Roman" w:hAnsi="Calibri" w:cs="Calibri"/>
+                <w:color w:val="000000"/>
+                <w:lang w:eastAsia="pt-BR"/>
+              </w:rPr>
+            </w:pPr>
+            <w:r>
+              <w:rPr>
+                <w:rFonts w:ascii="Calibri" w:eastAsia="Times New Roman" w:hAnsi="Calibri" w:cs="Calibri"/>
+                <w:color w:val="000000"/>
+                <w:lang w:eastAsia="pt-BR"/>
+              </w:rPr>
+              <w:t>Relatório Final.</w:t>
+            </w:r>
+          </w:p>
+        </w:tc>
+        <w:tc>
+          <w:tcPr>
+            <w:tcW w:w="1301" w:type="dxa"/>
+            <w:tcBorders>
+              <w:top w:val="single" w:sz="4" w:space="0" w:color="auto"/>
+              <w:left w:val="single" w:sz="4" w:space="0" w:color="auto"/>
+              <w:bottom w:val="single" w:sz="4" w:space="0" w:color="auto"/>
+              <w:right w:val="single" w:sz="4" w:space="0" w:color="auto"/>
+            </w:tcBorders>
+            <w:shd w:val="clear" w:color="000000" w:fill="FFB7B7"/>
+            <w:noWrap/>
+            <w:vAlign w:val="center"/>
+            <w:hideMark/>
+          </w:tcPr>
+          <w:p>
+            <w:pPr>
+              <w:spacing w:after="0" w:line="240" w:lineRule="auto"/>
+              <w:jc w:val="center"/>
+              <w:rPr>
+                <w:rFonts w:ascii="Calibri" w:eastAsia="Times New Roman" w:hAnsi="Calibri" w:cs="Calibri"/>
+                <w:color w:val="C00000"/>
+                <w:lang w:eastAsia="pt-BR"/>
+              </w:rPr>
+            </w:pPr>
+            <w:r>
+              <w:rPr>
+                <w:rFonts w:ascii="Calibri" w:eastAsia="Times New Roman" w:hAnsi="Calibri" w:cs="Calibri"/>
+                <w:color w:val="C00000"/>
+                <w:lang w:eastAsia="pt-BR"/>
+              </w:rPr>
+              <w:t>A FAZER</w:t>
+            </w:r>
+          </w:p>
+        </w:tc>
+        <w:tc>
+          <w:tcPr>
+            <w:tcW w:w="605" w:type="dxa"/>
+            <w:tcBorders>
+              <w:top w:val="single" w:sz="4" w:space="0" w:color="auto"/>
+              <w:left w:val="nil"/>
+              <w:bottom w:val="single" w:sz="4" w:space="0" w:color="auto"/>
+              <w:right w:val="single" w:sz="4" w:space="0" w:color="auto"/>
+            </w:tcBorders>
+            <w:shd w:val="clear" w:color="auto" w:fill="auto"/>
+            <w:noWrap/>
+            <w:vAlign w:val="bottom"/>
+            <w:hideMark/>
+          </w:tcPr>
+          <w:p>
+            <w:pPr>
+              <w:spacing w:after="0" w:line="240" w:lineRule="auto"/>
+              <w:jc w:val="right"/>
+              <w:rPr>
+                <w:rFonts w:ascii="Calibri" w:eastAsia="Times New Roman" w:hAnsi="Calibri" w:cs="Calibri"/>
+                <w:color w:val="000000"/>
+                <w:lang w:eastAsia="pt-BR"/>
+              </w:rPr>
+            </w:pPr>
+            <w:r>
+              <w:rPr>
+                <w:rFonts w:ascii="Calibri" w:eastAsia="Times New Roman" w:hAnsi="Calibri" w:cs="Calibri"/>
+                <w:color w:val="000000"/>
+                <w:lang w:eastAsia="pt-BR"/>
+              </w:rPr>
+              <w:t>0%</w:t>
+            </w:r>
+          </w:p>
+        </w:tc>
+        <w:tc>
+          <w:tcPr>
+            <w:tcW w:w="663" w:type="dxa"/>
+            <w:tcBorders>
+              <w:top w:val="single" w:sz="4" w:space="0" w:color="auto"/>
+              <w:left w:val="nil"/>
+              <w:bottom w:val="single" w:sz="4" w:space="0" w:color="auto"/>
+              <w:right w:val="single" w:sz="4" w:space="0" w:color="auto"/>
+            </w:tcBorders>
+            <w:shd w:val="clear" w:color="auto" w:fill="auto"/>
+            <w:noWrap/>
+            <w:vAlign w:val="bottom"/>
+            <w:hideMark/>
+          </w:tcPr>
+          <w:p>
+            <w:pPr>
+              <w:spacing w:after="0" w:line="240" w:lineRule="auto"/>
+              <w:jc w:val="right"/>
+              <w:rPr>
+                <w:rFonts w:ascii="Calibri" w:eastAsia="Times New Roman" w:hAnsi="Calibri" w:cs="Calibri"/>
+                <w:color w:val="000000"/>
+                <w:lang w:eastAsia="pt-BR"/>
+              </w:rPr>
+            </w:pPr>
+            <w:r>
+              <w:rPr>
+                <w:rFonts w:ascii="Calibri" w:eastAsia="Times New Roman" w:hAnsi="Calibri" w:cs="Calibri"/>
+                <w:color w:val="000000"/>
+                <w:lang w:eastAsia="pt-BR"/>
+              </w:rPr>
+              <w:t>100%</w:t>
+            </w:r>
+          </w:p>
+        </w:tc>
+      </w:tr>
+    </w:tbl>
     <w:p>
       <w:pPr>
         <w:spacing w:line="360" w:lineRule="auto"/>
-        <w:ind w:firstLine="709"/>
-        <w:jc w:val="both"/>
-        <w:rPr>
-          <w:rFonts w:ascii="Arial" w:hAnsi="Arial" w:cs="Arial"/>
-          <w:b/>
-        </w:rPr>
-      </w:pPr>
-      <w:r>
-        <w:rPr>
-          <w:rFonts w:ascii="Arial" w:hAnsi="Arial" w:cs="Arial"/>
-          <w:b/>
-          <w:noProof/>
-        </w:rPr>
-        <w:drawing>
-          <wp:inline distT="0" distB="0" distL="0" distR="0" wp14:anchorId="7004332E" wp14:editId="4F9FAC02">
-            <wp:extent cx="4565073" cy="2999105"/>
-            <wp:effectExtent l="0" t="0" r="6985" b="0"/>
-            <wp:docPr id="2" name="Imagem 2"/>
-            <wp:cNvGraphicFramePr>
-              <a:graphicFrameLocks xmlns:a="http://schemas.openxmlformats.org/drawingml/2006/main" noChangeAspect="1"/>
-            </wp:cNvGraphicFramePr>
-            <a:graphic xmlns:a="http://schemas.openxmlformats.org/drawingml/2006/main">
-              <a:graphicData uri="http://schemas.openxmlformats.org/drawingml/2006/picture">
-                <pic:pic xmlns:pic="http://schemas.openxmlformats.org/drawingml/2006/picture">
-                  <pic:nvPicPr>
-                    <pic:cNvPr id="2" name="Captura de tela 2026-02-13 085411.png"/>
-                    <pic:cNvPicPr/>
-                  </pic:nvPicPr>
-                  <pic:blipFill>
-                    <a:blip r:embed="rId9">
-                      <a:extLst>
-                        <a:ext uri="{28A0092B-C50C-407E-A947-70E740481C1C}">
-                          <a14:useLocalDpi xmlns:a14="http://schemas.microsoft.com/office/drawing/2010/main" val="0"/>
-                        </a:ext>
-                      </a:extLst>
-                    </a:blip>
-                    <a:stretch>
-                      <a:fillRect/>
-                    </a:stretch>
-                  </pic:blipFill>
-                  <pic:spPr>
-                    <a:xfrm>
-                      <a:off x="0" y="0"/>
-                      <a:ext cx="4594002" cy="3018111"/>
-                    </a:xfrm>
-                    <a:prstGeom prst="rect">
-                      <a:avLst/>
-                    </a:prstGeom>
-                  </pic:spPr>
-                </pic:pic>
-              </a:graphicData>
-            </a:graphic>
-          </wp:inline>
-        </w:drawing>
-      </w:r>
-    </w:p>
-    <w:p>
-      <w:pPr>
-        <w:spacing w:line="360" w:lineRule="auto"/>
-        <w:ind w:firstLine="709"/>
         <w:jc w:val="both"/>
         <w:rPr>
           <w:rFonts w:ascii="Arial" w:hAnsi="Arial" w:cs="Arial"/>
@@ -2247,7 +4771,7 @@
                     <pic:cNvPicPr/>
                   </pic:nvPicPr>
                   <pic:blipFill>
-                    <a:blip r:embed="rId10">
+                    <a:blip r:embed="rId9">
                       <a:extLst>
                         <a:ext uri="{28A0092B-C50C-407E-A947-70E740481C1C}">
                           <a14:useLocalDpi xmlns:a14="http://schemas.microsoft.com/office/drawing/2010/main" val="0"/>
@@ -2335,76 +4859,1433 @@
           <w:sz w:val="24"/>
           <w:szCs w:val="24"/>
         </w:rPr>
+        <w:lastRenderedPageBreak/>
         <w:t>Regra de Negócio</w:t>
       </w:r>
     </w:p>
+    <w:tbl>
+      <w:tblPr>
+        <w:tblW w:w="0" w:type="auto"/>
+        <w:tblInd w:w="-38" w:type="dxa"/>
+        <w:tblLayout w:type="fixed"/>
+        <w:tblCellMar>
+          <w:left w:w="30" w:type="dxa"/>
+          <w:right w:w="30" w:type="dxa"/>
+        </w:tblCellMar>
+        <w:tblLook w:val="0000" w:firstRow="0" w:lastRow="0" w:firstColumn="0" w:lastColumn="0" w:noHBand="0" w:noVBand="0"/>
+      </w:tblPr>
+      <w:tblGrid>
+        <w:gridCol w:w="1277"/>
+        <w:gridCol w:w="3741"/>
+        <w:gridCol w:w="3569"/>
+      </w:tblGrid>
+      <w:tr>
+        <w:tblPrEx>
+          <w:tblCellMar>
+            <w:top w:w="0" w:type="dxa"/>
+            <w:bottom w:w="0" w:type="dxa"/>
+          </w:tblCellMar>
+        </w:tblPrEx>
+        <w:trPr>
+          <w:trHeight w:val="418"/>
+        </w:trPr>
+        <w:tc>
+          <w:tcPr>
+            <w:tcW w:w="5018" w:type="dxa"/>
+            <w:gridSpan w:val="2"/>
+            <w:tcBorders>
+              <w:top w:val="single" w:sz="6" w:space="0" w:color="auto"/>
+              <w:left w:val="single" w:sz="6" w:space="0" w:color="auto"/>
+              <w:bottom w:val="single" w:sz="6" w:space="0" w:color="auto"/>
+              <w:right w:val="single" w:sz="6" w:space="0" w:color="auto"/>
+            </w:tcBorders>
+            <w:shd w:val="solid" w:color="8D281E" w:fill="993366"/>
+          </w:tcPr>
+          <w:p>
+            <w:pPr>
+              <w:autoSpaceDE w:val="0"/>
+              <w:autoSpaceDN w:val="0"/>
+              <w:adjustRightInd w:val="0"/>
+              <w:spacing w:after="0" w:line="240" w:lineRule="auto"/>
+              <w:jc w:val="center"/>
+              <w:rPr>
+                <w:rFonts w:ascii="Arial" w:hAnsi="Arial" w:cs="Arial"/>
+                <w:b/>
+                <w:bCs/>
+                <w:color w:val="CCCCCC"/>
+                <w:sz w:val="24"/>
+                <w:szCs w:val="24"/>
+              </w:rPr>
+            </w:pPr>
+            <w:r>
+              <w:rPr>
+                <w:rFonts w:ascii="Arial" w:hAnsi="Arial" w:cs="Arial"/>
+                <w:b/>
+                <w:bCs/>
+                <w:color w:val="CCCCCC"/>
+                <w:sz w:val="24"/>
+                <w:szCs w:val="24"/>
+              </w:rPr>
+              <w:t>REGRAS DE NEGÓCIO</w:t>
+            </w:r>
+          </w:p>
+        </w:tc>
+        <w:tc>
+          <w:tcPr>
+            <w:tcW w:w="3569" w:type="dxa"/>
+            <w:tcBorders>
+              <w:top w:val="single" w:sz="6" w:space="0" w:color="auto"/>
+              <w:left w:val="single" w:sz="6" w:space="0" w:color="auto"/>
+              <w:bottom w:val="single" w:sz="6" w:space="0" w:color="auto"/>
+              <w:right w:val="single" w:sz="6" w:space="0" w:color="auto"/>
+            </w:tcBorders>
+            <w:shd w:val="solid" w:color="8D281E" w:fill="993366"/>
+          </w:tcPr>
+          <w:p>
+            <w:pPr>
+              <w:autoSpaceDE w:val="0"/>
+              <w:autoSpaceDN w:val="0"/>
+              <w:adjustRightInd w:val="0"/>
+              <w:spacing w:after="0" w:line="240" w:lineRule="auto"/>
+              <w:jc w:val="center"/>
+              <w:rPr>
+                <w:rFonts w:ascii="Arial" w:hAnsi="Arial" w:cs="Arial"/>
+                <w:b/>
+                <w:bCs/>
+                <w:color w:val="CCCCCC"/>
+                <w:sz w:val="24"/>
+                <w:szCs w:val="24"/>
+              </w:rPr>
+            </w:pPr>
+          </w:p>
+        </w:tc>
+      </w:tr>
+      <w:tr>
+        <w:tblPrEx>
+          <w:tblCellMar>
+            <w:top w:w="0" w:type="dxa"/>
+            <w:bottom w:w="0" w:type="dxa"/>
+          </w:tblCellMar>
+        </w:tblPrEx>
+        <w:trPr>
+          <w:trHeight w:val="290"/>
+        </w:trPr>
+        <w:tc>
+          <w:tcPr>
+            <w:tcW w:w="1277" w:type="dxa"/>
+            <w:tcBorders>
+              <w:top w:val="single" w:sz="6" w:space="0" w:color="auto"/>
+              <w:left w:val="single" w:sz="6" w:space="0" w:color="auto"/>
+              <w:bottom w:val="single" w:sz="6" w:space="0" w:color="auto"/>
+              <w:right w:val="single" w:sz="6" w:space="0" w:color="auto"/>
+            </w:tcBorders>
+            <w:shd w:val="solid" w:color="AFABAB" w:fill="CCCCCC"/>
+          </w:tcPr>
+          <w:p>
+            <w:pPr>
+              <w:autoSpaceDE w:val="0"/>
+              <w:autoSpaceDN w:val="0"/>
+              <w:adjustRightInd w:val="0"/>
+              <w:spacing w:after="0" w:line="240" w:lineRule="auto"/>
+              <w:jc w:val="center"/>
+              <w:rPr>
+                <w:rFonts w:ascii="Arial" w:hAnsi="Arial" w:cs="Arial"/>
+                <w:b/>
+                <w:bCs/>
+                <w:color w:val="000000"/>
+                <w:sz w:val="24"/>
+                <w:szCs w:val="24"/>
+              </w:rPr>
+            </w:pPr>
+            <w:r>
+              <w:rPr>
+                <w:rFonts w:ascii="Arial" w:hAnsi="Arial" w:cs="Arial"/>
+                <w:b/>
+                <w:bCs/>
+                <w:color w:val="000000"/>
+                <w:sz w:val="24"/>
+                <w:szCs w:val="24"/>
+              </w:rPr>
+              <w:t>ID</w:t>
+            </w:r>
+          </w:p>
+        </w:tc>
+        <w:tc>
+          <w:tcPr>
+            <w:tcW w:w="3741" w:type="dxa"/>
+            <w:tcBorders>
+              <w:top w:val="single" w:sz="6" w:space="0" w:color="auto"/>
+              <w:left w:val="single" w:sz="6" w:space="0" w:color="auto"/>
+              <w:bottom w:val="single" w:sz="6" w:space="0" w:color="auto"/>
+              <w:right w:val="single" w:sz="6" w:space="0" w:color="auto"/>
+            </w:tcBorders>
+            <w:shd w:val="solid" w:color="AFABAB" w:fill="CCCCCC"/>
+          </w:tcPr>
+          <w:p>
+            <w:pPr>
+              <w:autoSpaceDE w:val="0"/>
+              <w:autoSpaceDN w:val="0"/>
+              <w:adjustRightInd w:val="0"/>
+              <w:spacing w:after="0" w:line="240" w:lineRule="auto"/>
+              <w:jc w:val="center"/>
+              <w:rPr>
+                <w:rFonts w:ascii="Arial" w:hAnsi="Arial" w:cs="Arial"/>
+                <w:b/>
+                <w:bCs/>
+                <w:color w:val="000000"/>
+                <w:sz w:val="20"/>
+                <w:szCs w:val="20"/>
+              </w:rPr>
+            </w:pPr>
+            <w:r>
+              <w:rPr>
+                <w:rFonts w:ascii="Arial" w:hAnsi="Arial" w:cs="Arial"/>
+                <w:b/>
+                <w:bCs/>
+                <w:color w:val="000000"/>
+                <w:sz w:val="20"/>
+                <w:szCs w:val="20"/>
+              </w:rPr>
+              <w:t>NOME DA REGRA</w:t>
+            </w:r>
+          </w:p>
+        </w:tc>
+        <w:tc>
+          <w:tcPr>
+            <w:tcW w:w="3569" w:type="dxa"/>
+            <w:tcBorders>
+              <w:top w:val="single" w:sz="6" w:space="0" w:color="auto"/>
+              <w:left w:val="single" w:sz="6" w:space="0" w:color="auto"/>
+              <w:bottom w:val="single" w:sz="6" w:space="0" w:color="auto"/>
+              <w:right w:val="single" w:sz="6" w:space="0" w:color="auto"/>
+            </w:tcBorders>
+            <w:shd w:val="solid" w:color="AFABAB" w:fill="CCCCCC"/>
+          </w:tcPr>
+          <w:p>
+            <w:pPr>
+              <w:autoSpaceDE w:val="0"/>
+              <w:autoSpaceDN w:val="0"/>
+              <w:adjustRightInd w:val="0"/>
+              <w:spacing w:after="0" w:line="240" w:lineRule="auto"/>
+              <w:jc w:val="center"/>
+              <w:rPr>
+                <w:rFonts w:ascii="Arial" w:hAnsi="Arial" w:cs="Arial"/>
+                <w:b/>
+                <w:bCs/>
+                <w:color w:val="000000"/>
+                <w:sz w:val="20"/>
+                <w:szCs w:val="20"/>
+              </w:rPr>
+            </w:pPr>
+            <w:r>
+              <w:rPr>
+                <w:rFonts w:ascii="Arial" w:hAnsi="Arial" w:cs="Arial"/>
+                <w:b/>
+                <w:bCs/>
+                <w:color w:val="000000"/>
+                <w:sz w:val="20"/>
+                <w:szCs w:val="20"/>
+              </w:rPr>
+              <w:t>DESCRIÇÃO</w:t>
+            </w:r>
+          </w:p>
+        </w:tc>
+      </w:tr>
+      <w:tr>
+        <w:tblPrEx>
+          <w:tblCellMar>
+            <w:top w:w="0" w:type="dxa"/>
+            <w:bottom w:w="0" w:type="dxa"/>
+          </w:tblCellMar>
+        </w:tblPrEx>
+        <w:trPr>
+          <w:trHeight w:val="1145"/>
+        </w:trPr>
+        <w:tc>
+          <w:tcPr>
+            <w:tcW w:w="1277" w:type="dxa"/>
+            <w:tcBorders>
+              <w:top w:val="single" w:sz="6" w:space="0" w:color="auto"/>
+              <w:left w:val="single" w:sz="6" w:space="0" w:color="auto"/>
+              <w:bottom w:val="single" w:sz="6" w:space="0" w:color="auto"/>
+              <w:right w:val="single" w:sz="6" w:space="0" w:color="auto"/>
+            </w:tcBorders>
+            <w:shd w:val="solid" w:color="CCCCCC" w:fill="CCCCFF"/>
+          </w:tcPr>
+          <w:p>
+            <w:pPr>
+              <w:autoSpaceDE w:val="0"/>
+              <w:autoSpaceDN w:val="0"/>
+              <w:adjustRightInd w:val="0"/>
+              <w:spacing w:after="0" w:line="240" w:lineRule="auto"/>
+              <w:jc w:val="center"/>
+              <w:rPr>
+                <w:rFonts w:ascii="Arial" w:hAnsi="Arial" w:cs="Arial"/>
+                <w:b/>
+                <w:bCs/>
+                <w:color w:val="000000"/>
+                <w:sz w:val="20"/>
+                <w:szCs w:val="20"/>
+              </w:rPr>
+            </w:pPr>
+            <w:r>
+              <w:rPr>
+                <w:rFonts w:ascii="Arial" w:hAnsi="Arial" w:cs="Arial"/>
+                <w:b/>
+                <w:bCs/>
+                <w:color w:val="000000"/>
+                <w:sz w:val="20"/>
+                <w:szCs w:val="20"/>
+              </w:rPr>
+              <w:t>RN 001</w:t>
+            </w:r>
+          </w:p>
+        </w:tc>
+        <w:tc>
+          <w:tcPr>
+            <w:tcW w:w="3741" w:type="dxa"/>
+            <w:tcBorders>
+              <w:top w:val="single" w:sz="6" w:space="0" w:color="auto"/>
+              <w:left w:val="single" w:sz="6" w:space="0" w:color="auto"/>
+              <w:bottom w:val="single" w:sz="6" w:space="0" w:color="auto"/>
+              <w:right w:val="single" w:sz="6" w:space="0" w:color="auto"/>
+            </w:tcBorders>
+            <w:shd w:val="solid" w:color="CCCCCC" w:fill="CCCCFF"/>
+          </w:tcPr>
+          <w:p>
+            <w:pPr>
+              <w:autoSpaceDE w:val="0"/>
+              <w:autoSpaceDN w:val="0"/>
+              <w:adjustRightInd w:val="0"/>
+              <w:spacing w:after="0" w:line="240" w:lineRule="auto"/>
+              <w:jc w:val="center"/>
+              <w:rPr>
+                <w:rFonts w:ascii="Arial" w:hAnsi="Arial" w:cs="Arial"/>
+                <w:b/>
+                <w:bCs/>
+                <w:color w:val="000000"/>
+                <w:sz w:val="20"/>
+                <w:szCs w:val="20"/>
+              </w:rPr>
+            </w:pPr>
+            <w:r>
+              <w:rPr>
+                <w:rFonts w:ascii="Arial" w:hAnsi="Arial" w:cs="Arial"/>
+                <w:b/>
+                <w:bCs/>
+                <w:color w:val="000000"/>
+                <w:sz w:val="20"/>
+                <w:szCs w:val="20"/>
+              </w:rPr>
+              <w:t>ACESSO AO SISTEMA</w:t>
+            </w:r>
+          </w:p>
+        </w:tc>
+        <w:tc>
+          <w:tcPr>
+            <w:tcW w:w="3569" w:type="dxa"/>
+            <w:tcBorders>
+              <w:top w:val="single" w:sz="6" w:space="0" w:color="auto"/>
+              <w:left w:val="single" w:sz="6" w:space="0" w:color="auto"/>
+              <w:bottom w:val="single" w:sz="6" w:space="0" w:color="auto"/>
+              <w:right w:val="single" w:sz="6" w:space="0" w:color="auto"/>
+            </w:tcBorders>
+            <w:shd w:val="solid" w:color="CCCCCC" w:fill="CCCCFF"/>
+          </w:tcPr>
+          <w:p>
+            <w:pPr>
+              <w:autoSpaceDE w:val="0"/>
+              <w:autoSpaceDN w:val="0"/>
+              <w:adjustRightInd w:val="0"/>
+              <w:spacing w:after="0" w:line="240" w:lineRule="auto"/>
+              <w:jc w:val="center"/>
+              <w:rPr>
+                <w:rFonts w:ascii="Arial" w:hAnsi="Arial" w:cs="Arial"/>
+                <w:b/>
+                <w:bCs/>
+                <w:color w:val="000000"/>
+                <w:sz w:val="20"/>
+                <w:szCs w:val="20"/>
+              </w:rPr>
+            </w:pPr>
+            <w:r>
+              <w:rPr>
+                <w:rFonts w:ascii="Arial" w:hAnsi="Arial" w:cs="Arial"/>
+                <w:b/>
+                <w:bCs/>
+                <w:color w:val="000000"/>
+                <w:sz w:val="20"/>
+                <w:szCs w:val="20"/>
+              </w:rPr>
+              <w:t xml:space="preserve">  O USUÁRIO SÓ PODE ACESSAR O SISTEMA SE ESTIVER AUTENTICADO</w:t>
+            </w:r>
+          </w:p>
+        </w:tc>
+      </w:tr>
+      <w:tr>
+        <w:tblPrEx>
+          <w:tblCellMar>
+            <w:top w:w="0" w:type="dxa"/>
+            <w:bottom w:w="0" w:type="dxa"/>
+          </w:tblCellMar>
+        </w:tblPrEx>
+        <w:trPr>
+          <w:trHeight w:val="2830"/>
+        </w:trPr>
+        <w:tc>
+          <w:tcPr>
+            <w:tcW w:w="1277" w:type="dxa"/>
+            <w:tcBorders>
+              <w:top w:val="single" w:sz="6" w:space="0" w:color="auto"/>
+              <w:left w:val="single" w:sz="6" w:space="0" w:color="auto"/>
+              <w:bottom w:val="single" w:sz="6" w:space="0" w:color="auto"/>
+              <w:right w:val="single" w:sz="6" w:space="0" w:color="auto"/>
+            </w:tcBorders>
+            <w:shd w:val="solid" w:color="CCCCCC" w:fill="CCCCFF"/>
+          </w:tcPr>
+          <w:p>
+            <w:pPr>
+              <w:autoSpaceDE w:val="0"/>
+              <w:autoSpaceDN w:val="0"/>
+              <w:adjustRightInd w:val="0"/>
+              <w:spacing w:after="0" w:line="240" w:lineRule="auto"/>
+              <w:jc w:val="center"/>
+              <w:rPr>
+                <w:rFonts w:ascii="Arial" w:hAnsi="Arial" w:cs="Arial"/>
+                <w:b/>
+                <w:bCs/>
+                <w:color w:val="000000"/>
+                <w:sz w:val="20"/>
+                <w:szCs w:val="20"/>
+              </w:rPr>
+            </w:pPr>
+            <w:r>
+              <w:rPr>
+                <w:rFonts w:ascii="Arial" w:hAnsi="Arial" w:cs="Arial"/>
+                <w:b/>
+                <w:bCs/>
+                <w:color w:val="000000"/>
+                <w:sz w:val="20"/>
+                <w:szCs w:val="20"/>
+              </w:rPr>
+              <w:t>RN 002</w:t>
+            </w:r>
+          </w:p>
+        </w:tc>
+        <w:tc>
+          <w:tcPr>
+            <w:tcW w:w="3741" w:type="dxa"/>
+            <w:tcBorders>
+              <w:top w:val="single" w:sz="6" w:space="0" w:color="auto"/>
+              <w:left w:val="single" w:sz="6" w:space="0" w:color="auto"/>
+              <w:bottom w:val="single" w:sz="6" w:space="0" w:color="auto"/>
+              <w:right w:val="single" w:sz="6" w:space="0" w:color="auto"/>
+            </w:tcBorders>
+            <w:shd w:val="solid" w:color="CCCCCC" w:fill="CCCCFF"/>
+          </w:tcPr>
+          <w:p>
+            <w:pPr>
+              <w:autoSpaceDE w:val="0"/>
+              <w:autoSpaceDN w:val="0"/>
+              <w:adjustRightInd w:val="0"/>
+              <w:spacing w:after="0" w:line="240" w:lineRule="auto"/>
+              <w:jc w:val="center"/>
+              <w:rPr>
+                <w:rFonts w:ascii="Arial" w:hAnsi="Arial" w:cs="Arial"/>
+                <w:b/>
+                <w:bCs/>
+                <w:color w:val="000000"/>
+                <w:sz w:val="20"/>
+                <w:szCs w:val="20"/>
+              </w:rPr>
+            </w:pPr>
+            <w:r>
+              <w:rPr>
+                <w:rFonts w:ascii="Arial" w:hAnsi="Arial" w:cs="Arial"/>
+                <w:b/>
+                <w:bCs/>
+                <w:color w:val="000000"/>
+                <w:sz w:val="20"/>
+                <w:szCs w:val="20"/>
+              </w:rPr>
+              <w:t>DADOS JÁ EXISTENTE</w:t>
+            </w:r>
+          </w:p>
+        </w:tc>
+        <w:tc>
+          <w:tcPr>
+            <w:tcW w:w="3569" w:type="dxa"/>
+            <w:tcBorders>
+              <w:top w:val="single" w:sz="6" w:space="0" w:color="auto"/>
+              <w:left w:val="single" w:sz="6" w:space="0" w:color="auto"/>
+              <w:bottom w:val="single" w:sz="6" w:space="0" w:color="auto"/>
+              <w:right w:val="single" w:sz="6" w:space="0" w:color="auto"/>
+            </w:tcBorders>
+            <w:shd w:val="solid" w:color="CCCCCC" w:fill="CCCCFF"/>
+          </w:tcPr>
+          <w:p>
+            <w:pPr>
+              <w:autoSpaceDE w:val="0"/>
+              <w:autoSpaceDN w:val="0"/>
+              <w:adjustRightInd w:val="0"/>
+              <w:spacing w:after="0" w:line="240" w:lineRule="auto"/>
+              <w:rPr>
+                <w:rFonts w:ascii="Arial" w:hAnsi="Arial" w:cs="Arial"/>
+                <w:b/>
+                <w:bCs/>
+                <w:color w:val="000000"/>
+                <w:sz w:val="20"/>
+                <w:szCs w:val="20"/>
+              </w:rPr>
+            </w:pPr>
+            <w:r>
+              <w:rPr>
+                <w:rFonts w:ascii="Arial" w:hAnsi="Arial" w:cs="Arial"/>
+                <w:b/>
+                <w:bCs/>
+                <w:color w:val="000000"/>
+                <w:sz w:val="20"/>
+                <w:szCs w:val="20"/>
+              </w:rPr>
+              <w:t xml:space="preserve">     DADOS DUPLICADOS NÃO</w:t>
+            </w:r>
+          </w:p>
+          <w:p>
+            <w:pPr>
+              <w:autoSpaceDE w:val="0"/>
+              <w:autoSpaceDN w:val="0"/>
+              <w:adjustRightInd w:val="0"/>
+              <w:spacing w:after="0" w:line="240" w:lineRule="auto"/>
+              <w:rPr>
+                <w:rFonts w:ascii="Arial" w:hAnsi="Arial" w:cs="Arial"/>
+                <w:b/>
+                <w:bCs/>
+                <w:color w:val="000000"/>
+                <w:sz w:val="20"/>
+                <w:szCs w:val="20"/>
+              </w:rPr>
+            </w:pPr>
+            <w:r>
+              <w:rPr>
+                <w:rFonts w:ascii="Arial" w:hAnsi="Arial" w:cs="Arial"/>
+                <w:b/>
+                <w:bCs/>
+                <w:color w:val="000000"/>
+                <w:sz w:val="20"/>
+                <w:szCs w:val="20"/>
+              </w:rPr>
+              <w:t xml:space="preserve">       PODEM SER </w:t>
+            </w:r>
+            <w:proofErr w:type="gramStart"/>
+            <w:r>
+              <w:rPr>
+                <w:rFonts w:ascii="Arial" w:hAnsi="Arial" w:cs="Arial"/>
+                <w:b/>
+                <w:bCs/>
+                <w:color w:val="000000"/>
+                <w:sz w:val="20"/>
+                <w:szCs w:val="20"/>
+              </w:rPr>
+              <w:t>CADASTRADOS(</w:t>
+            </w:r>
+            <w:proofErr w:type="gramEnd"/>
+            <w:r>
+              <w:rPr>
+                <w:rFonts w:ascii="Arial" w:hAnsi="Arial" w:cs="Arial"/>
+                <w:b/>
+                <w:bCs/>
+                <w:color w:val="000000"/>
+                <w:sz w:val="20"/>
+                <w:szCs w:val="20"/>
+              </w:rPr>
+              <w:t>COMO POR EXEMPLO PODUTOS QUE JÁ FORAM ANTES CADASTRADOS, OU NO CASO DE FÚNCIONARIOS, EMAIL QUE JÁ ESTEJA SENDO UTILIZADO)</w:t>
+            </w:r>
+          </w:p>
+        </w:tc>
+      </w:tr>
+      <w:tr>
+        <w:tblPrEx>
+          <w:tblCellMar>
+            <w:top w:w="0" w:type="dxa"/>
+            <w:bottom w:w="0" w:type="dxa"/>
+          </w:tblCellMar>
+        </w:tblPrEx>
+        <w:trPr>
+          <w:trHeight w:val="1404"/>
+        </w:trPr>
+        <w:tc>
+          <w:tcPr>
+            <w:tcW w:w="1277" w:type="dxa"/>
+            <w:tcBorders>
+              <w:top w:val="single" w:sz="6" w:space="0" w:color="auto"/>
+              <w:left w:val="single" w:sz="6" w:space="0" w:color="auto"/>
+              <w:bottom w:val="single" w:sz="6" w:space="0" w:color="auto"/>
+              <w:right w:val="single" w:sz="6" w:space="0" w:color="auto"/>
+            </w:tcBorders>
+            <w:shd w:val="solid" w:color="CCCCCC" w:fill="CCCCFF"/>
+          </w:tcPr>
+          <w:p>
+            <w:pPr>
+              <w:autoSpaceDE w:val="0"/>
+              <w:autoSpaceDN w:val="0"/>
+              <w:adjustRightInd w:val="0"/>
+              <w:spacing w:after="0" w:line="240" w:lineRule="auto"/>
+              <w:jc w:val="center"/>
+              <w:rPr>
+                <w:rFonts w:ascii="Arial" w:hAnsi="Arial" w:cs="Arial"/>
+                <w:b/>
+                <w:bCs/>
+                <w:color w:val="000000"/>
+                <w:sz w:val="20"/>
+                <w:szCs w:val="20"/>
+              </w:rPr>
+            </w:pPr>
+            <w:r>
+              <w:rPr>
+                <w:rFonts w:ascii="Arial" w:hAnsi="Arial" w:cs="Arial"/>
+                <w:b/>
+                <w:bCs/>
+                <w:color w:val="000000"/>
+                <w:sz w:val="20"/>
+                <w:szCs w:val="20"/>
+              </w:rPr>
+              <w:t>RN 003</w:t>
+            </w:r>
+          </w:p>
+        </w:tc>
+        <w:tc>
+          <w:tcPr>
+            <w:tcW w:w="3741" w:type="dxa"/>
+            <w:tcBorders>
+              <w:top w:val="single" w:sz="6" w:space="0" w:color="auto"/>
+              <w:left w:val="single" w:sz="6" w:space="0" w:color="auto"/>
+              <w:bottom w:val="single" w:sz="6" w:space="0" w:color="auto"/>
+              <w:right w:val="single" w:sz="6" w:space="0" w:color="auto"/>
+            </w:tcBorders>
+            <w:shd w:val="solid" w:color="CCCCCC" w:fill="CCCCFF"/>
+          </w:tcPr>
+          <w:p>
+            <w:pPr>
+              <w:autoSpaceDE w:val="0"/>
+              <w:autoSpaceDN w:val="0"/>
+              <w:adjustRightInd w:val="0"/>
+              <w:spacing w:after="0" w:line="240" w:lineRule="auto"/>
+              <w:jc w:val="center"/>
+              <w:rPr>
+                <w:rFonts w:ascii="Arial" w:hAnsi="Arial" w:cs="Arial"/>
+                <w:b/>
+                <w:bCs/>
+                <w:color w:val="000000"/>
+                <w:sz w:val="20"/>
+                <w:szCs w:val="20"/>
+              </w:rPr>
+            </w:pPr>
+            <w:r>
+              <w:rPr>
+                <w:rFonts w:ascii="Arial" w:hAnsi="Arial" w:cs="Arial"/>
+                <w:b/>
+                <w:bCs/>
+                <w:color w:val="000000"/>
+                <w:sz w:val="20"/>
+                <w:szCs w:val="20"/>
+              </w:rPr>
+              <w:t>ATUALIZAÇAO DE ESTOQUE</w:t>
+            </w:r>
+          </w:p>
+        </w:tc>
+        <w:tc>
+          <w:tcPr>
+            <w:tcW w:w="3569" w:type="dxa"/>
+            <w:tcBorders>
+              <w:top w:val="single" w:sz="6" w:space="0" w:color="auto"/>
+              <w:left w:val="single" w:sz="6" w:space="0" w:color="auto"/>
+              <w:bottom w:val="single" w:sz="6" w:space="0" w:color="auto"/>
+              <w:right w:val="single" w:sz="6" w:space="0" w:color="auto"/>
+            </w:tcBorders>
+            <w:shd w:val="solid" w:color="CCCCCC" w:fill="CCCCFF"/>
+          </w:tcPr>
+          <w:p>
+            <w:pPr>
+              <w:autoSpaceDE w:val="0"/>
+              <w:autoSpaceDN w:val="0"/>
+              <w:adjustRightInd w:val="0"/>
+              <w:spacing w:after="0" w:line="240" w:lineRule="auto"/>
+              <w:jc w:val="center"/>
+              <w:rPr>
+                <w:rFonts w:ascii="Arial" w:hAnsi="Arial" w:cs="Arial"/>
+                <w:b/>
+                <w:bCs/>
+                <w:color w:val="000000"/>
+                <w:sz w:val="20"/>
+                <w:szCs w:val="20"/>
+              </w:rPr>
+            </w:pPr>
+            <w:r>
+              <w:rPr>
+                <w:rFonts w:ascii="Arial" w:hAnsi="Arial" w:cs="Arial"/>
+                <w:b/>
+                <w:bCs/>
+                <w:color w:val="000000"/>
+                <w:sz w:val="20"/>
+                <w:szCs w:val="20"/>
+              </w:rPr>
+              <w:t>O ESTOQUE DEVE SER ATUALIZADO</w:t>
+            </w:r>
+          </w:p>
+          <w:p>
+            <w:pPr>
+              <w:autoSpaceDE w:val="0"/>
+              <w:autoSpaceDN w:val="0"/>
+              <w:adjustRightInd w:val="0"/>
+              <w:spacing w:after="0" w:line="240" w:lineRule="auto"/>
+              <w:jc w:val="center"/>
+              <w:rPr>
+                <w:rFonts w:ascii="Arial" w:hAnsi="Arial" w:cs="Arial"/>
+                <w:b/>
+                <w:bCs/>
+                <w:color w:val="000000"/>
+                <w:sz w:val="20"/>
+                <w:szCs w:val="20"/>
+              </w:rPr>
+            </w:pPr>
+            <w:r>
+              <w:rPr>
+                <w:rFonts w:ascii="Arial" w:hAnsi="Arial" w:cs="Arial"/>
+                <w:b/>
+                <w:bCs/>
+                <w:color w:val="000000"/>
+                <w:sz w:val="20"/>
+                <w:szCs w:val="20"/>
+              </w:rPr>
+              <w:t>AUTOMATICAMENTE APÓS ENTRADA OU SAÍDA DE PRODUTOS</w:t>
+            </w:r>
+          </w:p>
+        </w:tc>
+      </w:tr>
+      <w:tr>
+        <w:tblPrEx>
+          <w:tblCellMar>
+            <w:top w:w="0" w:type="dxa"/>
+            <w:bottom w:w="0" w:type="dxa"/>
+          </w:tblCellMar>
+        </w:tblPrEx>
+        <w:trPr>
+          <w:trHeight w:val="955"/>
+        </w:trPr>
+        <w:tc>
+          <w:tcPr>
+            <w:tcW w:w="1277" w:type="dxa"/>
+            <w:tcBorders>
+              <w:top w:val="single" w:sz="6" w:space="0" w:color="auto"/>
+              <w:left w:val="single" w:sz="6" w:space="0" w:color="auto"/>
+              <w:bottom w:val="single" w:sz="6" w:space="0" w:color="auto"/>
+              <w:right w:val="single" w:sz="6" w:space="0" w:color="auto"/>
+            </w:tcBorders>
+            <w:shd w:val="solid" w:color="CCCCCC" w:fill="CCCCFF"/>
+          </w:tcPr>
+          <w:p>
+            <w:pPr>
+              <w:autoSpaceDE w:val="0"/>
+              <w:autoSpaceDN w:val="0"/>
+              <w:adjustRightInd w:val="0"/>
+              <w:spacing w:after="0" w:line="240" w:lineRule="auto"/>
+              <w:jc w:val="center"/>
+              <w:rPr>
+                <w:rFonts w:ascii="Arial" w:hAnsi="Arial" w:cs="Arial"/>
+                <w:b/>
+                <w:bCs/>
+                <w:color w:val="000000"/>
+                <w:sz w:val="20"/>
+                <w:szCs w:val="20"/>
+              </w:rPr>
+            </w:pPr>
+            <w:r>
+              <w:rPr>
+                <w:rFonts w:ascii="Arial" w:hAnsi="Arial" w:cs="Arial"/>
+                <w:b/>
+                <w:bCs/>
+                <w:color w:val="000000"/>
+                <w:sz w:val="20"/>
+                <w:szCs w:val="20"/>
+              </w:rPr>
+              <w:t>RN 004</w:t>
+            </w:r>
+          </w:p>
+        </w:tc>
+        <w:tc>
+          <w:tcPr>
+            <w:tcW w:w="3741" w:type="dxa"/>
+            <w:tcBorders>
+              <w:top w:val="single" w:sz="6" w:space="0" w:color="auto"/>
+              <w:left w:val="single" w:sz="6" w:space="0" w:color="auto"/>
+              <w:bottom w:val="single" w:sz="6" w:space="0" w:color="auto"/>
+              <w:right w:val="single" w:sz="6" w:space="0" w:color="auto"/>
+            </w:tcBorders>
+            <w:shd w:val="solid" w:color="CCCCCC" w:fill="CCCCFF"/>
+          </w:tcPr>
+          <w:p>
+            <w:pPr>
+              <w:autoSpaceDE w:val="0"/>
+              <w:autoSpaceDN w:val="0"/>
+              <w:adjustRightInd w:val="0"/>
+              <w:spacing w:after="0" w:line="240" w:lineRule="auto"/>
+              <w:jc w:val="center"/>
+              <w:rPr>
+                <w:rFonts w:ascii="Arial" w:hAnsi="Arial" w:cs="Arial"/>
+                <w:b/>
+                <w:bCs/>
+                <w:color w:val="000000"/>
+                <w:sz w:val="20"/>
+                <w:szCs w:val="20"/>
+              </w:rPr>
+            </w:pPr>
+            <w:r>
+              <w:rPr>
+                <w:rFonts w:ascii="Arial" w:hAnsi="Arial" w:cs="Arial"/>
+                <w:b/>
+                <w:bCs/>
+                <w:color w:val="000000"/>
+                <w:sz w:val="20"/>
+                <w:szCs w:val="20"/>
+              </w:rPr>
+              <w:t>ALERTA DE ESTOQUE BAIXO</w:t>
+            </w:r>
+          </w:p>
+        </w:tc>
+        <w:tc>
+          <w:tcPr>
+            <w:tcW w:w="3569" w:type="dxa"/>
+            <w:tcBorders>
+              <w:top w:val="single" w:sz="6" w:space="0" w:color="auto"/>
+              <w:left w:val="single" w:sz="6" w:space="0" w:color="auto"/>
+              <w:bottom w:val="single" w:sz="6" w:space="0" w:color="auto"/>
+              <w:right w:val="single" w:sz="6" w:space="0" w:color="auto"/>
+            </w:tcBorders>
+            <w:shd w:val="solid" w:color="CCCCCC" w:fill="CCCCFF"/>
+          </w:tcPr>
+          <w:p>
+            <w:pPr>
+              <w:autoSpaceDE w:val="0"/>
+              <w:autoSpaceDN w:val="0"/>
+              <w:adjustRightInd w:val="0"/>
+              <w:spacing w:after="0" w:line="240" w:lineRule="auto"/>
+              <w:jc w:val="center"/>
+              <w:rPr>
+                <w:rFonts w:ascii="Arial" w:hAnsi="Arial" w:cs="Arial"/>
+                <w:b/>
+                <w:bCs/>
+                <w:color w:val="000000"/>
+                <w:sz w:val="20"/>
+                <w:szCs w:val="20"/>
+              </w:rPr>
+            </w:pPr>
+            <w:r>
+              <w:rPr>
+                <w:rFonts w:ascii="Arial" w:hAnsi="Arial" w:cs="Arial"/>
+                <w:b/>
+                <w:bCs/>
+                <w:color w:val="000000"/>
+                <w:sz w:val="20"/>
+                <w:szCs w:val="20"/>
+              </w:rPr>
+              <w:t>O SISTEMA DEVE EMITIR ALERTA</w:t>
+            </w:r>
+          </w:p>
+          <w:p>
+            <w:pPr>
+              <w:autoSpaceDE w:val="0"/>
+              <w:autoSpaceDN w:val="0"/>
+              <w:adjustRightInd w:val="0"/>
+              <w:spacing w:after="0" w:line="240" w:lineRule="auto"/>
+              <w:jc w:val="center"/>
+              <w:rPr>
+                <w:rFonts w:ascii="Arial" w:hAnsi="Arial" w:cs="Arial"/>
+                <w:b/>
+                <w:bCs/>
+                <w:color w:val="000000"/>
+                <w:sz w:val="20"/>
+                <w:szCs w:val="20"/>
+              </w:rPr>
+            </w:pPr>
+            <w:r>
+              <w:rPr>
+                <w:rFonts w:ascii="Arial" w:hAnsi="Arial" w:cs="Arial"/>
+                <w:b/>
+                <w:bCs/>
+                <w:color w:val="000000"/>
+                <w:sz w:val="20"/>
+                <w:szCs w:val="20"/>
+              </w:rPr>
+              <w:t xml:space="preserve"> QUANDO O ESTOQUE ATINGIR NÍVEL MÍNIMO</w:t>
+            </w:r>
+          </w:p>
+        </w:tc>
+      </w:tr>
+      <w:tr>
+        <w:tblPrEx>
+          <w:tblCellMar>
+            <w:top w:w="0" w:type="dxa"/>
+            <w:bottom w:w="0" w:type="dxa"/>
+          </w:tblCellMar>
+        </w:tblPrEx>
+        <w:trPr>
+          <w:trHeight w:val="1236"/>
+        </w:trPr>
+        <w:tc>
+          <w:tcPr>
+            <w:tcW w:w="1277" w:type="dxa"/>
+            <w:tcBorders>
+              <w:top w:val="single" w:sz="6" w:space="0" w:color="auto"/>
+              <w:left w:val="single" w:sz="6" w:space="0" w:color="auto"/>
+              <w:bottom w:val="single" w:sz="6" w:space="0" w:color="auto"/>
+              <w:right w:val="single" w:sz="6" w:space="0" w:color="auto"/>
+            </w:tcBorders>
+            <w:shd w:val="solid" w:color="CCCCCC" w:fill="CCCCFF"/>
+          </w:tcPr>
+          <w:p>
+            <w:pPr>
+              <w:autoSpaceDE w:val="0"/>
+              <w:autoSpaceDN w:val="0"/>
+              <w:adjustRightInd w:val="0"/>
+              <w:spacing w:after="0" w:line="240" w:lineRule="auto"/>
+              <w:jc w:val="center"/>
+              <w:rPr>
+                <w:rFonts w:ascii="Arial" w:hAnsi="Arial" w:cs="Arial"/>
+                <w:b/>
+                <w:bCs/>
+                <w:color w:val="000000"/>
+                <w:sz w:val="20"/>
+                <w:szCs w:val="20"/>
+              </w:rPr>
+            </w:pPr>
+            <w:r>
+              <w:rPr>
+                <w:rFonts w:ascii="Arial" w:hAnsi="Arial" w:cs="Arial"/>
+                <w:b/>
+                <w:bCs/>
+                <w:color w:val="000000"/>
+                <w:sz w:val="20"/>
+                <w:szCs w:val="20"/>
+              </w:rPr>
+              <w:t>RN 005</w:t>
+            </w:r>
+          </w:p>
+        </w:tc>
+        <w:tc>
+          <w:tcPr>
+            <w:tcW w:w="3741" w:type="dxa"/>
+            <w:tcBorders>
+              <w:top w:val="single" w:sz="6" w:space="0" w:color="auto"/>
+              <w:left w:val="single" w:sz="6" w:space="0" w:color="auto"/>
+              <w:bottom w:val="single" w:sz="6" w:space="0" w:color="auto"/>
+              <w:right w:val="single" w:sz="6" w:space="0" w:color="auto"/>
+            </w:tcBorders>
+            <w:shd w:val="solid" w:color="CCCCCC" w:fill="CCCCFF"/>
+          </w:tcPr>
+          <w:p>
+            <w:pPr>
+              <w:autoSpaceDE w:val="0"/>
+              <w:autoSpaceDN w:val="0"/>
+              <w:adjustRightInd w:val="0"/>
+              <w:spacing w:after="0" w:line="240" w:lineRule="auto"/>
+              <w:jc w:val="center"/>
+              <w:rPr>
+                <w:rFonts w:ascii="Arial" w:hAnsi="Arial" w:cs="Arial"/>
+                <w:b/>
+                <w:bCs/>
+                <w:color w:val="000000"/>
+                <w:sz w:val="20"/>
+                <w:szCs w:val="20"/>
+              </w:rPr>
+            </w:pPr>
+            <w:r>
+              <w:rPr>
+                <w:rFonts w:ascii="Arial" w:hAnsi="Arial" w:cs="Arial"/>
+                <w:b/>
+                <w:bCs/>
+                <w:color w:val="000000"/>
+                <w:sz w:val="20"/>
+                <w:szCs w:val="20"/>
+              </w:rPr>
+              <w:t>EXCLUSÃO DE PRODUTOS</w:t>
+            </w:r>
+          </w:p>
+        </w:tc>
+        <w:tc>
+          <w:tcPr>
+            <w:tcW w:w="3569" w:type="dxa"/>
+            <w:tcBorders>
+              <w:top w:val="single" w:sz="6" w:space="0" w:color="auto"/>
+              <w:left w:val="single" w:sz="6" w:space="0" w:color="auto"/>
+              <w:bottom w:val="single" w:sz="6" w:space="0" w:color="auto"/>
+              <w:right w:val="single" w:sz="6" w:space="0" w:color="auto"/>
+            </w:tcBorders>
+            <w:shd w:val="solid" w:color="CCCCCC" w:fill="CCCCFF"/>
+          </w:tcPr>
+          <w:p>
+            <w:pPr>
+              <w:autoSpaceDE w:val="0"/>
+              <w:autoSpaceDN w:val="0"/>
+              <w:adjustRightInd w:val="0"/>
+              <w:spacing w:after="0" w:line="240" w:lineRule="auto"/>
+              <w:jc w:val="center"/>
+              <w:rPr>
+                <w:rFonts w:ascii="Arial" w:hAnsi="Arial" w:cs="Arial"/>
+                <w:b/>
+                <w:bCs/>
+                <w:color w:val="000000"/>
+                <w:sz w:val="20"/>
+                <w:szCs w:val="20"/>
+              </w:rPr>
+            </w:pPr>
+            <w:r>
+              <w:rPr>
+                <w:rFonts w:ascii="Arial" w:hAnsi="Arial" w:cs="Arial"/>
+                <w:b/>
+                <w:bCs/>
+                <w:color w:val="000000"/>
+                <w:sz w:val="20"/>
+                <w:szCs w:val="20"/>
+              </w:rPr>
+              <w:t>O SISTEMA NÃO DEVE PERMITIR</w:t>
+            </w:r>
+          </w:p>
+          <w:p>
+            <w:pPr>
+              <w:autoSpaceDE w:val="0"/>
+              <w:autoSpaceDN w:val="0"/>
+              <w:adjustRightInd w:val="0"/>
+              <w:spacing w:after="0" w:line="240" w:lineRule="auto"/>
+              <w:jc w:val="center"/>
+              <w:rPr>
+                <w:rFonts w:ascii="Arial" w:hAnsi="Arial" w:cs="Arial"/>
+                <w:b/>
+                <w:bCs/>
+                <w:color w:val="000000"/>
+                <w:sz w:val="20"/>
+                <w:szCs w:val="20"/>
+              </w:rPr>
+            </w:pPr>
+            <w:r>
+              <w:rPr>
+                <w:rFonts w:ascii="Arial" w:hAnsi="Arial" w:cs="Arial"/>
+                <w:b/>
+                <w:bCs/>
+                <w:color w:val="000000"/>
+                <w:sz w:val="20"/>
+                <w:szCs w:val="20"/>
+              </w:rPr>
+              <w:t xml:space="preserve"> A EXCLUSÃO DE PRODUTO</w:t>
+            </w:r>
+          </w:p>
+          <w:p>
+            <w:pPr>
+              <w:autoSpaceDE w:val="0"/>
+              <w:autoSpaceDN w:val="0"/>
+              <w:adjustRightInd w:val="0"/>
+              <w:spacing w:after="0" w:line="240" w:lineRule="auto"/>
+              <w:jc w:val="center"/>
+              <w:rPr>
+                <w:rFonts w:ascii="Arial" w:hAnsi="Arial" w:cs="Arial"/>
+                <w:b/>
+                <w:bCs/>
+                <w:color w:val="000000"/>
+                <w:sz w:val="20"/>
+                <w:szCs w:val="20"/>
+              </w:rPr>
+            </w:pPr>
+            <w:r>
+              <w:rPr>
+                <w:rFonts w:ascii="Arial" w:hAnsi="Arial" w:cs="Arial"/>
+                <w:b/>
+                <w:bCs/>
+                <w:color w:val="000000"/>
+                <w:sz w:val="20"/>
+                <w:szCs w:val="20"/>
+              </w:rPr>
+              <w:t xml:space="preserve"> QUE POSSUA QUANTIA EM ESTOQUE</w:t>
+            </w:r>
+          </w:p>
+        </w:tc>
+      </w:tr>
+      <w:tr>
+        <w:tblPrEx>
+          <w:tblCellMar>
+            <w:top w:w="0" w:type="dxa"/>
+            <w:bottom w:w="0" w:type="dxa"/>
+          </w:tblCellMar>
+        </w:tblPrEx>
+        <w:trPr>
+          <w:trHeight w:val="1212"/>
+        </w:trPr>
+        <w:tc>
+          <w:tcPr>
+            <w:tcW w:w="1277" w:type="dxa"/>
+            <w:tcBorders>
+              <w:top w:val="single" w:sz="6" w:space="0" w:color="auto"/>
+              <w:left w:val="single" w:sz="6" w:space="0" w:color="auto"/>
+              <w:bottom w:val="single" w:sz="6" w:space="0" w:color="auto"/>
+              <w:right w:val="single" w:sz="6" w:space="0" w:color="auto"/>
+            </w:tcBorders>
+            <w:shd w:val="solid" w:color="CCCCCC" w:fill="CCCCFF"/>
+          </w:tcPr>
+          <w:p>
+            <w:pPr>
+              <w:autoSpaceDE w:val="0"/>
+              <w:autoSpaceDN w:val="0"/>
+              <w:adjustRightInd w:val="0"/>
+              <w:spacing w:after="0" w:line="240" w:lineRule="auto"/>
+              <w:jc w:val="center"/>
+              <w:rPr>
+                <w:rFonts w:ascii="Arial" w:hAnsi="Arial" w:cs="Arial"/>
+                <w:b/>
+                <w:bCs/>
+                <w:color w:val="000000"/>
+                <w:sz w:val="20"/>
+                <w:szCs w:val="20"/>
+              </w:rPr>
+            </w:pPr>
+            <w:r>
+              <w:rPr>
+                <w:rFonts w:ascii="Arial" w:hAnsi="Arial" w:cs="Arial"/>
+                <w:b/>
+                <w:bCs/>
+                <w:color w:val="000000"/>
+                <w:sz w:val="20"/>
+                <w:szCs w:val="20"/>
+              </w:rPr>
+              <w:t>RN 006</w:t>
+            </w:r>
+          </w:p>
+        </w:tc>
+        <w:tc>
+          <w:tcPr>
+            <w:tcW w:w="3741" w:type="dxa"/>
+            <w:tcBorders>
+              <w:top w:val="single" w:sz="6" w:space="0" w:color="auto"/>
+              <w:left w:val="single" w:sz="6" w:space="0" w:color="auto"/>
+              <w:bottom w:val="single" w:sz="6" w:space="0" w:color="auto"/>
+              <w:right w:val="single" w:sz="6" w:space="0" w:color="auto"/>
+            </w:tcBorders>
+            <w:shd w:val="solid" w:color="CCCCCC" w:fill="CCCCFF"/>
+          </w:tcPr>
+          <w:p>
+            <w:pPr>
+              <w:autoSpaceDE w:val="0"/>
+              <w:autoSpaceDN w:val="0"/>
+              <w:adjustRightInd w:val="0"/>
+              <w:spacing w:after="0" w:line="240" w:lineRule="auto"/>
+              <w:jc w:val="center"/>
+              <w:rPr>
+                <w:rFonts w:ascii="Arial" w:hAnsi="Arial" w:cs="Arial"/>
+                <w:b/>
+                <w:bCs/>
+                <w:color w:val="000000"/>
+                <w:sz w:val="20"/>
+                <w:szCs w:val="20"/>
+              </w:rPr>
+            </w:pPr>
+            <w:r>
+              <w:rPr>
+                <w:rFonts w:ascii="Arial" w:hAnsi="Arial" w:cs="Arial"/>
+                <w:b/>
+                <w:bCs/>
+                <w:color w:val="000000"/>
+                <w:sz w:val="20"/>
+                <w:szCs w:val="20"/>
+              </w:rPr>
+              <w:t xml:space="preserve">CADASTRO OU EDIÇÃO DE </w:t>
+            </w:r>
+          </w:p>
+          <w:p>
+            <w:pPr>
+              <w:autoSpaceDE w:val="0"/>
+              <w:autoSpaceDN w:val="0"/>
+              <w:adjustRightInd w:val="0"/>
+              <w:spacing w:after="0" w:line="240" w:lineRule="auto"/>
+              <w:jc w:val="center"/>
+              <w:rPr>
+                <w:rFonts w:ascii="Arial" w:hAnsi="Arial" w:cs="Arial"/>
+                <w:b/>
+                <w:bCs/>
+                <w:color w:val="000000"/>
+                <w:sz w:val="20"/>
+                <w:szCs w:val="20"/>
+              </w:rPr>
+            </w:pPr>
+            <w:r>
+              <w:rPr>
+                <w:rFonts w:ascii="Arial" w:hAnsi="Arial" w:cs="Arial"/>
+                <w:b/>
+                <w:bCs/>
+                <w:color w:val="000000"/>
+                <w:sz w:val="20"/>
+                <w:szCs w:val="20"/>
+              </w:rPr>
+              <w:t>USUÁRIO</w:t>
+            </w:r>
+          </w:p>
+        </w:tc>
+        <w:tc>
+          <w:tcPr>
+            <w:tcW w:w="3569" w:type="dxa"/>
+            <w:tcBorders>
+              <w:top w:val="single" w:sz="6" w:space="0" w:color="auto"/>
+              <w:left w:val="single" w:sz="6" w:space="0" w:color="auto"/>
+              <w:bottom w:val="single" w:sz="6" w:space="0" w:color="auto"/>
+              <w:right w:val="single" w:sz="6" w:space="0" w:color="auto"/>
+            </w:tcBorders>
+            <w:shd w:val="solid" w:color="CCCCCC" w:fill="CCCCFF"/>
+          </w:tcPr>
+          <w:p>
+            <w:pPr>
+              <w:autoSpaceDE w:val="0"/>
+              <w:autoSpaceDN w:val="0"/>
+              <w:adjustRightInd w:val="0"/>
+              <w:spacing w:after="0" w:line="240" w:lineRule="auto"/>
+              <w:jc w:val="center"/>
+              <w:rPr>
+                <w:rFonts w:ascii="Arial" w:hAnsi="Arial" w:cs="Arial"/>
+                <w:b/>
+                <w:bCs/>
+                <w:color w:val="000000"/>
+                <w:sz w:val="20"/>
+                <w:szCs w:val="20"/>
+              </w:rPr>
+            </w:pPr>
+            <w:r>
+              <w:rPr>
+                <w:rFonts w:ascii="Arial" w:hAnsi="Arial" w:cs="Arial"/>
+                <w:b/>
+                <w:bCs/>
+                <w:color w:val="000000"/>
+                <w:sz w:val="20"/>
+                <w:szCs w:val="20"/>
+              </w:rPr>
+              <w:t xml:space="preserve">APENAS USUÁRIOS COM PERFIL </w:t>
+            </w:r>
+          </w:p>
+          <w:p>
+            <w:pPr>
+              <w:autoSpaceDE w:val="0"/>
+              <w:autoSpaceDN w:val="0"/>
+              <w:adjustRightInd w:val="0"/>
+              <w:spacing w:after="0" w:line="240" w:lineRule="auto"/>
+              <w:jc w:val="center"/>
+              <w:rPr>
+                <w:rFonts w:ascii="Arial" w:hAnsi="Arial" w:cs="Arial"/>
+                <w:b/>
+                <w:bCs/>
+                <w:color w:val="000000"/>
+                <w:sz w:val="20"/>
+                <w:szCs w:val="20"/>
+              </w:rPr>
+            </w:pPr>
+            <w:r>
+              <w:rPr>
+                <w:rFonts w:ascii="Arial" w:hAnsi="Arial" w:cs="Arial"/>
+                <w:b/>
+                <w:bCs/>
+                <w:color w:val="000000"/>
+                <w:sz w:val="20"/>
+                <w:szCs w:val="20"/>
+              </w:rPr>
+              <w:t xml:space="preserve">ADMINISTRADOR PODEM CADASTRAR </w:t>
+            </w:r>
+          </w:p>
+          <w:p>
+            <w:pPr>
+              <w:autoSpaceDE w:val="0"/>
+              <w:autoSpaceDN w:val="0"/>
+              <w:adjustRightInd w:val="0"/>
+              <w:spacing w:after="0" w:line="240" w:lineRule="auto"/>
+              <w:jc w:val="center"/>
+              <w:rPr>
+                <w:rFonts w:ascii="Arial" w:hAnsi="Arial" w:cs="Arial"/>
+                <w:b/>
+                <w:bCs/>
+                <w:color w:val="000000"/>
+                <w:sz w:val="20"/>
+                <w:szCs w:val="20"/>
+              </w:rPr>
+            </w:pPr>
+            <w:r>
+              <w:rPr>
+                <w:rFonts w:ascii="Arial" w:hAnsi="Arial" w:cs="Arial"/>
+                <w:b/>
+                <w:bCs/>
+                <w:color w:val="000000"/>
+                <w:sz w:val="20"/>
+                <w:szCs w:val="20"/>
+              </w:rPr>
+              <w:t>OU EDITAR FUNCIONÁRIOS</w:t>
+            </w:r>
+          </w:p>
+        </w:tc>
+      </w:tr>
+      <w:tr>
+        <w:tblPrEx>
+          <w:tblCellMar>
+            <w:top w:w="0" w:type="dxa"/>
+            <w:bottom w:w="0" w:type="dxa"/>
+          </w:tblCellMar>
+        </w:tblPrEx>
+        <w:trPr>
+          <w:trHeight w:val="922"/>
+        </w:trPr>
+        <w:tc>
+          <w:tcPr>
+            <w:tcW w:w="1277" w:type="dxa"/>
+            <w:tcBorders>
+              <w:top w:val="single" w:sz="6" w:space="0" w:color="auto"/>
+              <w:left w:val="single" w:sz="6" w:space="0" w:color="auto"/>
+              <w:bottom w:val="single" w:sz="6" w:space="0" w:color="auto"/>
+              <w:right w:val="single" w:sz="6" w:space="0" w:color="auto"/>
+            </w:tcBorders>
+            <w:shd w:val="solid" w:color="CCCCCC" w:fill="CCCCFF"/>
+          </w:tcPr>
+          <w:p>
+            <w:pPr>
+              <w:autoSpaceDE w:val="0"/>
+              <w:autoSpaceDN w:val="0"/>
+              <w:adjustRightInd w:val="0"/>
+              <w:spacing w:after="0" w:line="240" w:lineRule="auto"/>
+              <w:jc w:val="center"/>
+              <w:rPr>
+                <w:rFonts w:ascii="Arial" w:hAnsi="Arial" w:cs="Arial"/>
+                <w:b/>
+                <w:bCs/>
+                <w:color w:val="000000"/>
+                <w:sz w:val="20"/>
+                <w:szCs w:val="20"/>
+              </w:rPr>
+            </w:pPr>
+            <w:r>
+              <w:rPr>
+                <w:rFonts w:ascii="Arial" w:hAnsi="Arial" w:cs="Arial"/>
+                <w:b/>
+                <w:bCs/>
+                <w:color w:val="000000"/>
+                <w:sz w:val="20"/>
+                <w:szCs w:val="20"/>
+              </w:rPr>
+              <w:t>RN 007</w:t>
+            </w:r>
+          </w:p>
+        </w:tc>
+        <w:tc>
+          <w:tcPr>
+            <w:tcW w:w="3741" w:type="dxa"/>
+            <w:tcBorders>
+              <w:top w:val="single" w:sz="6" w:space="0" w:color="auto"/>
+              <w:left w:val="single" w:sz="6" w:space="0" w:color="auto"/>
+              <w:bottom w:val="single" w:sz="6" w:space="0" w:color="auto"/>
+              <w:right w:val="single" w:sz="6" w:space="0" w:color="auto"/>
+            </w:tcBorders>
+            <w:shd w:val="solid" w:color="CCCCCC" w:fill="CCCCFF"/>
+          </w:tcPr>
+          <w:p>
+            <w:pPr>
+              <w:autoSpaceDE w:val="0"/>
+              <w:autoSpaceDN w:val="0"/>
+              <w:adjustRightInd w:val="0"/>
+              <w:spacing w:after="0" w:line="240" w:lineRule="auto"/>
+              <w:jc w:val="center"/>
+              <w:rPr>
+                <w:rFonts w:ascii="Arial" w:hAnsi="Arial" w:cs="Arial"/>
+                <w:b/>
+                <w:bCs/>
+                <w:color w:val="000000"/>
+                <w:sz w:val="20"/>
+                <w:szCs w:val="20"/>
+              </w:rPr>
+            </w:pPr>
+            <w:r>
+              <w:rPr>
+                <w:rFonts w:ascii="Arial" w:hAnsi="Arial" w:cs="Arial"/>
+                <w:b/>
+                <w:bCs/>
+                <w:color w:val="000000"/>
+                <w:sz w:val="20"/>
+                <w:szCs w:val="20"/>
+              </w:rPr>
+              <w:t>CPF USUÁRIO</w:t>
+            </w:r>
+          </w:p>
+        </w:tc>
+        <w:tc>
+          <w:tcPr>
+            <w:tcW w:w="3569" w:type="dxa"/>
+            <w:tcBorders>
+              <w:top w:val="single" w:sz="6" w:space="0" w:color="auto"/>
+              <w:left w:val="single" w:sz="6" w:space="0" w:color="auto"/>
+              <w:bottom w:val="single" w:sz="6" w:space="0" w:color="auto"/>
+              <w:right w:val="single" w:sz="6" w:space="0" w:color="auto"/>
+            </w:tcBorders>
+            <w:shd w:val="solid" w:color="CCCCCC" w:fill="CCCCFF"/>
+          </w:tcPr>
+          <w:p>
+            <w:pPr>
+              <w:autoSpaceDE w:val="0"/>
+              <w:autoSpaceDN w:val="0"/>
+              <w:adjustRightInd w:val="0"/>
+              <w:spacing w:after="0" w:line="240" w:lineRule="auto"/>
+              <w:jc w:val="center"/>
+              <w:rPr>
+                <w:rFonts w:ascii="Arial" w:hAnsi="Arial" w:cs="Arial"/>
+                <w:b/>
+                <w:bCs/>
+                <w:color w:val="000000"/>
+                <w:sz w:val="20"/>
+                <w:szCs w:val="20"/>
+              </w:rPr>
+            </w:pPr>
+            <w:r>
+              <w:rPr>
+                <w:rFonts w:ascii="Arial" w:hAnsi="Arial" w:cs="Arial"/>
+                <w:b/>
+                <w:bCs/>
+                <w:color w:val="000000"/>
+                <w:sz w:val="20"/>
+                <w:szCs w:val="20"/>
+              </w:rPr>
+              <w:t>TODO FUNCIONÁRIO DEVE</w:t>
+            </w:r>
+          </w:p>
+          <w:p>
+            <w:pPr>
+              <w:autoSpaceDE w:val="0"/>
+              <w:autoSpaceDN w:val="0"/>
+              <w:adjustRightInd w:val="0"/>
+              <w:spacing w:after="0" w:line="240" w:lineRule="auto"/>
+              <w:jc w:val="center"/>
+              <w:rPr>
+                <w:rFonts w:ascii="Arial" w:hAnsi="Arial" w:cs="Arial"/>
+                <w:b/>
+                <w:bCs/>
+                <w:color w:val="000000"/>
+                <w:sz w:val="20"/>
+                <w:szCs w:val="20"/>
+              </w:rPr>
+            </w:pPr>
+            <w:r>
+              <w:rPr>
+                <w:rFonts w:ascii="Arial" w:hAnsi="Arial" w:cs="Arial"/>
+                <w:b/>
+                <w:bCs/>
+                <w:color w:val="000000"/>
+                <w:sz w:val="20"/>
+                <w:szCs w:val="20"/>
+              </w:rPr>
+              <w:t xml:space="preserve"> POSSUIR CPF VÁLIDO E ÚNICO</w:t>
+            </w:r>
+          </w:p>
+        </w:tc>
+      </w:tr>
+    </w:tbl>
     <w:p>
       <w:pPr>
         <w:spacing w:line="360" w:lineRule="auto"/>
-        <w:ind w:firstLine="709"/>
-        <w:jc w:val="both"/>
-        <w:rPr>
-          <w:rFonts w:ascii="Arial" w:hAnsi="Arial" w:cs="Arial"/>
-          <w:b/>
-          <w:sz w:val="24"/>
-          <w:szCs w:val="24"/>
-        </w:rPr>
-      </w:pPr>
-      <w:r>
-        <w:rPr>
-          <w:rFonts w:ascii="Arial" w:hAnsi="Arial" w:cs="Arial"/>
-          <w:b/>
-          <w:noProof/>
-          <w:sz w:val="24"/>
-          <w:szCs w:val="24"/>
-        </w:rPr>
-        <w:drawing>
-          <wp:inline distT="0" distB="0" distL="0" distR="0" wp14:anchorId="47B781AA" wp14:editId="0C9C7BE3">
-            <wp:extent cx="4396740" cy="4831080"/>
-            <wp:effectExtent l="0" t="0" r="3810" b="7620"/>
-            <wp:docPr id="9" name="Imagem 9"/>
-            <wp:cNvGraphicFramePr>
-              <a:graphicFrameLocks xmlns:a="http://schemas.openxmlformats.org/drawingml/2006/main" noChangeAspect="1"/>
-            </wp:cNvGraphicFramePr>
-            <a:graphic xmlns:a="http://schemas.openxmlformats.org/drawingml/2006/main">
-              <a:graphicData uri="http://schemas.openxmlformats.org/drawingml/2006/picture">
-                <pic:pic xmlns:pic="http://schemas.openxmlformats.org/drawingml/2006/picture">
-                  <pic:nvPicPr>
-                    <pic:cNvPr id="9" name="Captura de tela 2026-02-13 091207.png"/>
-                    <pic:cNvPicPr/>
-                  </pic:nvPicPr>
-                  <pic:blipFill>
-                    <a:blip r:embed="rId11">
-                      <a:extLst>
-                        <a:ext uri="{28A0092B-C50C-407E-A947-70E740481C1C}">
-                          <a14:useLocalDpi xmlns:a14="http://schemas.microsoft.com/office/drawing/2010/main" val="0"/>
-                        </a:ext>
-                      </a:extLst>
-                    </a:blip>
-                    <a:stretch>
-                      <a:fillRect/>
-                    </a:stretch>
-                  </pic:blipFill>
-                  <pic:spPr>
-                    <a:xfrm>
-                      <a:off x="0" y="0"/>
-                      <a:ext cx="4396803" cy="4831149"/>
-                    </a:xfrm>
-                    <a:prstGeom prst="rect">
-                      <a:avLst/>
-                    </a:prstGeom>
-                  </pic:spPr>
-                </pic:pic>
-              </a:graphicData>
-            </a:graphic>
-          </wp:inline>
-        </w:drawing>
-      </w:r>
-    </w:p>
-    <w:p>
-      <w:pPr>
-        <w:spacing w:line="360" w:lineRule="auto"/>
-        <w:ind w:firstLine="709"/>
         <w:jc w:val="both"/>
         <w:rPr>
           <w:rFonts w:ascii="Arial" w:hAnsi="Arial" w:cs="Arial"/>
@@ -2412,6 +6293,8 @@
           <w:szCs w:val="18"/>
         </w:rPr>
       </w:pPr>
+      <w:bookmarkStart w:id="0" w:name="_GoBack"/>
+      <w:bookmarkEnd w:id="0"/>
       <w:r>
         <w:rPr>
           <w:rFonts w:ascii="Arial" w:hAnsi="Arial" w:cs="Arial"/>
@@ -2570,7 +6453,7 @@
                     <pic:cNvPicPr/>
                   </pic:nvPicPr>
                   <pic:blipFill>
-                    <a:blip r:embed="rId12">
+                    <a:blip r:embed="rId10">
                       <a:extLst>
                         <a:ext uri="{28A0092B-C50C-407E-A947-70E740481C1C}">
                           <a14:useLocalDpi xmlns:a14="http://schemas.microsoft.com/office/drawing/2010/main" val="0"/>
@@ -3621,7 +7504,7 @@
                     <pic:cNvPicPr/>
                   </pic:nvPicPr>
                   <pic:blipFill>
-                    <a:blip r:embed="rId13">
+                    <a:blip r:embed="rId11">
                       <a:extLst>
                         <a:ext uri="{28A0092B-C50C-407E-A947-70E740481C1C}">
                           <a14:useLocalDpi xmlns:a14="http://schemas.microsoft.com/office/drawing/2010/main" val="0"/>
@@ -3748,7 +7631,7 @@
                     <pic:cNvPicPr/>
                   </pic:nvPicPr>
                   <pic:blipFill>
-                    <a:blip r:embed="rId14">
+                    <a:blip r:embed="rId12">
                       <a:extLst>
                         <a:ext uri="{28A0092B-C50C-407E-A947-70E740481C1C}">
                           <a14:useLocalDpi xmlns:a14="http://schemas.microsoft.com/office/drawing/2010/main" val="0"/>
@@ -3774,8 +7657,6 @@
           </wp:inline>
         </w:drawing>
       </w:r>
-      <w:bookmarkStart w:id="0" w:name="_GoBack"/>
-      <w:bookmarkEnd w:id="0"/>
     </w:p>
     <w:p>
       <w:pPr>
@@ -3807,7 +7688,7 @@
       </w:r>
     </w:p>
     <w:sectPr>
-      <w:headerReference w:type="default" r:id="rId15"/>
+      <w:headerReference w:type="default" r:id="rId13"/>
       <w:pgSz w:w="11906" w:h="16838"/>
       <w:pgMar w:top="1417" w:right="1701" w:bottom="1417" w:left="1701" w:header="708" w:footer="708" w:gutter="0"/>
       <w:cols w:space="708"/>

</xml_diff>